<commit_message>
Move validation logic from standalone tool into endpoint and update debugging docs
- Move LogValidationResults and TryLogSourceOfTruth into CompareDocumentsEndpoint
- Remove standalone Validate console project (Program.cs, Validate.csproj)
- Add Attempt 5 to attempted_methods.md documenting orphaned parts removal and path simplification
- Document key discovery: OpenXML SDK validator shows 0 errors but Word still warns, indicating issue originates in Docxodus
- Update raw_docxodus_output.docx binary
</commit_message>
<xml_diff>
--- a/raw_docxodus_output.docx
+++ b/raw_docxodus_output.docx
@@ -2,29 +2,29 @@
 <file path=word/document.xml><?xml version="1.0" encoding="utf-8"?>
 <w:document xmlns:wpc="http://schemas.microsoft.com/office/word/2010/wordprocessingCanvas" xmlns:cx="http://schemas.microsoft.com/office/drawing/2014/chartex" xmlns:cx1="http://schemas.microsoft.com/office/drawing/2015/9/8/chartex" xmlns:cx2="http://schemas.microsoft.com/office/drawing/2015/10/21/chartex" xmlns:cx3="http://schemas.microsoft.com/office/drawing/2016/5/9/chartex" xmlns:cx4="http://schemas.microsoft.com/office/drawing/2016/5/10/chartex" xmlns:cx5="http://schemas.microsoft.com/office/drawing/2016/5/11/chartex" xmlns:cx6="http://schemas.microsoft.com/office/drawing/2016/5/12/chartex" xmlns:cx7="http://schemas.microsoft.com/office/drawing/2016/5/13/chartex" xmlns:cx8="http://schemas.microsoft.com/office/drawing/2016/5/14/chartex" xmlns:mc="http://schemas.openxmlformats.org/markup-compatibility/2006" xmlns:aink="http://schemas.microsoft.com/office/drawing/2016/ink" xmlns:am3d="http://schemas.microsoft.com/office/drawing/2017/model3d" xmlns:o="urn:schemas-microsoft-com:office:office" xmlns:oel="http://schemas.microsoft.com/office/2019/extlst" xmlns:r="http://schemas.openxmlformats.org/officeDocument/2006/relationships" xmlns:m="http://schemas.openxmlformats.org/officeDocument/2006/math" xmlns:v="urn:schemas-microsoft-com:vml" xmlns:wp14="http://schemas.microsoft.com/office/word/2010/wordprocessingDrawing" xmlns:wp="http://schemas.openxmlformats.org/drawingml/2006/wordprocessingDrawing" xmlns:w10="urn:schemas-microsoft-com:office:word" xmlns:w="http://schemas.openxmlformats.org/wordprocessingml/2006/main" xmlns:w14="http://schemas.microsoft.com/office/word/2010/wordml" xmlns:w15="http://schemas.microsoft.com/office/word/2012/wordml" xmlns:w16cex="http://schemas.microsoft.com/office/word/2018/wordml/cex" xmlns:w16cid="http://schemas.microsoft.com/office/word/2016/wordml/cid" xmlns:w16="http://schemas.microsoft.com/office/word/2018/wordml" xmlns:w16du="http://schemas.microsoft.com/office/word/2023/wordml/word16du" xmlns:w16sdtdh="http://schemas.microsoft.com/office/word/2020/wordml/sdtdatahash" xmlns:w16sdtfl="http://schemas.microsoft.com/office/word/2024/wordml/sdtformatlock" xmlns:w16se="http://schemas.microsoft.com/office/word/2015/wordml/symex" xmlns:wpg="http://schemas.microsoft.com/office/word/2010/wordprocessingGroup" xmlns:wpi="http://schemas.microsoft.com/office/word/2010/wordprocessingInk" xmlns:wne="http://schemas.microsoft.com/office/word/2006/wordml" xmlns:wps="http://schemas.microsoft.com/office/word/2010/wordprocessingShape" xmlns:pt14="http://powertools.codeplex.com/2011" mc:Ignorable="w14 w15 w16se w16cid w16 w16cex w16sdtdh w16sdtfl w16du wp14 pt14">
   <w:body>
-    <w:p pt14:Unid="efc426de4089465ebdc864d9f23dce7b">
-      <w:pPr pt14:Unid="7abc9f7ac6d347e49c32ac47c5c12b31">
-        <w:spacing w:after="120" w:line="288" w:lineRule="auto" pt14:Unid="a494b0f8b50249d1bd274c3955258387"/>
-        <w:jc w:val="both" pt14:Unid="5c869a668de343beb5f858a02c07ada8"/>
+    <w:p pt14:Unid="4f23203111c846cd95a5bf1347bef816">
+      <w:pPr pt14:Unid="6f3af62820fb4534a12265bd2f0bd961">
+        <w:spacing w:after="120" w:line="288" w:lineRule="auto" pt14:Unid="f85dc4d6532a4c939cf0821078624365"/>
+        <w:jc w:val="both" pt14:Unid="ce66d0fbf01546bcbd0e13a62e3b3f6d"/>
       </w:pPr>
       <w:r>
         <w:t>CONTRATO SOCIAL DE [NOME EMPRESARIAL] LTDA.</w:t>
       </w:r>
     </w:p>
-    <w:p pt14:Unid="a1fca5de1ce74245a9aae91fd64e76d7">
-      <w:pPr pt14:Unid="7a5418a9994448b3b80c99aff69f25fe">
-        <w:spacing w:after="120" w:line="288" w:lineRule="auto" pt14:Unid="79c6d335fb034c63983740a25b8c4627"/>
-        <w:jc w:val="both" pt14:Unid="db062a343cf248b19cf8b78160e83f93"/>
+    <w:p pt14:Unid="2560c33d1bbd432c8770bd81b1419948">
+      <w:pPr pt14:Unid="e69b0309b057484ea77bb7e429c16776">
+        <w:spacing w:after="120" w:line="288" w:lineRule="auto" pt14:Unid="c7af55964cf94cac8d4a3dd33c055b83"/>
+        <w:jc w:val="both" pt14:Unid="2834bb4b72ba45b188bc293291de9c2f"/>
       </w:pPr>
       <w:r>
         <w:t xml:space="preserve">[NOTA DO REDATOR: Este template é modular e contém campos [VARIÁVEL] e opções [OPÇÃO A/B/C], além de notas internas. Produza: (i) versão marcada para edição; (ii) versão “clean” para </w:t>
       </w:r>
-      <w:del w:author="Test User" w:id="0" w:date="2026-01-16T02:42:54.8121600-05:00">
+      <w:del w:author="Test User" w:id="0" w:date="2026-01-16T02:48:56.7424540-05:00">
         <w:r>
           <w:delText>assinatura/registro (removendo todas as notas/colchetes). Adeque o texto ao caso concreto</w:delText>
         </w:r>
       </w:del>
-      <w:ins w:author="Test User" w:id="1" w:date="2026-01-16T02:42:54.8121600-05:00">
+      <w:ins w:author="Test User" w:id="1" w:date="2026-01-16T02:48:56.7424540-05:00">
         <w:r>
           <w:t>empresária limitada, que se regerá por este Contrato Social</w:t>
         </w:r>
@@ -32,2794 +32,2794 @@
       <w:r>
         <w:t xml:space="preserve"> e</w:t>
       </w:r>
-      <w:del w:author="Test User" w:id="2" w:date="2026-01-16T02:42:54.8121600-05:00">
+      <w:del w:author="Test User" w:id="2" w:date="2026-01-16T02:48:56.7424540-05:00">
         <w:r>
           <w:delText xml:space="preserve"> às exigências da Junta Comercial competente (IN DREI 81/2020).]</w:delText>
         </w:r>
       </w:del>
-      <w:ins w:author="Test User" w:id="3" w:date="2026-01-16T02:42:54.8121600-05:00">
+      <w:ins w:author="Test User" w:id="3" w:date="2026-01-16T02:48:56.7424540-05:00">
         <w:r>
           <w:t>, nos casos omissos, pela legislação aplicável.</w:t>
         </w:r>
       </w:ins>
     </w:p>
-    <w:p pt14:Unid="5d60d607614a40b9847af0abeccc73df">
-      <w:pPr pt14:Unid="f78a178c4a144370b3dd32be21c02097" pt14:Status="Deleted">
-        <w:spacing w:after="120" w:line="288" w:lineRule="auto" pt14:Unid="73fab6d3b9034cc08c2f498b2aad472a"/>
-        <w:jc w:val="both" pt14:Unid="d163a5bd3e604a449f09492fa76049e5"/>
+    <w:p pt14:Unid="4e1f8cc53eb248d68a8081705f20d8fd">
+      <w:pPr pt14:Unid="8b1804ffc1084c8ebb7161d8a439198d" pt14:Status="Deleted">
+        <w:spacing w:after="120" w:line="288" w:lineRule="auto" pt14:Unid="5f4c8883faf24e3b830b4d2f2ec412f5"/>
+        <w:jc w:val="both" pt14:Unid="8267a46ed4344085acfd5ece6ae95d51"/>
         <w:rPr>
-          <w:del w:author="Test User" w:id="4" w:date="2026-01-16T02:42:54.8121600-05:00"/>
+          <w:del w:author="Test User" w:id="4" w:date="2026-01-16T02:48:56.7424540-05:00"/>
         </w:rPr>
       </w:pPr>
-      <w:del w:author="Test User" w:id="5" w:date="2026-01-16T02:42:54.8121600-05:00">
+      <w:del w:author="Test User" w:id="5" w:date="2026-01-16T02:48:56.7424540-05:00">
         <w:r>
           <w:delText>TÍTULO E QUALIFICAÇÃO</w:delText>
         </w:r>
       </w:del>
     </w:p>
-    <w:p pt14:Unid="69205016a8b441a78207079779d201cf">
-      <w:pPr pt14:Unid="39533fc8ccef466fa3fb8242a5ef5f9d" pt14:Status="Deleted">
-        <w:spacing w:after="120" w:line="288" w:lineRule="auto" pt14:Unid="213842a178d2467ab10d1972bebda973"/>
-        <w:jc w:val="both" pt14:Unid="2b469e029e0945b497cede9dc522b19c"/>
+    <w:p pt14:Unid="b0ebda9047434507b4b1fbf5b6b5a404">
+      <w:pPr pt14:Unid="6e8b7d5512284c9493355d97f8795f9a" pt14:Status="Deleted">
+        <w:spacing w:after="120" w:line="288" w:lineRule="auto" pt14:Unid="9ebaee38e21e42a7a26791b3065471d9"/>
+        <w:jc w:val="both" pt14:Unid="b54699d6b409465bb2d5191733f97f0d"/>
         <w:rPr>
-          <w:del w:author="Test User" w:id="6" w:date="2026-01-16T02:42:54.8121600-05:00"/>
+          <w:del w:author="Test User" w:id="6" w:date="2026-01-16T02:48:56.7424540-05:00"/>
         </w:rPr>
       </w:pPr>
-      <w:del w:author="Test User" w:id="7" w:date="2026-01-16T02:42:54.8121600-05:00">
+      <w:del w:author="Test User" w:id="7" w:date="2026-01-16T02:48:56.7424540-05:00">
         <w:r>
           <w:delText>Pelo presente instrumento particular de Contrato Social, os abaixo qualificados:</w:delText>
         </w:r>
       </w:del>
     </w:p>
-    <w:p pt14:Unid="cee01bf8fbf5478497576c33db5f93e9">
-      <w:pPr pt14:Unid="549941b152d742e1bb7d36b9b1341457" pt14:Status="Deleted">
-        <w:pStyle w:val="ListBullet" pt14:Unid="61f893dc92424911ad52ed42c6edc33b"/>
-        <w:spacing w:after="120" w:line="288" w:lineRule="auto" pt14:Unid="293882718ebb478e9d65fa9e45c73295"/>
-        <w:jc w:val="both" pt14:Unid="9e09f7a52dc14ac8808c99c178eb7b19"/>
+    <w:p pt14:Unid="a9e53e1d4f734f6787b3b14929d3de25">
+      <w:pPr pt14:Unid="139b47a6b5604c7b817d69b86a264670" pt14:Status="Deleted">
+        <w:pStyle w:val="ListBullet" pt14:Unid="5e59f7c71a584f279732738a30b88a99"/>
+        <w:spacing w:after="120" w:line="288" w:lineRule="auto" pt14:Unid="66abbdc56f6f42fdabaa59f7f548a344"/>
+        <w:jc w:val="both" pt14:Unid="b75666a4f59f4c9499c1cc6186f0e7b8"/>
         <w:rPr>
-          <w:del w:author="Test User" w:id="8" w:date="2026-01-16T02:42:54.8121600-05:00"/>
+          <w:del w:author="Test User" w:id="8" w:date="2026-01-16T02:48:56.7424540-05:00"/>
         </w:rPr>
       </w:pPr>
-      <w:del w:author="Test User" w:id="9" w:date="2026-01-16T02:42:54.8121600-05:00">
+      <w:del w:author="Test User" w:id="9" w:date="2026-01-16T02:48:56.7424540-05:00">
         <w:r>
           <w:delText>[SÓCIO 1], [nacionalidade], [estado civil], [profissão], portador(a) do RG nº [VARIÁVEL] e do CPF/MF nº [VARIÁVEL], residente e domiciliado(a) à [endereço completo]; [alternativamente, se pessoa jurídica: [SÓCIO PJ 1], pessoa jurídica de direito privado, inscrita no CNPJ/MF sob o nº [VARIÁVEL], com sede na [endereço completo], neste ato representada nos termos de seus atos constitutivos por [qualificação do representante]];</w:delText>
         </w:r>
       </w:del>
     </w:p>
-    <w:p pt14:Unid="8387e4fdbc064e5e9e15e88ed6d395f4">
-      <w:pPr pt14:Unid="8c32165a9a64448886e9c812dfe9c49e" pt14:Status="Deleted">
-        <w:pStyle w:val="ListBullet" pt14:Unid="90f9910a47de465a953f2b171de34a88"/>
-        <w:spacing w:after="120" w:line="288" w:lineRule="auto" pt14:Unid="9837af8b5f4d407fb3267681e0132267"/>
-        <w:jc w:val="both" pt14:Unid="3d8cc4ba590e47c2be71b7a3af2bf2b0"/>
+    <w:p pt14:Unid="7a7b079c76344ac1ad14ef20ff0c4467">
+      <w:pPr pt14:Unid="7fd86b3d4ca8425996c7814cbd12d8bd" pt14:Status="Deleted">
+        <w:pStyle w:val="ListBullet" pt14:Unid="16604227543341a4a754f941bd694cdb"/>
+        <w:spacing w:after="120" w:line="288" w:lineRule="auto" pt14:Unid="5aa7032242fd4815952ebe0eaf7fd6f7"/>
+        <w:jc w:val="both" pt14:Unid="26e9014305a14aa99333036d398a57dc"/>
         <w:rPr>
-          <w:del w:author="Test User" w:id="10" w:date="2026-01-16T02:42:54.8121600-05:00"/>
+          <w:del w:author="Test User" w:id="10" w:date="2026-01-16T02:48:56.7424540-05:00"/>
         </w:rPr>
       </w:pPr>
-      <w:del w:author="Test User" w:id="11" w:date="2026-01-16T02:42:54.8121600-05:00">
+      <w:del w:author="Test User" w:id="11" w:date="2026-01-16T02:48:56.7424540-05:00">
         <w:r>
           <w:delText>[SÓCIO 2] [replicar a qualificação para cada sócio];</w:delText>
         </w:r>
       </w:del>
     </w:p>
-    <w:p pt14:Unid="a2a07b9bd738452ea395a0eedcaae819">
-      <w:pPr pt14:Unid="f70b5833b772494d8a3aabeec5c42dd6" pt14:Status="Deleted">
-        <w:spacing w:after="120" w:line="288" w:lineRule="auto" pt14:Unid="f2bf96db68434e1ea3bce26e9f763fbb"/>
-        <w:jc w:val="both" pt14:Unid="2886966b6f5b4bab97c3f5667ff0ff15"/>
+    <w:p pt14:Unid="014e3e5b60c645518c77da94a9cd7879">
+      <w:pPr pt14:Unid="4886ca6d5e9d40b9a8e55a50ca63290c" pt14:Status="Deleted">
+        <w:spacing w:after="120" w:line="288" w:lineRule="auto" pt14:Unid="6d4bf75f7cbc4e99a497ae9356487bcb"/>
+        <w:jc w:val="both" pt14:Unid="f7cdfde3d1184acc8cae0eb75f433569"/>
         <w:rPr>
-          <w:del w:author="Test User" w:id="12" w:date="2026-01-16T02:42:54.8121600-05:00"/>
+          <w:del w:author="Test User" w:id="12" w:date="2026-01-16T02:48:56.7424540-05:00"/>
         </w:rPr>
       </w:pPr>
-      <w:del w:author="Test User" w:id="13" w:date="2026-01-16T02:42:54.8121600-05:00">
+      <w:del w:author="Test User" w:id="13" w:date="2026-01-16T02:48:56.7424540-05:00">
         <w:r>
           <w:delText>doravante denominados em conjunto “Sócios” e, individualmente, “Sócio”; têm entre si justo e contratado constituir uma sociedade empresária limitada, que se regerá por este Contrato Social e, nos casos omissos, pela legislação aplicável.</w:delText>
         </w:r>
       </w:del>
     </w:p>
-    <w:p pt14:Unid="a8ef867c23d84cdeae7cd196f171c9f1">
-      <w:pPr pt14:Unid="bcff3d113cd349ab8fe62fae1494e62f">
-        <w:spacing w:after="120" w:line="288" w:lineRule="auto" pt14:Unid="9add944b51954118b495c27685c60916"/>
-        <w:jc w:val="both" pt14:Unid="a3a83ebb25204a51b2da4d77e8ef9281"/>
+    <w:p pt14:Unid="03b3f18d19b342f7b7b736ad0f210a5a">
+      <w:pPr pt14:Unid="40dae36dd6d6499bba16251e56d40455">
+        <w:spacing w:after="120" w:line="288" w:lineRule="auto" pt14:Unid="def7fb82776d4ddda9eb84c28e6525ea"/>
+        <w:jc w:val="both" pt14:Unid="1481869d255e472e8706942b1837c382"/>
       </w:pPr>
       <w:r>
         <w:t>PREÂMBULO E RECITAIS</w:t>
       </w:r>
     </w:p>
-    <w:p pt14:Unid="80fd09e1bbd34c008eaf13532de967c7">
-      <w:pPr pt14:Unid="b7ae6b9ae5a84848b07d129ca3595da1">
-        <w:pStyle w:val="ListBullet" pt14:Unid="3b280c67f4f047f5bcd0bf05ec8e176e"/>
-        <w:spacing w:after="120" w:line="288" w:lineRule="auto" pt14:Unid="4ece4308c2ff40ccab22a96b89c4f5ea"/>
-        <w:jc w:val="both" pt14:Unid="a61191cf5a4a4a6590ab8159795c2b43"/>
+    <w:p pt14:Unid="b83ea2a91cd54ff18a74a0aea941859a">
+      <w:pPr pt14:Unid="ac647dd3054e42a1b91d22b96b6c7f0b">
+        <w:pStyle w:val="ListBullet" pt14:Unid="383bde9725d34bf5b858cc53f1157d37"/>
+        <w:spacing w:after="120" w:line="288" w:lineRule="auto" pt14:Unid="cfe214dee91244e59bd0e1c4a24bf164"/>
+        <w:jc w:val="both" pt14:Unid="e6eda2bcf2fc4c9f84bb1e864e96edcf"/>
       </w:pPr>
       <w:r>
         <w:t>Os Sócios declaram possuir capacidade civil plena, legitimidade e poderes para celebrar este Contrato Social.</w:t>
       </w:r>
     </w:p>
-    <w:p pt14:Unid="99df7035cfb64537af976f724b279517">
-      <w:pPr pt14:Unid="c4ef218202194fe981ee6d7b1aa45664">
-        <w:pStyle w:val="ListBullet" pt14:Unid="16650a82bcaa4a768a53316d83915785"/>
-        <w:spacing w:after="120" w:line="288" w:lineRule="auto" pt14:Unid="5ced2aea5c654b978d51627a2f47f2ef"/>
-        <w:jc w:val="both" pt14:Unid="5a85b9a404e24198b870550ad903019d"/>
+    <w:p pt14:Unid="7f39eeff01494438afd634312906f8bf">
+      <w:pPr pt14:Unid="bf94ca879dbb4a8d964dea295e5f7d38">
+        <w:pStyle w:val="ListBullet" pt14:Unid="1d9121f7b7a348059c551847a854c270"/>
+        <w:spacing w:after="120" w:line="288" w:lineRule="auto" pt14:Unid="e67da7c53a4943f0b95abed722fa2c7e"/>
+        <w:jc w:val="both" pt14:Unid="d233d85ad4394ff8a88f087dd389f16c"/>
       </w:pPr>
       <w:r>
         <w:t>Declaram, ainda, que discutiram e negociaram previamente os termos aqui estabelecidos, com assessoria jurídica e contábil independentes, e que este instrumento reflete sua vontade livre e informada.</w:t>
       </w:r>
     </w:p>
-    <w:p pt14:Unid="13f77a74efc14924acf04845e45393e4">
-      <w:pPr pt14:Unid="8815de8cb58f41219c4d330e927609aa">
-        <w:pStyle w:val="ListBullet" pt14:Unid="b2f45bc1c41d4bff92f004ed8c6c90a8"/>
-        <w:spacing w:after="120" w:line="288" w:lineRule="auto" pt14:Unid="fffc0ca10b264c5aa796e7898a56688e"/>
-        <w:jc w:val="both" pt14:Unid="186b6a120b00477992ec50fead133b79"/>
+    <w:p pt14:Unid="f46e11a2d99149a4bc758649bfe73c7f">
+      <w:pPr pt14:Unid="57c75f4826c04bb5bb9b544bc99e3852">
+        <w:pStyle w:val="ListBullet" pt14:Unid="5cf0e2e3323340bdb159ab2697563ce1"/>
+        <w:spacing w:after="120" w:line="288" w:lineRule="auto" pt14:Unid="82096780196747399d5107861d9c1eb7"/>
+        <w:jc w:val="both" pt14:Unid="1cf3fcd9c1bd42d0a4c358dbe15b1f5c"/>
       </w:pPr>
       <w:r>
         <w:t>A finalidade deste Contrato Social é regular a constituição, organização, governança, direitos e obrigações dos Sócios e administradores da sociedade ora constituída, bem como mecanismos avançados de proteção aos investidores, solução de conflitos e regras de liquidez.</w:t>
       </w:r>
     </w:p>
-    <w:p pt14:Unid="b18a04760948414392e4b5ec7391f9f4">
-      <w:pPr pt14:Unid="784946adf8a14d62ae88f9f6e0189ac6">
-        <w:spacing w:after="120" w:line="288" w:lineRule="auto" pt14:Unid="45064703de04464c8bc26c8f024dc8fb"/>
-        <w:jc w:val="both" pt14:Unid="20b0107c53534b188d197844f9f00747"/>
+    <w:p pt14:Unid="cd5db4ddba264909a5b519d9a3fe7039">
+      <w:pPr pt14:Unid="1c5566d5a1ba45d99c061f92800e641f">
+        <w:spacing w:after="120" w:line="288" w:lineRule="auto" pt14:Unid="9a33cd36f34846ba8e3cfdc08f50fc46"/>
+        <w:jc w:val="both" pt14:Unid="d1654a1d6ec2416bbc6ad39f00ab5e59"/>
       </w:pPr>
       <w:r>
         <w:t>DEFINIÇÕES</w:t>
       </w:r>
     </w:p>
-    <w:p pt14:Unid="8a9c1684b74e41afa5551dcf189f70c2">
-      <w:pPr pt14:Unid="872981bd618544a985c073daf0fe9bad">
-        <w:spacing w:after="120" w:line="288" w:lineRule="auto" pt14:Unid="126dc0d1cac549e68339a24ad3d192bd"/>
-        <w:jc w:val="both" pt14:Unid="02139b4bb4ef4bc6ba3f099f0f3fa3cf"/>
+    <w:p pt14:Unid="a34249b069c54079b654cb85efda00bc">
+      <w:pPr pt14:Unid="aa4432b8b7cf48cfa0a8356375b6decf">
+        <w:spacing w:after="120" w:line="288" w:lineRule="auto" pt14:Unid="996cbb95396c4ad38efed33f318bec34"/>
+        <w:jc w:val="both" pt14:Unid="94f9a94718b14f62a44426df2f30e518"/>
       </w:pPr>
       <w:r>
         <w:t xml:space="preserve">Para os fins deste Contrato Social, os termos abaixo, no singular ou plural, terão os seguintes </w:t>
       </w:r>
-      <w:del w:author="Test User" w:id="14" w:date="2026-01-16T02:42:54.8121600-05:00">
+      <w:del w:author="Test User" w:id="14" w:date="2026-01-16T02:48:56.7424540-05:00">
         <w:r>
           <w:delText>significados:</w:delText>
         </w:r>
       </w:del>
-      <w:ins w:author="Test User" w:id="15" w:date="2026-01-16T02:42:54.8121600-05:00">
+      <w:ins w:author="Test User" w:id="15" w:date="2026-01-16T02:48:56.7424540-05:00">
         <w:r>
           <w:t>significados:</w:t>
         </w:r>
       </w:ins>
-      <w:ins w:author="Test User" w:id="16" w:date="2026-01-16T02:42:54.8121600-05:00">
+      <w:ins w:author="Test User" w:id="16" w:date="2026-01-16T02:48:56.7424540-05:00">
         <w:r>
           <w:t>blalblablalblalbalblablalbalbla</w:t>
         </w:r>
       </w:ins>
     </w:p>
-    <w:p pt14:Unid="5fef6b07669b44cb9a1e70ec16adda60">
-      <w:pPr pt14:Unid="143108e3df9b4c3aba02c22c6805d2c5">
-        <w:pStyle w:val="ListBullet" pt14:Unid="dd3ed282688146bb9ba0f00264a4f327"/>
-        <w:spacing w:after="120" w:line="288" w:lineRule="auto" pt14:Unid="6f2c9bc09aa441b786a3265bfd0d80ee"/>
-        <w:jc w:val="both" pt14:Unid="bf9c06d1202f40cfba1eae752e4d7cab"/>
+    <w:p pt14:Unid="f8aa348883dc4ad9bbf954af519e6902">
+      <w:pPr pt14:Unid="09d82f1055b7484c80e471541983ad80">
+        <w:pStyle w:val="ListBullet" pt14:Unid="cab71e8ebfe346498b90109dca9f693b"/>
+        <w:spacing w:after="120" w:line="288" w:lineRule="auto" pt14:Unid="6e3779d53b57491a9e494572999b0eb9"/>
+        <w:jc w:val="both" pt14:Unid="8b0b21821c224e458ff829f552a505b4"/>
       </w:pPr>
       <w:r>
         <w:t>Administração: o(s) administrador(es) eleito(s) na forma deste Contrato Social.</w:t>
       </w:r>
     </w:p>
-    <w:p pt14:Unid="63dc78cf046e4ebe9342e21639cf4930">
-      <w:pPr pt14:Unid="a057e6e129894bc0bf2e3dc96b9f08da">
-        <w:pStyle w:val="ListBullet" pt14:Unid="bf1250cb68894a7cbb52ec01163c8eaa"/>
-        <w:spacing w:after="120" w:line="288" w:lineRule="auto" pt14:Unid="95d319e9f99b4fab9447b5f197e5666c"/>
-        <w:jc w:val="both" pt14:Unid="ee3e9300be1b4a92b9dc5b163a1dff71"/>
+    <w:p pt14:Unid="2776984f327e41f6bc469d3a01aca555">
+      <w:pPr pt14:Unid="671000f200f44f6abdae991d49a34873">
+        <w:pStyle w:val="ListBullet" pt14:Unid="bfebb27709044ca69dcaae17da2fd1c0"/>
+        <w:spacing w:after="120" w:line="288" w:lineRule="auto" pt14:Unid="6e80b7472bd4492986b4ce97ab6a8ef5"/>
+        <w:jc w:val="both" pt14:Unid="8304aee8739f441ca8bb5484ca32e73c"/>
       </w:pPr>
       <w:r>
         <w:t>Acordo de Quotistas: acordo parassocial, se existente, celebrado nos termos da legislação aplicável.</w:t>
       </w:r>
     </w:p>
-    <w:p pt14:Unid="bfc5c3b5b1384af7a611de81a8836e7b">
-      <w:pPr pt14:Unid="7c806660b0f94c90b42e6f3422d93cc2">
-        <w:pStyle w:val="ListBullet" pt14:Unid="dc65f6b9a2ee4efe9fa09a1fc18224b2"/>
-        <w:spacing w:after="120" w:line="288" w:lineRule="auto" pt14:Unid="fad96bfa93bd42d5800afd29523c19b6"/>
-        <w:jc w:val="both" pt14:Unid="7d4c2854db8e45f1b4dd5e8b292bac09"/>
+    <w:p pt14:Unid="4b67841b62ea4573a2dbfa126735ef7f">
+      <w:pPr pt14:Unid="aa2092f21f924a8195be298726a71025">
+        <w:pStyle w:val="ListBullet" pt14:Unid="26ad793f1eeb4c3fa65a8615c3c1dbaa"/>
+        <w:spacing w:after="120" w:line="288" w:lineRule="auto" pt14:Unid="ccbd7e6e0b6745b6bf93b0db8413907e"/>
+        <w:jc w:val="both" pt14:Unid="04fa291b6b5e4f059a37593ae7a5e881"/>
       </w:pPr>
       <w:r>
         <w:t>Anexo(s): documentos vinculados a este Contrato Social, inclusive Term Sheet (Anexo A), Checklist de Arquivamento e Notas de Redação.</w:t>
       </w:r>
     </w:p>
-    <w:p pt14:Unid="adc8196545934b1d96fcb8bb7af50d16">
-      <w:pPr pt14:Unid="64b7c0df08154071a9b52568f2d418cd">
-        <w:pStyle w:val="ListBullet" pt14:Unid="33df49bb61074fc786cf84b11a4abb41"/>
-        <w:spacing w:after="120" w:line="288" w:lineRule="auto" pt14:Unid="d2bbacdd2c8246db8014523ab9928493"/>
-        <w:jc w:val="both" pt14:Unid="a587495393e0414dbce62178c5e388bb"/>
+    <w:p pt14:Unid="e56895386b3a42acaeec1ab2580b5474">
+      <w:pPr pt14:Unid="d6a5f97caed249729b3ff3fc7aff2522">
+        <w:pStyle w:val="ListBullet" pt14:Unid="f7741aeb01b04bdfb17b568a136fd188"/>
+        <w:spacing w:after="120" w:line="288" w:lineRule="auto" pt14:Unid="9f66f5913b5749419641ab428a167eeb"/>
+        <w:jc w:val="both" pt14:Unid="e8b765b53bd2491f894c0309437c933e"/>
       </w:pPr>
       <w:r>
         <w:t>Antidiluição: mecanismos contratuais de proteção contra diluição, conforme Cláusula 12.</w:t>
       </w:r>
     </w:p>
-    <w:p pt14:Unid="f63964399b4b46389952b12f503abd9e">
-      <w:pPr pt14:Unid="9b91965e5d414d9c962ca52297bbb429">
-        <w:pStyle w:val="ListBullet" pt14:Unid="b0ad76ad6b624ed3a02888fd40f7764e"/>
-        <w:spacing w:after="120" w:line="288" w:lineRule="auto" pt14:Unid="e2f2bfdb92f347858476c2f8849f86af"/>
-        <w:jc w:val="both" pt14:Unid="aab3ec07299541f4b5ffee58d8211890"/>
+    <w:p pt14:Unid="95ae846aea524240a2f472ccd8e63a3f">
+      <w:pPr pt14:Unid="82378ad736bf42ec9c7e83b96ba1c790">
+        <w:pStyle w:val="ListBullet" pt14:Unid="e6ba294bc7f54700a9bba9bd0e1dd0ad"/>
+        <w:spacing w:after="120" w:line="288" w:lineRule="auto" pt14:Unid="5674dd4df41d428d90c4a473470ecd56"/>
+        <w:jc w:val="both" pt14:Unid="ef82952c2cf34817bdfccc433cff4591"/>
       </w:pPr>
       <w:r>
         <w:t>Arbitragem: procedimento de resolução de disputas previsto na Cláusula 20.</w:t>
       </w:r>
     </w:p>
-    <w:p pt14:Unid="69536885668742a2a54244790781c0cc">
-      <w:pPr pt14:Unid="6887d48b65684b0b9353385ba2025bd5">
-        <w:pStyle w:val="ListBullet" pt14:Unid="d791cbe0929f46a898e7a0155092eaf0"/>
-        <w:spacing w:after="120" w:line="288" w:lineRule="auto" pt14:Unid="2fd88c52cb4c406d9cc91366a581d29c"/>
-        <w:jc w:val="both" pt14:Unid="3249502ab23d447abedee87c267b4855"/>
+    <w:p pt14:Unid="920f0b4456cb4a17ba6ba07617cfc6ae">
+      <w:pPr pt14:Unid="31d74569e8314e7db344e4a49d2ec8b4">
+        <w:pStyle w:val="ListBullet" pt14:Unid="27fd94ea7925438ba73ea6db6ed7c08f"/>
+        <w:spacing w:after="120" w:line="288" w:lineRule="auto" pt14:Unid="ac4bfd88a4f340e29356c8be71950ae5"/>
+        <w:jc w:val="both" pt14:Unid="abe866d3447e4e86a2127fb0f0a0bfe3"/>
       </w:pPr>
       <w:r>
         <w:t>Capital Social: valor subscrito e integralizado nos termos da Cláusula 6.</w:t>
       </w:r>
     </w:p>
-    <w:p pt14:Unid="77f1d546e45e47c8b20425f91e37f001">
-      <w:pPr pt14:Unid="6f7f961775f1436bb8746a686cb8efe2">
-        <w:pStyle w:val="ListBullet" pt14:Unid="00e512b5c79b4b6bbaae23a52cf1e08a"/>
-        <w:spacing w:after="120" w:line="288" w:lineRule="auto" pt14:Unid="5c3080d73a674717990a91fa131b4587"/>
-        <w:jc w:val="both" pt14:Unid="cd4390e889ca4d3e9d972b181dfcac90"/>
+    <w:p pt14:Unid="b0b013dc79ee4d4881bff498b615fc39">
+      <w:pPr pt14:Unid="c28429c65afe443d89d373d1319c6f44">
+        <w:pStyle w:val="ListBullet" pt14:Unid="d019a4b909074d81bdb3bddf9e1d4330"/>
+        <w:spacing w:after="120" w:line="288" w:lineRule="auto" pt14:Unid="b9667af254de4da58e2db56639c3c91b"/>
+        <w:jc w:val="both" pt14:Unid="313ce7e124d24f8aa7ce677b8e6d8dec"/>
       </w:pPr>
       <w:r>
         <w:t>Cessão de Quotas: transferência de quotas a sócios ou terceiros, conforme Cláusula 8.</w:t>
       </w:r>
     </w:p>
-    <w:p pt14:Unid="40090eeecf1844698593052c29a759e3">
-      <w:pPr pt14:Unid="09533b495ffe4a11ba707076f867fc96">
-        <w:pStyle w:val="ListBullet" pt14:Unid="e80dc45f4c124718a97a8f7613464841"/>
-        <w:spacing w:after="120" w:line="288" w:lineRule="auto" pt14:Unid="96e11131fa3a464d99c63c6217e6a5fd"/>
-        <w:jc w:val="both" pt14:Unid="5af6a90705834e6195fddea71e0afde1"/>
+    <w:p pt14:Unid="3d1bfcb70af94e81964747c627e7bfce">
+      <w:pPr pt14:Unid="67b64bedb07c4aa6ad5ab047469d145b">
+        <w:pStyle w:val="ListBullet" pt14:Unid="0f3c06fd680e4398a4f2ca991795fede"/>
+        <w:spacing w:after="120" w:line="288" w:lineRule="auto" pt14:Unid="fa09e7d536a046db89006162243c6e5b"/>
+        <w:jc w:val="both" pt14:Unid="5fcb75f8e61441058ec78c93668d2af9"/>
       </w:pPr>
       <w:r>
         <w:t>Drag-Along: direito de arraste previsto na Cláusula 9.4.</w:t>
       </w:r>
     </w:p>
-    <w:p pt14:Unid="5f5704e603804a7cbc32f921e55a7ed8">
-      <w:pPr pt14:Unid="12b84eb4a3c3410a93967d0cfee01f7d">
-        <w:pStyle w:val="ListBullet" pt14:Unid="0f20c3dcb01b4f309f5c567d0cf6595b"/>
-        <w:spacing w:after="120" w:line="288" w:lineRule="auto" pt14:Unid="baab2db0f06b4bbd98c1c94112865940"/>
-        <w:jc w:val="both" pt14:Unid="0a20aca3ea4741aaa88dc7fb2048532e"/>
+    <w:p pt14:Unid="8fdc7880f781452ba729c198e5d4a643">
+      <w:pPr pt14:Unid="261aac6015e74e10b0f231880fb88f9a">
+        <w:pStyle w:val="ListBullet" pt14:Unid="687af1b2dd4f4714b154a496d5f45520"/>
+        <w:spacing w:after="120" w:line="288" w:lineRule="auto" pt14:Unid="7da8fee22f5d4f619a278a5db4fb0bc9"/>
+        <w:jc w:val="both" pt14:Unid="bc29f384162d4732b83392820625d25c"/>
       </w:pPr>
       <w:r>
         <w:t>Empresa/Sociedade: [NOME EMPRESARIAL] LTDA., ora constituída.</w:t>
       </w:r>
     </w:p>
-    <w:p pt14:Unid="fbe4384b8d1246b3a2a322b225418ebf">
-      <w:pPr pt14:Unid="7c4e714b8d664bd3ba0f0f5dc1adb0d7">
-        <w:pStyle w:val="ListBullet" pt14:Unid="20183588d127494fae78260915b6c052"/>
-        <w:spacing w:after="120" w:line="288" w:lineRule="auto" pt14:Unid="2bcdbe07108e4674977e0eced0ba1ce0"/>
-        <w:jc w:val="both" pt14:Unid="c01090a82352437f8456b9861a5c3f6a"/>
+    <w:p pt14:Unid="e51aceab7a4544408a1a18835f8bc6dc">
+      <w:pPr pt14:Unid="76eb7566b1d548dfbf13ee8081eac6ff">
+        <w:pStyle w:val="ListBullet" pt14:Unid="510ac48b6b944369b13e2b5ef5fc0c21"/>
+        <w:spacing w:after="120" w:line="288" w:lineRule="auto" pt14:Unid="ee2e8763702340c59df217c14f19355c"/>
+        <w:jc w:val="both" pt14:Unid="918829428fb94d30b335a970fc6fbb3a"/>
       </w:pPr>
       <w:r>
         <w:t>Investidor(s): Sócio(s) que aportem capital e detenham direitos de proteção específicos nos termos deste Contrato Social e/ou de acordo parassocial.</w:t>
       </w:r>
     </w:p>
-    <w:p pt14:Unid="1796d66fabdd4962a07c9b12c52609c4">
-      <w:pPr pt14:Unid="81ed677de49042bcb91781fb5c3761bc">
-        <w:pStyle w:val="ListBullet" pt14:Unid="9ed124bd3c94403d9d84e5cc6d54976f"/>
-        <w:spacing w:after="120" w:line="288" w:lineRule="auto" pt14:Unid="fdf356f21f62434ba1afb54ed1f9ee62"/>
-        <w:jc w:val="both" pt14:Unid="b9e3ecb661f545fcbc7f9c591596ea5f"/>
+    <w:p pt14:Unid="e5f6a5d8143f47c7b98fb36cf537fe72">
+      <w:pPr pt14:Unid="fa824510e9e44367b4083bad43c9aa20">
+        <w:pStyle w:val="ListBullet" pt14:Unid="76d0c82569b142c7837688822e3e5dd2"/>
+        <w:spacing w:after="120" w:line="288" w:lineRule="auto" pt14:Unid="59a4fd3bcad648da82c2bda80197357d"/>
+        <w:jc w:val="both" pt14:Unid="8b409e3da6554785a741e8fbb167e34f"/>
       </w:pPr>
       <w:r>
         <w:t>Lock-up: restrição temporária à alienação de quotas, conforme Cláusula 7.5.</w:t>
       </w:r>
     </w:p>
-    <w:p pt14:Unid="3a3fd3cec8cb4131aa22313833dae3fe">
-      <w:pPr pt14:Unid="7f920715bf8f48aaaa5ae5d6d2b6afbc">
-        <w:pStyle w:val="ListBullet" pt14:Unid="acf3ca2db9334fe9b0c9d6b882def800"/>
-        <w:spacing w:after="120" w:line="288" w:lineRule="auto" pt14:Unid="957a54e8b92b476b92e9297c44a83580"/>
-        <w:jc w:val="both" pt14:Unid="adbd11a67a3345efb82e3d015c918315"/>
+    <w:p pt14:Unid="26050f66ca9c4ee49a8530370948bd3e">
+      <w:pPr pt14:Unid="bd1e5e21581e4394b107ba3a6e19c1b6">
+        <w:pStyle w:val="ListBullet" pt14:Unid="ef591f5b820443438de81a35a7ab69c8"/>
+        <w:spacing w:after="120" w:line="288" w:lineRule="auto" pt14:Unid="e3c789675ef7475f8679d858fadbe9b3"/>
+        <w:jc w:val="both" pt14:Unid="d85a2f6f067f4446ac3a14e000a0c1b7"/>
       </w:pPr>
       <w:r>
         <w:t>Matérias Reservadas: deliberações sujeitas a quóruns e vetos reforçados, conforme Cláusula 11.</w:t>
       </w:r>
     </w:p>
-    <w:p pt14:Unid="4ecd57322cad425e96c7a23133aabc59">
-      <w:pPr pt14:Unid="2b3c113caeac4002b80086f1ba1d5abe">
-        <w:pStyle w:val="ListBullet" pt14:Unid="57294bdeabef41b28b1459234c081df6"/>
-        <w:spacing w:after="120" w:line="288" w:lineRule="auto" pt14:Unid="361b0eadb10c4e8eb8effea80334d5c3"/>
-        <w:jc w:val="both" pt14:Unid="93ac9e95839b4f03a84c8dd2b419583a"/>
+    <w:p pt14:Unid="70d784d97eb54ea1b8c3486fcb34de06">
+      <w:pPr pt14:Unid="e767141af86347508bc02d4db216fa3c">
+        <w:pStyle w:val="ListBullet" pt14:Unid="4840134c83ea49eba7461589bd6a3f21"/>
+        <w:spacing w:after="120" w:line="288" w:lineRule="auto" pt14:Unid="a0c755fb16b646a6bbd96f2695e19f6c"/>
+        <w:jc w:val="both" pt14:Unid="fe9035aa168f4509bfa7647933bfc07e"/>
       </w:pPr>
       <w:r>
         <w:t>ROFO/ROFR: right of first offer/right of first refusal, conforme Cláusula 9.1/9.2.</w:t>
       </w:r>
     </w:p>
-    <w:p pt14:Unid="c531debabfa14cc6878a1ef6d116f631">
-      <w:pPr pt14:Unid="bf724a1d7a554cba9bbe6094d10353c4">
-        <w:pStyle w:val="ListBullet" pt14:Unid="90f556207d6a4b79a294d8fdc2b0dc93"/>
-        <w:spacing w:after="120" w:line="288" w:lineRule="auto" pt14:Unid="8bd35e85563e41e8b15b76a4a630d7d0"/>
-        <w:jc w:val="both" pt14:Unid="01932e4aa57b468e83c81099ba61b84c"/>
+    <w:p pt14:Unid="e6766b16e7604feda1bba4bbfdb1b3be">
+      <w:pPr pt14:Unid="38424234c7ba43568a721ecef386a642">
+        <w:pStyle w:val="ListBullet" pt14:Unid="4f3075b6504d4a46b97b194b0c9ee1fb"/>
+        <w:spacing w:after="120" w:line="288" w:lineRule="auto" pt14:Unid="9410f500c36a4c83adf7222eb4e4361d"/>
+        <w:jc w:val="both" pt14:Unid="d6bb9c26dea2409ebab8ff8e602ab897"/>
       </w:pPr>
       <w:r>
         <w:t>Tag-Along: direito de venda conjunta previsto na Cláusula 9.3.</w:t>
       </w:r>
     </w:p>
-    <w:p pt14:Unid="c469fce595224931869d4d67da75ee37">
-      <w:pPr pt14:Unid="66060cb6d8834f30934cfe02925e398c">
-        <w:pStyle w:val="ListBullet" pt14:Unid="8ea45f1cd57a4e01b15a649fca02ba85"/>
-        <w:spacing w:after="120" w:line="288" w:lineRule="auto" pt14:Unid="b50b3ea3d9be4077ae7530499fc3e089"/>
-        <w:jc w:val="both" pt14:Unid="6e54421d204145808d0e8282d4061aff"/>
+    <w:p pt14:Unid="bb1bbce6ae38461aa998f35f610ea31d">
+      <w:pPr pt14:Unid="1a177e88be8c4f13b1b2401f3b1ea12b">
+        <w:pStyle w:val="ListBullet" pt14:Unid="f6a6688161a645e6881a35c49c9f1218"/>
+        <w:spacing w:after="120" w:line="288" w:lineRule="auto" pt14:Unid="176d72faf0e0427abe88a417161ea039"/>
+        <w:jc w:val="both" pt14:Unid="774ffe027fdc4438915cf004a5b56241"/>
       </w:pPr>
       <w:r>
         <w:t>Vesting: aquisição gradual de quotas ou direitos econômicos, conforme Cláusula 7.6.</w:t>
       </w:r>
     </w:p>
-    <w:p pt14:Unid="8318fbe22cba492cbbdc3ccfda5fe8bf">
-      <w:pPr pt14:Unid="11ca457dcbe54c949be73a35eeed1cf8">
-        <w:spacing w:after="120" w:line="288" w:lineRule="auto" pt14:Unid="379a6fd8d3474fd8b525d85ad43471f6"/>
-        <w:jc w:val="both" pt14:Unid="70dece715975496d8179964b0aa67286"/>
+    <w:p pt14:Unid="121070d61a1f41d29eba3ea918d50877">
+      <w:pPr pt14:Unid="9a72abde1a2a4f3b855660b3dd3c1359">
+        <w:spacing w:after="120" w:line="288" w:lineRule="auto" pt14:Unid="718a47109a2d42fe87c194abbb3c33dc"/>
+        <w:jc w:val="both" pt14:Unid="e1f246f49dd645caa3c948f0f70f2624"/>
       </w:pPr>
       <w:r>
         <w:t>OBJETO</w:t>
       </w:r>
     </w:p>
-    <w:p pt14:Unid="46b8020bbf2c42dd9569b5061d0beedf">
-      <w:pPr pt14:Unid="15c1995f51c14c77b04dbbe4fd68ffac">
-        <w:spacing w:after="120" w:line="288" w:lineRule="auto" pt14:Unid="0a91a9695efa464a8b6931b17a248de9"/>
-        <w:jc w:val="both" pt14:Unid="1f1ea2cd26ee40c39c5bd9daa1522bcd"/>
+    <w:p pt14:Unid="89f75bf379644d6c8b7d852a2545e186">
+      <w:pPr pt14:Unid="c3771b204f3a4bfdadbfee69753310f6">
+        <w:spacing w:after="120" w:line="288" w:lineRule="auto" pt14:Unid="5814fc6de3e9421ab0720572952578f7"/>
+        <w:jc w:val="both" pt14:Unid="4eda75f939be4b998229694c3c0e875c"/>
       </w:pPr>
       <w:r>
         <w:t>4.1 A Sociedade tem por objeto social: [descrever de forma clara e lícita as atividades], podendo adotar referências de CNAE pertinentes, notadamente [CNAE principal] e [CNAEs secundários], observadas as restrições legais e regulatórias.</w:t>
       </w:r>
     </w:p>
-    <w:p pt14:Unid="57a860cc79d64ded9d65c5fd4045cb41">
-      <w:pPr pt14:Unid="47bc4bc7e1ea4a1183cfcceef8575799">
-        <w:spacing w:after="120" w:line="288" w:lineRule="auto" pt14:Unid="e0ded0a5c7ce4dc8afdd3ab6b6814660"/>
-        <w:jc w:val="both" pt14:Unid="e950ccfefb0b4e41b616ca4b6687af94"/>
+    <w:p pt14:Unid="d5c0d68d8c0c4eb4a745495c17d1a3b7">
+      <w:pPr pt14:Unid="471d41851f40446db195738e0e6ab230">
+        <w:spacing w:after="120" w:line="288" w:lineRule="auto" pt14:Unid="68efa14bb78a424fa15464cf75b472a8"/>
+        <w:jc w:val="both" pt14:Unid="d1f57bbc497d4fa18c97154bb67b983f"/>
       </w:pPr>
       <w:r>
         <w:t>4.2 A Sociedade poderá realizar quaisquer atos correlatos, acessórios ou necessários ao cumprimento de seu objeto, inclusive participação em outras sociedades, desde que deliberado nos termos deste Contrato Social e da lei.</w:t>
       </w:r>
     </w:p>
-    <w:p pt14:Unid="708c25b5cdc643af83a419cec245eefe">
-      <w:pPr pt14:Unid="e4f33eb8c6b5452f9999f5f9ee43f812">
-        <w:spacing w:after="120" w:line="288" w:lineRule="auto" pt14:Unid="f20c0047f1c74b4b9dd5373f0a1b70d7"/>
-        <w:jc w:val="both" pt14:Unid="f942d6a44b794df39a708a7c6224ef2b"/>
+    <w:p pt14:Unid="d7890330240244cab315e2be02af2b08">
+      <w:pPr pt14:Unid="27451b4e624e4130a22ba9e2db915eee">
+        <w:spacing w:after="120" w:line="288" w:lineRule="auto" pt14:Unid="2bb652f5219340478630950cae640aa3"/>
+        <w:jc w:val="both" pt14:Unid="fa26699ec6e34ac5b0feae83de377497"/>
       </w:pPr>
       <w:r>
         <w:t>NOME EMPRESARIAL, SEDE</w:t>
       </w:r>
-      <w:moveFromRangeStart w:id="18" w:name="move1" w:author="Test User" w:date="2026-01-16T02:42:54.8121600-05:00"/>
-      <w:moveFrom w:author="Test User" w:id="19" w:date="2026-01-16T02:42:54.8121600-05:00">
+      <w:moveFromRangeStart w:id="18" w:name="move1" w:author="Test User" w:date="2026-01-16T02:48:56.7424540-05:00"/>
+      <w:moveFrom w:author="Test User" w:id="19" w:date="2026-01-16T02:48:56.7424540-05:00">
         <w:r>
           <w:delText pt14:Status="MovedSource" pt14:MoveGroupId="1" pt14:MoveName="move1">, PRAZO E EXERCÍCIO SOCIAL</w:delText>
         </w:r>
       </w:moveFrom>
       <w:moveFromRangeEnd w:id="18"/>
     </w:p>
-    <w:p pt14:Unid="ac89f7116e214495a6ebf9f842827d7f">
-      <w:pPr pt14:Unid="2d8a6323b1114b048bce6d3f7dff658b" pt14:Status="MovedSource" pt14:MoveGroupId="2" pt14:MoveName="move2">
-        <w:spacing w:after="120" w:line="288" w:lineRule="auto" pt14:Unid="2014b41000494c3f808b2d8322a6bb01"/>
-        <w:jc w:val="both" pt14:Unid="d31969235727493b98ff66b4a69f3dad"/>
+    <w:p pt14:Unid="0b5c69ad902c48b686a4a43020f645bb">
+      <w:pPr pt14:Unid="4b87eceeaa2e4eba806e4c2b362c05ef" pt14:Status="MovedSource" pt14:MoveGroupId="2" pt14:MoveName="move2">
+        <w:spacing w:after="120" w:line="288" w:lineRule="auto" pt14:Unid="72c31fe2a0f34c27806a99058b7794e5"/>
+        <w:jc w:val="both" pt14:Unid="97f8efb0ad1346f88d1e67dfb9c12d2b"/>
         <w:rPr>
-          <w:del w:author="Test User" w:id="17" w:date="2026-01-16T02:42:54.8121600-05:00"/>
+          <w:del w:author="Test User" w:id="17" w:date="2026-01-16T02:48:56.7424540-05:00"/>
         </w:rPr>
       </w:pPr>
-      <w:moveFromRangeStart w:id="20" w:name="move2" w:author="Test User" w:date="2026-01-16T02:42:54.8121600-05:00"/>
-      <w:moveFrom w:author="Test User" w:id="21" w:date="2026-01-16T02:42:54.8121600-05:00">
+      <w:moveFromRangeStart w:id="20" w:name="move2" w:author="Test User" w:date="2026-01-16T02:48:56.7424540-05:00"/>
+      <w:moveFrom w:author="Test User" w:id="21" w:date="2026-01-16T02:48:56.7424540-05:00">
         <w:r>
           <w:delText pt14:Status="MovedSource" pt14:MoveGroupId="2" pt14:MoveName="move2">5.1 Nome empresarial: [NOME EMPRESARIAL] LTDA. (sempre com o sufixo “Ltda.”).</w:delText>
         </w:r>
       </w:moveFrom>
       <w:moveFromRangeEnd w:id="20"/>
     </w:p>
-    <w:p pt14:Unid="42af7e46297b4daf97c56af9ef7db7f9">
-      <w:pPr pt14:Unid="1398e82f088749c69d76d969e345370d" pt14:Status="MovedSource" pt14:MoveGroupId="2" pt14:MoveName="move2">
-        <w:spacing w:after="120" w:line="288" w:lineRule="auto" pt14:Unid="d5793e9c2cbb49139ac99393a9c1e5f3"/>
-        <w:jc w:val="both" pt14:Unid="e6c3c701fc9b47f78b5d383024cc402f"/>
+    <w:p pt14:Unid="bdb3c3dcb6994a468d74852d3d359fe3">
+      <w:pPr pt14:Unid="fef08a445828438d92936b1fc79754f9" pt14:Status="MovedSource" pt14:MoveGroupId="2" pt14:MoveName="move2">
+        <w:spacing w:after="120" w:line="288" w:lineRule="auto" pt14:Unid="c44b272ae135479badbf2738a8f088eb"/>
+        <w:jc w:val="both" pt14:Unid="fb30f96a62c04dcc9d6dd91477a09d7f"/>
         <w:rPr>
-          <w:del w:author="Test User" w:id="18" w:date="2026-01-16T02:42:54.8121600-05:00"/>
+          <w:del w:author="Test User" w:id="18" w:date="2026-01-16T02:48:56.7424540-05:00"/>
         </w:rPr>
       </w:pPr>
-      <w:moveFromRangeStart w:id="23" w:name="move2" w:author="Test User" w:date="2026-01-16T02:42:54.8121600-05:00"/>
-      <w:moveFrom w:author="Test User" w:id="24" w:date="2026-01-16T02:42:54.8121600-05:00">
+      <w:moveFromRangeStart w:id="23" w:name="move2" w:author="Test User" w:date="2026-01-16T02:48:56.7424540-05:00"/>
+      <w:moveFrom w:author="Test User" w:id="24" w:date="2026-01-16T02:48:56.7424540-05:00">
         <w:r>
           <w:delText pt14:Status="MovedSource" pt14:MoveGroupId="2" pt14:MoveName="move2">5.2 Sede: [endereço completo: logradouro, nº, complemento, bairro, município, UF, CEP]. [OPÇÃO: Estabelecer filiais/escritórios mediante deliberação da Administração ou dos Sócios, conforme Cláusula 11.]</w:delText>
         </w:r>
       </w:moveFrom>
       <w:moveFromRangeEnd w:id="23"/>
     </w:p>
-    <w:p pt14:Unid="170a826ff7d640bdb7d340b0850e49fa">
-      <w:pPr pt14:Unid="362bc5f171e249228305685beb95f7ea" pt14:Status="MovedSource" pt14:MoveGroupId="2" pt14:MoveName="move2">
-        <w:spacing w:after="120" w:line="288" w:lineRule="auto" pt14:Unid="2b6520ea0d1048bd890c908c6770b5f9"/>
-        <w:jc w:val="both" pt14:Unid="ea5021962c154a248de4459900398075"/>
+    <w:p pt14:Unid="c4894bba0e3145f2a6152ca36d2274bd">
+      <w:pPr pt14:Unid="c9c5eb20b30c46db9742fad01c87ce67" pt14:Status="MovedSource" pt14:MoveGroupId="2" pt14:MoveName="move2">
+        <w:spacing w:after="120" w:line="288" w:lineRule="auto" pt14:Unid="9143b99f07be4654bedf9e8b816e0374"/>
+        <w:jc w:val="both" pt14:Unid="a6cdc057a0ce406b91abd6c4c7c186ed"/>
         <w:rPr>
-          <w:del w:author="Test User" w:id="19" w:date="2026-01-16T02:42:54.8121600-05:00"/>
+          <w:del w:author="Test User" w:id="19" w:date="2026-01-16T02:48:56.7424540-05:00"/>
         </w:rPr>
       </w:pPr>
-      <w:moveFromRangeStart w:id="26" w:name="move2" w:author="Test User" w:date="2026-01-16T02:42:54.8121600-05:00"/>
-      <w:moveFrom w:author="Test User" w:id="27" w:date="2026-01-16T02:42:54.8121600-05:00">
+      <w:moveFromRangeStart w:id="26" w:name="move2" w:author="Test User" w:date="2026-01-16T02:48:56.7424540-05:00"/>
+      <w:moveFrom w:author="Test User" w:id="27" w:date="2026-01-16T02:48:56.7424540-05:00">
         <w:r>
           <w:delText pt14:Status="MovedSource" pt14:MoveGroupId="2" pt14:MoveName="move2">5.3 Prazo de duração: por prazo [determinado: até [DATA]; ou indeterminado].</w:delText>
         </w:r>
       </w:moveFrom>
       <w:moveFromRangeEnd w:id="26"/>
     </w:p>
-    <w:p pt14:Unid="2268c70846d24e6392c433c3db7d4a5a">
-      <w:pPr pt14:Unid="5baeca4fee7e4b23bda52bd8c43baac8" pt14:Status="MovedSource" pt14:MoveGroupId="2" pt14:MoveName="move2">
-        <w:spacing w:after="120" w:line="288" w:lineRule="auto" pt14:Unid="4eb1586509ab4882b8aae5874f5babc7"/>
-        <w:jc w:val="both" pt14:Unid="a3773a547be84b259ef5bc521ecb0ed1"/>
+    <w:p pt14:Unid="308d57718d704b13bc779ee94b3af6f6">
+      <w:pPr pt14:Unid="923134067b8349a2bf20f553965f1ab8" pt14:Status="MovedSource" pt14:MoveGroupId="2" pt14:MoveName="move2">
+        <w:spacing w:after="120" w:line="288" w:lineRule="auto" pt14:Unid="974b3d12eadc464daa635aff5e53092c"/>
+        <w:jc w:val="both" pt14:Unid="e190f962333d4ff59222ad32a4391ec3"/>
         <w:rPr>
-          <w:del w:author="Test User" w:id="20" w:date="2026-01-16T02:42:54.8121600-05:00"/>
+          <w:del w:author="Test User" w:id="20" w:date="2026-01-16T02:48:56.7424540-05:00"/>
         </w:rPr>
       </w:pPr>
-      <w:moveFromRangeStart w:id="29" w:name="move2" w:author="Test User" w:date="2026-01-16T02:42:54.8121600-05:00"/>
-      <w:moveFrom w:author="Test User" w:id="30" w:date="2026-01-16T02:42:54.8121600-05:00">
+      <w:moveFromRangeStart w:id="29" w:name="move2" w:author="Test User" w:date="2026-01-16T02:48:56.7424540-05:00"/>
+      <w:moveFrom w:author="Test User" w:id="30" w:date="2026-01-16T02:48:56.7424540-05:00">
         <w:r>
           <w:delText pt14:Status="MovedSource" pt14:MoveGroupId="2" pt14:MoveName="move2">5.4 O exercício social encerra-se em [DATA], quando serão levantadas as demonstrações contábeis, sem prejuízo de balancetes intermediários para fins de deliberação sobre distribuição de resultados.</w:delText>
         </w:r>
       </w:moveFrom>
       <w:moveFromRangeEnd w:id="29"/>
     </w:p>
-    <w:p pt14:Unid="767cb9b39d804a6ebd0a8fe2dd6a2c8b">
-      <w:pPr pt14:Unid="1ba0807b25a14b5e928b0ab9dda42595">
-        <w:spacing w:after="120" w:line="288" w:lineRule="auto" pt14:Unid="1e153ed06de74b77a0342be6bf230d90"/>
-        <w:jc w:val="both" pt14:Unid="cd8e103405804927b2029de8474a73fe"/>
+    <w:p pt14:Unid="8f49ea09001c4c8e80ecf0f8e1e07a63">
+      <w:pPr pt14:Unid="f19c882c5c1d42d99e375668412ae34e">
+        <w:spacing w:after="120" w:line="288" w:lineRule="auto" pt14:Unid="d7d2e6fdd0934eeebceb34299523f998"/>
+        <w:jc w:val="both" pt14:Unid="8efe2b7f89b547c4b812439f26f9156d"/>
       </w:pPr>
       <w:r>
         <w:t>CAPITAL SOCIAL, QUOTAS, SUBSCRIÇÃO E INTEGRALIZAÇÃO</w:t>
       </w:r>
     </w:p>
-    <w:p pt14:Unid="28c3ba1fcca748c0b2fe8a6e521438dd">
-      <w:pPr pt14:Unid="c7ccbb71da48472682601f5d4e3aff35">
-        <w:spacing w:after="120" w:line="288" w:lineRule="auto" pt14:Unid="10b6dfb8ffc64a7fa8e9452f5cb4d68b"/>
-        <w:jc w:val="both" pt14:Unid="5775347b82c544f2b624a39c76057128"/>
+    <w:p pt14:Unid="9d7e9b62ad014a44b32a924e3bc6f3e2">
+      <w:pPr pt14:Unid="c34d97da70314adabb6354598bf51c0a">
+        <w:spacing w:after="120" w:line="288" w:lineRule="auto" pt14:Unid="86a0cbba86e94704b31f6b66dfa4dc54"/>
+        <w:jc w:val="both" pt14:Unid="c9d263bcad6e4ddab42bd8ac61709dbb"/>
       </w:pPr>
       <w:r>
         <w:t>6.1 O Capital Social é de R$ [VALOR], dividido em [NÚMERO] quotas com valor nominal de R$ [VALOR], subscritas e integralizadas pelos Sócios nas seguintes proporções:</w:t>
       </w:r>
     </w:p>
-    <w:p pt14:Unid="4c0c90c709054c4ca41879ff806c1bb2">
-      <w:pPr pt14:Unid="87bfa8af91544e0eb3647d8c5f46b4e3">
-        <w:pStyle w:val="ListBullet" pt14:Unid="c1dcfed9be4a4a48a0c1ca706ea10b15"/>
-        <w:spacing w:after="120" w:line="288" w:lineRule="auto" pt14:Unid="48e93edea849428895f5754d48a6f4dd"/>
-        <w:jc w:val="both" pt14:Unid="e410f282ad6a44528b10a1eba8444685"/>
+    <w:p pt14:Unid="f8dd5a5348a1448e934ce2b46ecba824">
+      <w:pPr pt14:Unid="553b56f7ef71427187f5888cee713fe3">
+        <w:pStyle w:val="ListBullet" pt14:Unid="02aa607fc28a4e5492ab2881d1f593af"/>
+        <w:spacing w:after="120" w:line="288" w:lineRule="auto" pt14:Unid="e732894a02e44a9182e1754ab9c881ab"/>
+        <w:jc w:val="both" pt14:Unid="f064d10777b44ef9b576a3d036191386"/>
       </w:pPr>
       <w:r>
         <w:t>[SÓCIO 1]: [NÚMERO] quotas, total R$ [VALOR], equivalente a [PERCENTUAL]% do capital.</w:t>
       </w:r>
     </w:p>
-    <w:p pt14:Unid="11b271eebb324fc08446d15be732e665">
-      <w:pPr pt14:Unid="78bd29134b63497db459993bc3159b20">
-        <w:pStyle w:val="ListBullet" pt14:Unid="cad7a0294b0f4f6b9060975cf284f150"/>
-        <w:spacing w:after="120" w:line="288" w:lineRule="auto" pt14:Unid="d880c0c12d4a40afbc3a005bec1dd8d2"/>
-        <w:jc w:val="both" pt14:Unid="382f360fc9e04e48b6ca428dd535b21d"/>
+    <w:p pt14:Unid="4982ab52ccf8424cbc731cd87f55488a">
+      <w:pPr pt14:Unid="07ea5a216a3a4e139ac1cc82bbe679e2">
+        <w:pStyle w:val="ListBullet" pt14:Unid="2709f16dbd414d9f959860e96f2dba07"/>
+        <w:spacing w:after="120" w:line="288" w:lineRule="auto" pt14:Unid="39a55ee3650a4cbe9a5bdd5f7f93d09e"/>
+        <w:jc w:val="both" pt14:Unid="b81fb58fbbd445efa61b0b2fc27b6b0f"/>
       </w:pPr>
       <w:r>
         <w:t>[SÓCIO 2]: [NÚMERO] quotas, total R$ [VALOR], equivalente a [PERCENTUAL]%. [adapte para todos os Sócios]</w:t>
       </w:r>
     </w:p>
-    <w:p pt14:Unid="ddfa9ac240c9441d871428305fe82e3c">
-      <w:pPr pt14:Unid="632e5851f5fc4caa892fb657dd721709">
-        <w:spacing w:after="120" w:line="288" w:lineRule="auto" pt14:Unid="adc69301d5aa40738bd0532728447188"/>
-        <w:jc w:val="both" pt14:Unid="445583c8923345a4b5da40b7c19fb6bc"/>
+    <w:p pt14:Unid="11c794c93c1640fda5700a3a478d3b0a">
+      <w:pPr pt14:Unid="d4e2f2dc489642e791954091465770ae">
+        <w:spacing w:after="120" w:line="288" w:lineRule="auto" pt14:Unid="444259e6b7a743608c53e6d577dff353"/>
+        <w:jc w:val="both" pt14:Unid="75ce040bf0124ce8bdbbf0d6d20fd261"/>
       </w:pPr>
       <w:r>
         <w:t>6.2 Integralização:</w:t>
       </w:r>
     </w:p>
-    <w:p pt14:Unid="a7f6c04cc2f34997882d60fc1c97e511">
-      <w:pPr pt14:Unid="7611df12218445bd953e61f451363fc9">
-        <w:pStyle w:val="ListBullet" pt14:Unid="de05f817acf241d5ac0779d2252fc3bc"/>
-        <w:spacing w:after="120" w:line="288" w:lineRule="auto" pt14:Unid="b436a50bffaf436ab5010a9698e00453"/>
-        <w:jc w:val="both" pt14:Unid="e8343f10fa61462a8dfc9649ee1737ee"/>
+    <w:p pt14:Unid="aed1f44a5d0f434ca6331719bef75f95">
+      <w:pPr pt14:Unid="4ed650558f8d4806bdc99c8afdcd26e8">
+        <w:pStyle w:val="ListBullet" pt14:Unid="2dc44356a38944d2ac45c0702e302e3f"/>
+        <w:spacing w:after="120" w:line="288" w:lineRule="auto" pt14:Unid="aaa6b737aeaa4f2294321af8479a0551"/>
+        <w:jc w:val="both" pt14:Unid="fda85eff10434698a0681ee41d6cdd7b"/>
       </w:pPr>
       <w:r>
         <w:t>[OPÇÃO A – Dinheiro]: em moeda corrente nacional, à vista/parcelado conforme cronograma: [detalhar parcelas, vencimentos, atualização e encargos].</w:t>
       </w:r>
     </w:p>
-    <w:p pt14:Unid="9016bfdd9bb94436b4b56807f92dfa8a">
-      <w:pPr pt14:Unid="3237ed0ad4fc47d4bf44391a3d98588f">
-        <w:pStyle w:val="ListBullet" pt14:Unid="5aa694dba057471ba06c1806c87361cf"/>
-        <w:spacing w:after="120" w:line="288" w:lineRule="auto" pt14:Unid="44cf5e1d0c3e4dfea08ca33517a0b137"/>
-        <w:jc w:val="both" pt14:Unid="12e7e2a7d1c94a41b836ece60fe3ed8d"/>
+    <w:p pt14:Unid="4d2239fa507846abbe73c716db21ae99">
+      <w:pPr pt14:Unid="219e1cc2a82a45deb88c7434e7f4f1d7">
+        <w:pStyle w:val="ListBullet" pt14:Unid="944fcf0657fc40daa8da8139ed746fe4"/>
+        <w:spacing w:after="120" w:line="288" w:lineRule="auto" pt14:Unid="c8bfee1b21c64fefa73d74f2245f1d0e"/>
+        <w:jc w:val="both" pt14:Unid="b26f95418a1341e2ae8796e47df04e42"/>
       </w:pPr>
       <w:r>
         <w:t>[OPÇÃO B – Bens]: mediante conferência dos seguintes bens suscetíveis de avaliação em dinheiro: [descrever], avaliados por [laudo de avaliação/relatório técnico] anexo, respondendo o Sócio pela evicção e vícios (CC, arts. 1.004 e 1.055, §1º).</w:t>
       </w:r>
     </w:p>
-    <w:p pt14:Unid="868077ad626a4a898a46a2d5e0f43f68">
-      <w:pPr pt14:Unid="c69653f71cab46b69e0567724a44c1b5">
-        <w:pStyle w:val="ListBullet" pt14:Unid="2980050b6319428886dc3251777d2ea8"/>
-        <w:spacing w:after="120" w:line="288" w:lineRule="auto" pt14:Unid="3d912046c4b040729a70e4a704d82e65"/>
-        <w:jc w:val="both" pt14:Unid="3732cf19b0134e2781b9eca94ab2d5c6"/>
+    <w:p pt14:Unid="4d54dd1db8c042eba84a3086a5d2269a">
+      <w:pPr pt14:Unid="cde44f21bbc94914a4de246a8e730532">
+        <w:pStyle w:val="ListBullet" pt14:Unid="6076979311814d31ad1b0d9d2d3fd749"/>
+        <w:spacing w:after="120" w:line="288" w:lineRule="auto" pt14:Unid="dfda8bccf71b48558605bfc77189f24b"/>
+        <w:jc w:val="both" pt14:Unid="8fad0cc86d5246a3a6ca1b6993b02dc1"/>
       </w:pPr>
       <w:r>
         <w:t>[OPÇÃO C – Serviços]: [NOTA DO REDATOR: Contribuições em serviços não são aceitas como capital em sociedades empresárias limitadas; admitem-se em sociedades simples. Se necessário, estruturar via prestação de serviços ou planos de incentivo/vesting, sem integralização de capital com serviços.]</w:t>
       </w:r>
     </w:p>
-    <w:p pt14:Unid="5fe2074c775f4b7a92d98ab4bff39095">
-      <w:pPr pt14:Unid="11e6bd96b6b747d1ad8bb86351b7ff26">
-        <w:spacing w:after="120" w:line="288" w:lineRule="auto" pt14:Unid="2c5819faccf14cffa2f3e114c7e7e23d"/>
-        <w:jc w:val="both" pt14:Unid="bd8cd654523e45f4bb4ff6d0bce5e635"/>
+    <w:p pt14:Unid="db1a006a15be46daa2623a4b7964fa2d">
+      <w:pPr pt14:Unid="6ecf5010df22452680b5fa23b40c78a3">
+        <w:spacing w:after="120" w:line="288" w:lineRule="auto" pt14:Unid="a869cd82e09346aeaa7909a718938c08"/>
+        <w:jc w:val="both" pt14:Unid="6610eabc965c4ab1a7088f03108c67f1"/>
       </w:pPr>
       <w:r>
         <w:t>6.3 Chamadas de capital: A Sociedade poderá aprovar aumentos de capital e realizar chamadas aos Sócios, nos termos da Cláusula 7.3 e Cláusula 11, preservado o direito de preferência, salvo deliberação em contrário nos termos legais.</w:t>
       </w:r>
     </w:p>
-    <w:p pt14:Unid="d93114b5a62c43a1a9a198fe92826bee">
-      <w:pPr pt14:Unid="624b58a5d88648f1b42155ee17d0e1a0">
-        <w:spacing w:after="120" w:line="288" w:lineRule="auto" pt14:Unid="d7a7cb18fe9a4a749d4052aee6cd2d43"/>
-        <w:jc w:val="both" pt14:Unid="d00cb7e7e8f74d1d8235a1b60f232c41"/>
+    <w:p pt14:Unid="b52cfbbf0e744613804109462dc728ab">
+      <w:pPr pt14:Unid="ed4b018058cf4c79ae4c961fdb02436d">
+        <w:spacing w:after="120" w:line="288" w:lineRule="auto" pt14:Unid="908ea36d3788445590a5786167e5af40"/>
+        <w:jc w:val="both" pt14:Unid="c6fd384a3d4044aea7f6bb2cc490b111"/>
       </w:pPr>
       <w:r>
         <w:t xml:space="preserve">6.4 Mora na integralização: O Sócio em mora sujeita-se a (i) multa de [X]% e juros de [Y]% a.m.; (ii) atualização pelo [índice]; (iii) suspensão de direitos políticos e econômicos até a purgação; e (iv) eventual redução da participação e/ou exclusão, conforme arts. 1.004, 1.058 e 1.085 do CC, </w:t>
       </w:r>
-      <w:del w:author="Test User" w:id="21" w:date="2026-01-16T02:42:54.8121600-05:00">
+      <w:del w:author="Test User" w:id="21" w:date="2026-01-16T02:48:56.7424540-05:00">
         <w:r>
           <w:delText>observando-se contraditório e ampla defesa.</w:delText>
         </w:r>
       </w:del>
-      <w:moveToRangeStart w:id="33" w:name="move1" w:author="Test User" w:date="2026-01-16T02:42:54.8121600-05:00"/>
-      <w:moveTo w:author="Test User" w:id="34" w:date="2026-01-16T02:42:54.8121600-05:00">
+      <w:moveToRangeStart w:id="33" w:name="move1" w:author="Test User" w:date="2026-01-16T02:48:56.7424540-05:00"/>
+      <w:moveTo w:author="Test User" w:id="34" w:date="2026-01-16T02:48:56.7424540-05:00">
         <w:r>
           <w:t pt14:Status="MovedDestination">obse, PRAZO E EXERCÍCIO SOCIAL</w:t>
         </w:r>
       </w:moveTo>
       <w:moveToRangeEnd w:id="33"/>
     </w:p>
-    <w:p pt14:Unid="3219160b7e9c4deea39945a8c551be54">
-      <w:pPr pt14:Unid="de622d4ba2464b4e90fece67ea517f65" pt14:Status="Inserted">
-        <w:spacing w:after="120" w:line="288" w:lineRule="auto" pt14:Unid="c4da99cbb88a4c3293e3d1aba94c201d"/>
-        <w:jc w:val="both" pt14:Unid="37a1fbe5c4fe4839af19a749f0633c4e"/>
+    <w:p pt14:Unid="e3c54fe381e7436587283b26b9aa3236">
+      <w:pPr pt14:Unid="e284b4df63d14bc49b127885d6787213" pt14:Status="Inserted">
+        <w:spacing w:after="120" w:line="288" w:lineRule="auto" pt14:Unid="388448ba488c4578810459ca38b9dead"/>
+        <w:jc w:val="both" pt14:Unid="0081b248de69482387ea0eee75e37df6"/>
         <w:rPr>
-          <w:ins w:author="Test User" w:id="22" w:date="2026-01-16T02:42:54.8121600-05:00"/>
+          <w:ins w:author="Test User" w:id="22" w:date="2026-01-16T02:48:56.7424540-05:00"/>
         </w:rPr>
       </w:pPr>
-      <w:ins w:author="Test User" w:id="23" w:date="2026-01-16T02:42:54.8121600-05:00">
+      <w:ins w:author="Test User" w:id="23" w:date="2026-01-16T02:48:56.7424540-05:00">
         <w:r>
           <w:t>5.1 Nome empresarial: [NOME EMPRESARIAL] LTDA. (sempre com o sufixo “Ltda.”).</w:t>
         </w:r>
       </w:ins>
     </w:p>
-    <w:p pt14:Unid="052dab8150aa4450953bbc47a3fb7b6f">
-      <w:pPr pt14:Unid="774bd84f35a74b4abc000e8e141ce4bf" pt14:Status="Inserted">
-        <w:spacing w:after="120" w:line="288" w:lineRule="auto" pt14:Unid="87ead929bf294359bc76d4a6a836a197"/>
-        <w:jc w:val="both" pt14:Unid="430ab791d33a424b9f0afac34828b8c0"/>
+    <w:p pt14:Unid="b79ebbf4347f47ac88322cdf276873b4">
+      <w:pPr pt14:Unid="e68abdbe2a964c23a608f04e27890d74" pt14:Status="Inserted">
+        <w:spacing w:after="120" w:line="288" w:lineRule="auto" pt14:Unid="215c48d6bc3b4577bb0dd5af7c1ed888"/>
+        <w:jc w:val="both" pt14:Unid="9b4a8f2ed38b4247a38e7ae681fcb76b"/>
         <w:rPr>
-          <w:ins w:author="Test User" w:id="24" w:date="2026-01-16T02:42:54.8121600-05:00"/>
+          <w:ins w:author="Test User" w:id="24" w:date="2026-01-16T02:48:56.7424540-05:00"/>
         </w:rPr>
       </w:pPr>
-      <w:ins w:author="Test User" w:id="25" w:date="2026-01-16T02:42:54.8121600-05:00">
+      <w:ins w:author="Test User" w:id="25" w:date="2026-01-16T02:48:56.7424540-05:00">
         <w:r>
           <w:t>5.2 Sede: [endereço completo: logradouro, nº, complemento, bairro, município, UF, CEP]. [OPÇÃO: Estabelecer filiais/escritórios mediante deliberação da Administração ou dos Sócios, conforme Cláusula 11.]</w:t>
         </w:r>
       </w:ins>
     </w:p>
-    <w:p pt14:Unid="2af5e89fa96a46ddbf47113c6d0fa2e8">
-      <w:pPr pt14:Unid="9510eb3ae85747619e6a695085546204" pt14:Status="Inserted">
-        <w:spacing w:after="120" w:line="288" w:lineRule="auto" pt14:Unid="1788fd86173743a48cb63e6b08cc0520"/>
-        <w:jc w:val="both" pt14:Unid="11adfb6ef99b4ef2b57d7ada11593297"/>
+    <w:p pt14:Unid="67375c24b8f040ebb219b7cbc51061ae">
+      <w:pPr pt14:Unid="08b64869a69e4b2db0e47523e435fed5" pt14:Status="Inserted">
+        <w:spacing w:after="120" w:line="288" w:lineRule="auto" pt14:Unid="b0ac05140a024da2860105e081410a56"/>
+        <w:jc w:val="both" pt14:Unid="3f7ed0369202430382cf2752b06c724f"/>
         <w:rPr>
-          <w:ins w:author="Test User" w:id="26" w:date="2026-01-16T02:42:54.8121600-05:00"/>
+          <w:ins w:author="Test User" w:id="26" w:date="2026-01-16T02:48:56.7424540-05:00"/>
         </w:rPr>
       </w:pPr>
-      <w:ins w:author="Test User" w:id="27" w:date="2026-01-16T02:42:54.8121600-05:00">
+      <w:ins w:author="Test User" w:id="27" w:date="2026-01-16T02:48:56.7424540-05:00">
         <w:r>
           <w:t>5.3 Prazo de duração: por prazo [determinado: até [DATA]; ou indeterminado].</w:t>
         </w:r>
       </w:ins>
     </w:p>
-    <w:p pt14:Unid="79885dfd7ffb4b9584723c03cbb1b5bf">
-      <w:pPr pt14:Unid="617db3ca3e9749d3b821b7abe7bdf4f7" pt14:Status="Inserted">
-        <w:spacing w:after="120" w:line="288" w:lineRule="auto" pt14:Unid="9e3918c8812f4a0fbb20db7a14b39d3a"/>
-        <w:jc w:val="both" pt14:Unid="c83021ae805643069e7f2ab88f882ff6"/>
+    <w:p pt14:Unid="380b241cf2c4456fb2e35f8711716bc4">
+      <w:pPr pt14:Unid="5fbc324fd6e04dd0b8c7992044542530" pt14:Status="Inserted">
+        <w:spacing w:after="120" w:line="288" w:lineRule="auto" pt14:Unid="cb44247909684e6c83aaa5ad86a3e3ce"/>
+        <w:jc w:val="both" pt14:Unid="8e79f716138c44458a0b35354d3f26e1"/>
         <w:rPr>
-          <w:ins w:author="Test User" w:id="28" w:date="2026-01-16T02:42:54.8121600-05:00"/>
+          <w:ins w:author="Test User" w:id="28" w:date="2026-01-16T02:48:56.7424540-05:00"/>
         </w:rPr>
       </w:pPr>
-      <w:ins w:author="Test User" w:id="29" w:date="2026-01-16T02:42:54.8121600-05:00">
+      <w:ins w:author="Test User" w:id="29" w:date="2026-01-16T02:48:56.7424540-05:00">
         <w:r>
           <w:t>5.4 O exercício social encerra-se em [DATA], quando serão levantadas as demonstrações contábeis, sem prejuízo de balancetes intermediários para fins de deliberação sobre distribuição de resultados.</w:t>
         </w:r>
       </w:ins>
     </w:p>
-    <w:p pt14:Unid="0759051e010e47fbb17a5def31d769dd">
-      <w:pPr pt14:Unid="0a2b121c4cfe47c0a63d1c1c46632250" pt14:Status="Inserted">
-        <w:spacing w:after="120" w:line="288" w:lineRule="auto" pt14:Unid="01b453a7b1f74ce096a04d0f5313b98f"/>
-        <w:jc w:val="both" pt14:Unid="0a0f32644afe49a0a4e953e7a94bdeb0"/>
+    <w:p pt14:Unid="acdfd52afc314fc7aecb6943ae4c5bc6">
+      <w:pPr pt14:Unid="ad8ec862753e4170b538d2f9434b8c33" pt14:Status="Inserted">
+        <w:spacing w:after="120" w:line="288" w:lineRule="auto" pt14:Unid="ed7e6d5f53d94921940ef814cf5e1379"/>
+        <w:jc w:val="both" pt14:Unid="8b42d9ff47a34097892931de4ad67122"/>
         <w:rPr>
-          <w:ins w:author="Test User" w:id="30" w:date="2026-01-16T02:42:54.8121600-05:00"/>
+          <w:ins w:author="Test User" w:id="30" w:date="2026-01-16T02:48:56.7424540-05:00"/>
         </w:rPr>
       </w:pPr>
-      <w:ins w:author="Test User" w:id="31" w:date="2026-01-16T02:42:54.8121600-05:00">
+      <w:ins w:author="Test User" w:id="31" w:date="2026-01-16T02:48:56.7424540-05:00">
         <w:r>
           <w:t>rvando-se contraditório e ampla defesa.</w:t>
         </w:r>
       </w:ins>
     </w:p>
-    <w:p pt14:Unid="5e9e90c1d65b415a994bccd77cd02448">
-      <w:pPr pt14:Unid="266525e228094c3581690ec0c2e974e6">
-        <w:spacing w:after="120" w:line="288" w:lineRule="auto" pt14:Unid="397e1b6609bb495f84b910bd5c4dc64b"/>
-        <w:jc w:val="both" pt14:Unid="22af5deefd2c41ab8fb2a0351f7cbd19"/>
+    <w:p pt14:Unid="4ecff90cf7aa4a3d9bcac3fd58c92a7c">
+      <w:pPr pt14:Unid="4ba0f71558ea47f6a93ccf170f7eb3e8">
+        <w:spacing w:after="120" w:line="288" w:lineRule="auto" pt14:Unid="eccc5bf7f4d1407b8274fd5f436e79c3"/>
+        <w:jc w:val="both" pt14:Unid="5fc988428a8446288d62af0c109da731"/>
       </w:pPr>
       <w:r>
         <w:t>6.5 Índice de atualização: [OPÇÃO: IPCA/IGP-M/INPC], aplicado somente a parcelas vincendas de integralização (se houver), vedada indexação do capital social.</w:t>
       </w:r>
     </w:p>
-    <w:p pt14:Unid="ec9f45d67e1249d38573be3d6261e11f">
-      <w:pPr pt14:Unid="c84f6179b3c74f5a886d6480da74b680">
-        <w:spacing w:after="120" w:line="288" w:lineRule="auto" pt14:Unid="6beff80d76004b25a088936181257afa"/>
-        <w:jc w:val="both" pt14:Unid="5a4a10e0da9c4c998ed469e70d26af43"/>
+    <w:p pt14:Unid="df65d1f5d7a3438589871909e560dcce">
+      <w:pPr pt14:Unid="4bf97882de344ffebc71d10ef859beaf">
+        <w:spacing w:after="120" w:line="288" w:lineRule="auto" pt14:Unid="b378a41934484932928f4283bf2dbc08"/>
+        <w:jc w:val="both" pt14:Unid="8db3dec57d0b4b18b7e7ce865a472a62"/>
       </w:pPr>
       <w:r>
         <w:t>ESTABILIDADE SOCIETÁRIA: LOCK-UP, STANDSTILL, VESTING</w:t>
       </w:r>
     </w:p>
-    <w:p pt14:Unid="dba40fa532254f6db8f91adcc52fc977">
-      <w:pPr pt14:Unid="b78621b3cfe24bd0b625de521bfe9285">
-        <w:spacing w:after="120" w:line="288" w:lineRule="auto" pt14:Unid="aa64cdc2e27c4fa68d834ede37f08b28"/>
-        <w:jc w:val="both" pt14:Unid="9b5fb69d7c7f48af9adde9b61ef82060"/>
+    <w:p pt14:Unid="61576e22a2554343bc90ca519a1ae47c">
+      <w:pPr pt14:Unid="51f4b84478d54895936b382a9ee24918">
+        <w:spacing w:after="120" w:line="288" w:lineRule="auto" pt14:Unid="07ddd331ac9141aba2b8ad1789216c6e"/>
+        <w:jc w:val="both" pt14:Unid="38f53ef80bf64e28bc70794ffc149221"/>
       </w:pPr>
       <w:r>
         <w:t>7.1 Lock-up: Fica vedada a alienação, oneração ou promessa de alienação de quotas por [prazo de 12–24 meses] a contar de [data de emissão/fechamento], salvo (i) transferências intragrupo; (ii) exercício de Tag/Drag; (iii) M&amp;A aprovado nos termos da Cláusula 11; ou (iv) autorização dos Sócios por [quórum aplicável].</w:t>
       </w:r>
     </w:p>
-    <w:p pt14:Unid="4dbbcc674e0847c0bd7303f0eb8b2d0d">
-      <w:pPr pt14:Unid="dd2e38beb61a4e4b9fe3c20d521e5134">
-        <w:spacing w:after="120" w:line="288" w:lineRule="auto" pt14:Unid="43e6f4df830344f099da47563eacfae7"/>
-        <w:jc w:val="both" pt14:Unid="810b8a3454174386b0f6b48df279256b"/>
+    <w:p pt14:Unid="893e4393f8304f5881bee974556c16d7">
+      <w:pPr pt14:Unid="add06f746f3e4caa9797d2402da735d3">
+        <w:spacing w:after="120" w:line="288" w:lineRule="auto" pt14:Unid="105edbbab0c64f47a7a25f81a3acc654"/>
+        <w:jc w:val="both" pt14:Unid="00222ca3ca914d7ca9bff15c37761b4d"/>
       </w:pPr>
       <w:r>
         <w:t>7.2 Standstill: Durante o lock-up, os Sócios não poderão (i) fomentar combinações societárias concorrentes; (ii) organizar consórcios de voto para frustrar Matérias Reservadas; (iii) onerar quotas sem aprovação prévia conforme Cláusula 8.</w:t>
       </w:r>
     </w:p>
-    <w:p pt14:Unid="2796bf6f8f454523b4930d8aec6778a6">
-      <w:pPr pt14:Unid="fd1dd91627c94400bbd924f43b5674ba">
-        <w:spacing w:after="120" w:line="288" w:lineRule="auto" pt14:Unid="dd1a92e66ccf49c2915fcf3ba0244977"/>
-        <w:jc w:val="both" pt14:Unid="33b959b8490c440ebe265fb3207ed9e6"/>
+    <w:p pt14:Unid="d8098742a7b3439ab6170925e22cecef">
+      <w:pPr pt14:Unid="4776700f99e84db59de8ba204f830c90">
+        <w:spacing w:after="120" w:line="288" w:lineRule="auto" pt14:Unid="6202c5666f6e473593f87d7fb9a5f549"/>
+        <w:jc w:val="both" pt14:Unid="a017b34b960a4d8da6e4cad2bee63f0f"/>
       </w:pPr>
       <w:r>
         <w:t>7.3 Aumentos de capital: Poderão ocorrer por deliberação dos Sócios (art. 1.076, CC), com preservação do direito de preferência proporcional e prazo de [30] dias para exercício, salvo renúncia.</w:t>
       </w:r>
     </w:p>
-    <w:p pt14:Unid="b04b3ea9a9e64b69817e6cb735c6f914">
-      <w:pPr pt14:Unid="7dadd29119db487f85f4a12404371120">
-        <w:spacing w:after="120" w:line="288" w:lineRule="auto" pt14:Unid="1bf4199ab8d04354a9bfb73dabcaa8f0"/>
-        <w:jc w:val="both" pt14:Unid="9d2481f945a14fd9a2e4de99ce428b48"/>
+    <w:p pt14:Unid="6e67e174de2c4eaabbf61fa46ceb34d1">
+      <w:pPr pt14:Unid="bd25facdd6574c459302ebe4daed2092">
+        <w:spacing w:after="120" w:line="288" w:lineRule="auto" pt14:Unid="100df863cbc040d39e2a256021b575c2"/>
+        <w:jc w:val="both" pt14:Unid="9d7f841c33f745418706d55adf0de3a6"/>
       </w:pPr>
       <w:r>
         <w:t>7.4 Penalidades: Violação ao lock-up/standstill sujeita o infrator a multa de [10–20]% do preço da operação vedada, além de perdas e danos e obrigação de desfazer o ato.</w:t>
       </w:r>
     </w:p>
-    <w:p pt14:Unid="558bafadbacd4452a6ce68efe8f5e83f">
-      <w:pPr pt14:Unid="1b8ccd4b666d44a494d8fdb0ad9f6b5d">
-        <w:spacing w:after="120" w:line="288" w:lineRule="auto" pt14:Unid="a01b1ff2408b4ec688febfa2eaaa3d7a"/>
-        <w:jc w:val="both" pt14:Unid="562fa9d47e23416eb090150d2015967e"/>
+    <w:p pt14:Unid="7819c771e221441991748d746b7ff244">
+      <w:pPr pt14:Unid="5c43670b81424d239640037590b4cfda">
+        <w:spacing w:after="120" w:line="288" w:lineRule="auto" pt14:Unid="090162c0edde488d9502075ada96ec01"/>
+        <w:jc w:val="both" pt14:Unid="09da2317de3a4defb208efb342125e10"/>
       </w:pPr>
       <w:r>
         <w:t>7.5 Exceções de liquidez: [OPÇÃO – SAFE/convertible]: conversão de instrumentos em quotas nas hipóteses contratadas; [OPÇÃO – ESOP/Plano de Incentivo]: utilização de quotas em tesouraria ou aumento de capital condicionado, observando-se limites legais.</w:t>
       </w:r>
     </w:p>
-    <w:p pt14:Unid="a868693746194342880a613aadcc1b8d">
-      <w:pPr pt14:Unid="39d557de06c84fbcbdc2d2187a051d1b">
-        <w:spacing w:after="120" w:line="288" w:lineRule="auto" pt14:Unid="6630521b34754de695d58178593ac707"/>
-        <w:jc w:val="both" pt14:Unid="5653dc6403e141e585ead603da869318"/>
+    <w:p pt14:Unid="b3567da428334991ac1534f39a73ed95">
+      <w:pPr pt14:Unid="b10db4a1952d44038b74ec0fea02f0d4">
+        <w:spacing w:after="120" w:line="288" w:lineRule="auto" pt14:Unid="5d2059cd5d1e4749a0668529a78f9456"/>
+        <w:jc w:val="both" pt14:Unid="a2fec62a33cc4647bf23f31683657b91"/>
       </w:pPr>
       <w:r>
         <w:t>7.6 Vesting: [OPÇÃO – ON] Quotas sujeitas a vesting serão depositadas em condição suspensiva, com cliff de [12] meses e aquisição linear em [36–48] meses, sujeito a good leaver/bad leaver; [prever critérios, preço de recompra, eventos de aceleração]. [NOTA: Evitar integralização com serviços; estruturar como opção de subscrição/compra condicionada.]</w:t>
       </w:r>
     </w:p>
-    <w:p pt14:Unid="60c94534b4784784b9a4e7d2e7f16866">
-      <w:pPr pt14:Unid="62c4d54b32374f999f663607373539e2">
-        <w:spacing w:after="120" w:line="288" w:lineRule="auto" pt14:Unid="df3b16df206044c5a12d6d05af3bacfa"/>
-        <w:jc w:val="both" pt14:Unid="b5922f4595eb43b7acd6f0278f374fe4"/>
+    <w:p pt14:Unid="2c200755af8b4762bf11ce6f34c22595">
+      <w:pPr pt14:Unid="0be38d70488a4171a51a2092559be821">
+        <w:spacing w:after="120" w:line="288" w:lineRule="auto" pt14:Unid="80d49f29cad7465d9fb74d16ab6b1613"/>
+        <w:jc w:val="both" pt14:Unid="4482ef77b7c74fbc952368f78b28ef35"/>
       </w:pPr>
       <w:r>
         <w:t>CESSÃO, ÔNUS E DIREITO DE PREFERÊNCIA SOBRE QUOTAS</w:t>
       </w:r>
     </w:p>
-    <w:p pt14:Unid="200bbd66e6364e4db3295c552db2951d">
-      <w:pPr pt14:Unid="9d70ce87c0154028bd58768dccdc2af6">
-        <w:spacing w:after="120" w:line="288" w:lineRule="auto" pt14:Unid="8697b0042d264f55a1c03a73afe2acc2"/>
-        <w:jc w:val="both" pt14:Unid="64b21831e64047cb8229fbb3225597a3"/>
+    <w:p pt14:Unid="81af8346201943ef86b10ae2a8cc6510">
+      <w:pPr pt14:Unid="036e630eaa3a404ba05f8b61f34d4c9f">
+        <w:spacing w:after="120" w:line="288" w:lineRule="auto" pt14:Unid="bae250e18b00481b90736476f4fcc8b5"/>
+        <w:jc w:val="both" pt14:Unid="a623b68910424aec8d2a9b75073e01aa"/>
       </w:pPr>
       <w:r>
         <w:t>8.1 Livre cessão entre Sócios, salvo ajustes de preferência, lock-up e demais restrições deste Contrato.</w:t>
       </w:r>
     </w:p>
-    <w:p pt14:Unid="f6e7a2d2017c498ab58b12baafa4a911">
-      <w:pPr pt14:Unid="2722046ac9ff41a298d98a960293cd19">
-        <w:spacing w:after="120" w:line="288" w:lineRule="auto" pt14:Unid="0712ea3b43ae4cc6baf4426fae17c16a"/>
-        <w:jc w:val="both" pt14:Unid="dd98ca1445434b6f877ef9b2ba11a9ef"/>
+    <w:p pt14:Unid="97acc4ea4988473e9d6ec968a96a263e">
+      <w:pPr pt14:Unid="a711cbf891ea477890e6ba3f28d6467a">
+        <w:spacing w:after="120" w:line="288" w:lineRule="auto" pt14:Unid="c916a9d64c444ce092ebafdaf9fbaa63"/>
+        <w:jc w:val="both" pt14:Unid="0a133f48b16c41fd8bdbb918bb03a063"/>
       </w:pPr>
       <w:r>
         <w:t>8.2 Cessão a terceiros: Sujeita-se ao art. 1.057 do CC e às regras abaixo:</w:t>
       </w:r>
     </w:p>
-    <w:p pt14:Unid="0d06ba60ac3543f58a4e2ae50a6ed58a">
-      <w:pPr pt14:Unid="0d13f52f9123486eb16835bfc3d4f6ab">
-        <w:spacing w:after="120" w:line="288" w:lineRule="auto" pt14:Unid="4115a854fffc4c84a094437696baf3f9"/>
-        <w:jc w:val="both" pt14:Unid="dd79dfb8d8b84b4a94d79b97cdb5a949"/>
+    <w:p pt14:Unid="cae9264973e84d50a325b98587c5fa2f">
+      <w:pPr pt14:Unid="66089d18240e4af88ba6291e5a4a4256">
+        <w:spacing w:after="120" w:line="288" w:lineRule="auto" pt14:Unid="bc7e224e0c79427caabe1a29a458fafa"/>
+        <w:jc w:val="both" pt14:Unid="504e931fa14840c1a8f049adb1d8cf90"/>
       </w:pPr>
       <w:r>
         <w:t xml:space="preserve">Consentimento: dependerá de aprovação de Sócios titulares de, no mínimo, [2/3] do capital social, salvo estipulação </w:t>
       </w:r>
-      <w:del w:author="Test User" w:id="32" w:date="2026-01-16T02:42:54.8121600-05:00">
+      <w:del w:author="Test User" w:id="32" w:date="2026-01-16T02:48:56.7424540-05:00">
         <w:r>
           <w:delText>diversa mais rigorosa.</w:delText>
         </w:r>
       </w:del>
-      <w:ins w:author="Test User" w:id="33" w:date="2026-01-16T02:42:54.8121600-05:00">
+      <w:ins w:author="Test User" w:id="33" w:date="2026-01-16T02:48:56.7424540-05:00">
         <w:r>
           <w:t>dive, PRAZO E EXERCÍCIO SOCIAL</w:t>
         </w:r>
       </w:ins>
     </w:p>
-    <w:p pt14:Unid="34937e9049444d7ebbfab20750987664">
-      <w:pPr pt14:Unid="f4f2f899c8b14ec493ea89e1697cdb41" pt14:Status="MovedDestination" pt14:MoveGroupId="2" pt14:MoveName="move2">
-        <w:spacing w:after="120" w:line="288" w:lineRule="auto" pt14:Unid="4afd8c31b7aa47dc9be1b254a75b1b2c"/>
-        <w:jc w:val="both" pt14:Unid="088edb8b8dee4065af272c0212cdbbd5"/>
+    <w:p pt14:Unid="00319218546c48959cf29d1a740ca094">
+      <w:pPr pt14:Unid="c23aef0afe2148cf95e994ff49a0b5c7" pt14:Status="MovedDestination" pt14:MoveGroupId="2" pt14:MoveName="move2">
+        <w:spacing w:after="120" w:line="288" w:lineRule="auto" pt14:Unid="47ad1d9050c14820b1e76ce6f8759c56"/>
+        <w:jc w:val="both" pt14:Unid="10da1d64b06d45bc9e03b8980e9b27a7"/>
         <w:rPr>
-          <w:ins w:author="Test User" w:id="34" w:date="2026-01-16T02:42:54.8121600-05:00"/>
+          <w:ins w:author="Test User" w:id="34" w:date="2026-01-16T02:48:56.7424540-05:00"/>
         </w:rPr>
       </w:pPr>
-      <w:moveToRangeStart w:id="47" w:name="move2" w:author="Test User" w:date="2026-01-16T02:42:54.8121600-05:00"/>
-      <w:moveTo w:author="Test User" w:id="48" w:date="2026-01-16T02:42:54.8121600-05:00">
+      <w:moveToRangeStart w:id="47" w:name="move2" w:author="Test User" w:date="2026-01-16T02:48:56.7424540-05:00"/>
+      <w:moveTo w:author="Test User" w:id="48" w:date="2026-01-16T02:48:56.7424540-05:00">
         <w:r>
           <w:t pt14:Status="MovedDestination">5.1 Nome empresarial: [NOME EMPRESARIAL] LTDA. (sempre com o sufixo “Ltda.”).</w:t>
         </w:r>
       </w:moveTo>
       <w:moveToRangeEnd w:id="47"/>
     </w:p>
-    <w:p pt14:Unid="98465b9b630847e6bb99aac4388251c1">
-      <w:pPr pt14:Unid="61d4f072e44c4af4879b0823bb6cfec0" pt14:Status="MovedDestination" pt14:MoveGroupId="2" pt14:MoveName="move2">
-        <w:spacing w:after="120" w:line="288" w:lineRule="auto" pt14:Unid="4486d314dccb49238479aace9f32314a"/>
-        <w:jc w:val="both" pt14:Unid="c9f89e9230bc4c99bde8c9290b6c038f"/>
+    <w:p pt14:Unid="5b573cff5356499ba87fa856dd08d001">
+      <w:pPr pt14:Unid="b3360073dc7c4b878b718572a870c915" pt14:Status="MovedDestination" pt14:MoveGroupId="2" pt14:MoveName="move2">
+        <w:spacing w:after="120" w:line="288" w:lineRule="auto" pt14:Unid="5be1a366a291465f9b02162478e3af59"/>
+        <w:jc w:val="both" pt14:Unid="070e677016e54f498d2d9a79280e1e99"/>
         <w:rPr>
-          <w:ins w:author="Test User" w:id="35" w:date="2026-01-16T02:42:54.8121600-05:00"/>
+          <w:ins w:author="Test User" w:id="35" w:date="2026-01-16T02:48:56.7424540-05:00"/>
         </w:rPr>
       </w:pPr>
-      <w:moveToRangeStart w:id="50" w:name="move2" w:author="Test User" w:date="2026-01-16T02:42:54.8121600-05:00"/>
-      <w:moveTo w:author="Test User" w:id="51" w:date="2026-01-16T02:42:54.8121600-05:00">
+      <w:moveToRangeStart w:id="50" w:name="move2" w:author="Test User" w:date="2026-01-16T02:48:56.7424540-05:00"/>
+      <w:moveTo w:author="Test User" w:id="51" w:date="2026-01-16T02:48:56.7424540-05:00">
         <w:r>
           <w:t pt14:Status="MovedDestination">5.2 Sede: [endereço completo: logradouro, nº, complemento, bairro, município, UF, CEP]. [OPÇÃO: Estabelecer filiais/escritórios mediante deliberação da Administração ou dos Sócios, conforme Cláusula 11.]</w:t>
         </w:r>
       </w:moveTo>
       <w:moveToRangeEnd w:id="50"/>
     </w:p>
-    <w:p pt14:Unid="4dcd8a2cb9314c6fbe1b73e7ed70ff74">
-      <w:pPr pt14:Unid="7bca294c3a2246babecf86d13b170bb2" pt14:Status="MovedDestination" pt14:MoveGroupId="2" pt14:MoveName="move2">
-        <w:spacing w:after="120" w:line="288" w:lineRule="auto" pt14:Unid="cf1f6af39b0d44a6a9423d0544aab8f3"/>
-        <w:jc w:val="both" pt14:Unid="3eda4fe4e1c3488ab96a4ada74508988"/>
+    <w:p pt14:Unid="1581fb8a0bee46a583156a40f6c791c5">
+      <w:pPr pt14:Unid="ece42c642dd9448b8a5440b770edf72a" pt14:Status="MovedDestination" pt14:MoveGroupId="2" pt14:MoveName="move2">
+        <w:spacing w:after="120" w:line="288" w:lineRule="auto" pt14:Unid="bc0128d1f33e411080e04c3cdace7b50"/>
+        <w:jc w:val="both" pt14:Unid="6fd3b519ecea40f0a54765569db182d2"/>
         <w:rPr>
-          <w:ins w:author="Test User" w:id="36" w:date="2026-01-16T02:42:54.8121600-05:00"/>
+          <w:ins w:author="Test User" w:id="36" w:date="2026-01-16T02:48:56.7424540-05:00"/>
         </w:rPr>
       </w:pPr>
-      <w:moveToRangeStart w:id="53" w:name="move2" w:author="Test User" w:date="2026-01-16T02:42:54.8121600-05:00"/>
-      <w:moveTo w:author="Test User" w:id="54" w:date="2026-01-16T02:42:54.8121600-05:00">
+      <w:moveToRangeStart w:id="53" w:name="move2" w:author="Test User" w:date="2026-01-16T02:48:56.7424540-05:00"/>
+      <w:moveTo w:author="Test User" w:id="54" w:date="2026-01-16T02:48:56.7424540-05:00">
         <w:r>
           <w:t pt14:Status="MovedDestination">5.3 Prazo de duração: por prazo [determinado: até [DATA]; ou indeterminado].</w:t>
         </w:r>
       </w:moveTo>
       <w:moveToRangeEnd w:id="53"/>
     </w:p>
-    <w:p pt14:Unid="c5eef96666254d17a9d365b01349fa51">
-      <w:pPr pt14:Unid="fd9db93a5ec5406d828a49feabce95ea" pt14:Status="MovedDestination" pt14:MoveGroupId="2" pt14:MoveName="move2">
-        <w:spacing w:after="120" w:line="288" w:lineRule="auto" pt14:Unid="7872f74815444d8a9a839f0faf06e213"/>
-        <w:jc w:val="both" pt14:Unid="729c519a792440a18453a35f25f00707"/>
+    <w:p pt14:Unid="9ffda42660e14bf4aa5d04b09cdf8161">
+      <w:pPr pt14:Unid="3e1450e8f66241e994c7878ebc53375b" pt14:Status="MovedDestination" pt14:MoveGroupId="2" pt14:MoveName="move2">
+        <w:spacing w:after="120" w:line="288" w:lineRule="auto" pt14:Unid="d2327ac30153471e9a54e6330b20de82"/>
+        <w:jc w:val="both" pt14:Unid="89348e5cd2a14e5cb7a6a069a87f4bbd"/>
         <w:rPr>
-          <w:ins w:author="Test User" w:id="37" w:date="2026-01-16T02:42:54.8121600-05:00"/>
+          <w:ins w:author="Test User" w:id="37" w:date="2026-01-16T02:48:56.7424540-05:00"/>
         </w:rPr>
       </w:pPr>
-      <w:moveToRangeStart w:id="56" w:name="move2" w:author="Test User" w:date="2026-01-16T02:42:54.8121600-05:00"/>
-      <w:moveTo w:author="Test User" w:id="57" w:date="2026-01-16T02:42:54.8121600-05:00">
+      <w:moveToRangeStart w:id="56" w:name="move2" w:author="Test User" w:date="2026-01-16T02:48:56.7424540-05:00"/>
+      <w:moveTo w:author="Test User" w:id="57" w:date="2026-01-16T02:48:56.7424540-05:00">
         <w:r>
           <w:t pt14:Status="MovedDestination">5.4 O exercício social encerra-se em [DATA], quando serão levantadas as demonstrações contábeis, sem prejuízo de balancetes intermediários para fins de deliberação sobre distribuição de resultados.</w:t>
         </w:r>
       </w:moveTo>
       <w:moveToRangeEnd w:id="56"/>
     </w:p>
-    <w:p pt14:Unid="c60b2d2de2d9464db9628a6be981bc2d">
-      <w:pPr pt14:Unid="af90ed3336504488af34149495549ea5" pt14:Status="MovedDestination" pt14:MoveGroupId="2" pt14:MoveName="move2">
-        <w:pStyle w:val="ListBullet" pt14:Unid="e0b9ccfd91554df2a7f693ea31bb2a43"/>
-        <w:spacing w:after="120" w:line="288" w:lineRule="auto" pt14:Unid="d726dd79666f4bb89734df05f4db3f3c"/>
-        <w:jc w:val="both" pt14:Unid="c24e55fc2b77428589253bece42416b6"/>
+    <w:p pt14:Unid="c8d3335c71094920b1bd5b5566f9ff46">
+      <w:pPr pt14:Unid="b97f5d41ae2f46479d529a993077f2b6" pt14:Status="MovedDestination" pt14:MoveGroupId="2" pt14:MoveName="move2">
+        <w:pStyle w:val="ListBullet" pt14:Unid="a556e90c0cc04bf595fc9806588859ec"/>
+        <w:spacing w:after="120" w:line="288" w:lineRule="auto" pt14:Unid="eaa2b224d8f04731bb366513d7ebf3db"/>
+        <w:jc w:val="both" pt14:Unid="01573afd5c6d4d1f9dfc7df0060ee3b4"/>
         <w:rPr>
-          <w:ins w:author="Test User" w:id="38" w:date="2026-01-16T02:42:54.8121600-05:00"/>
+          <w:ins w:author="Test User" w:id="38" w:date="2026-01-16T02:48:56.7424540-05:00"/>
         </w:rPr>
       </w:pPr>
-      <w:moveToRangeStart w:id="59" w:name="move2" w:author="Test User" w:date="2026-01-16T02:42:54.8121600-05:00"/>
-      <w:moveTo w:author="Test User" w:id="60" w:date="2026-01-16T02:42:54.8121600-05:00">
+      <w:moveToRangeStart w:id="59" w:name="move2" w:author="Test User" w:date="2026-01-16T02:48:56.7424540-05:00"/>
+      <w:moveTo w:author="Test User" w:id="60" w:date="2026-01-16T02:48:56.7424540-05:00">
         <w:r>
           <w:t pt14:Status="MovedDestination">rsa mais rigorosa.</w:t>
         </w:r>
       </w:moveTo>
       <w:moveToRangeEnd w:id="59"/>
     </w:p>
-    <w:p pt14:Unid="57eb5bad06a84a91a0f3395102a0ff82">
-      <w:pPr pt14:Unid="440f416c27864ba39ed80a93af9e7f95">
-        <w:pStyle w:val="ListBullet" pt14:Unid="7b78f790ce73459c8a93ca5b4b65226e"/>
-        <w:spacing w:after="120" w:line="288" w:lineRule="auto" pt14:Unid="2c11c4db2cae42259900f37f48236f31"/>
-        <w:jc w:val="both" pt14:Unid="036663be0f0444729be483df902f0751"/>
+    <w:p pt14:Unid="004dff2e4a8e4920a73fee49d3d54098">
+      <w:pPr pt14:Unid="163a5b9beb6b482980a1c4a1e4195692">
+        <w:pStyle w:val="ListBullet" pt14:Unid="9164687e93dd4eee950cb9b257ad64c2"/>
+        <w:spacing w:after="120" w:line="288" w:lineRule="auto" pt14:Unid="1d998610fa62406186f93b9e25944ad9"/>
+        <w:jc w:val="both" pt14:Unid="e2d7690c7bd34ca48720675eb1b1da23"/>
       </w:pPr>
       <w:r>
         <w:t>Direito de preferência (ROFR): os demais Sócios terão preferência na aquisição das quotas ofertadas a terceiro, nas mesmas condições, com prazo de [30] dias para exercício após notificação contendo preço, condições e prazo (documentadas).</w:t>
       </w:r>
     </w:p>
-    <w:p pt14:Unid="2f030ffdc25f4ac1a906e0b5c7b6fbca">
-      <w:pPr pt14:Unid="ccf7a0ba0b5a480784c63016930a8f4a">
-        <w:pStyle w:val="ListBullet" pt14:Unid="d73452db67d7447a94a32e544f08c389"/>
-        <w:spacing w:after="120" w:line="288" w:lineRule="auto" pt14:Unid="9fd3fbd10bee48628e94409feeb4812c"/>
-        <w:jc w:val="both" pt14:Unid="486d7b64b61f4a69aac552d72ccff261"/>
+    <w:p pt14:Unid="153064e1a17b4c9aa279ae631e91ca5d">
+      <w:pPr pt14:Unid="35a040e570394ba192de66a41c043407">
+        <w:pStyle w:val="ListBullet" pt14:Unid="0c302e7a26fe48b8ac5428a7dd742e09"/>
+        <w:spacing w:after="120" w:line="288" w:lineRule="auto" pt14:Unid="faac5c0302264f3faa95de33b6cd1e64"/>
+        <w:jc w:val="both" pt14:Unid="f1fd1a99ab7247d69f1f73a0cf7437b7"/>
       </w:pPr>
       <w:r>
         <w:t>Oposição: Na ausência de consentimento nos termos legais e contratuais, a cessão não produzirá efeitos perante a Sociedade e terceiros até registro do aditivo na Junta.</w:t>
       </w:r>
     </w:p>
-    <w:p pt14:Unid="8cf241a4ea414bf8ac34f62e8d6faa0e">
-      <w:pPr pt14:Unid="8b700eb5a05b4b06b6df8e7aab2fa74e">
-        <w:spacing w:after="120" w:line="288" w:lineRule="auto" pt14:Unid="9fe4ea43779846d6ad702e7fd3eee3dc"/>
-        <w:jc w:val="both" pt14:Unid="0b44b33f0e6b40768ec294bbf78973e5"/>
+    <w:p pt14:Unid="fb11029bfe674cb8b759596e5d67e386">
+      <w:pPr pt14:Unid="9b42bcdaeaf944c58348a4a3c1bdbb09">
+        <w:spacing w:after="120" w:line="288" w:lineRule="auto" pt14:Unid="08527eab2b6f43d5bb20e35a68bddc9a"/>
+        <w:jc w:val="both" pt14:Unid="607cf3553b884a74ad121d032e6f921d"/>
       </w:pPr>
       <w:r>
         <w:t>8.3 Ônus sobre quotas: A oneração, penhor, cessão fiduciária ou gravame sobre quotas depende de aprovação de Sócios representando [maioria/2/3] do capital e subordina o credor às regras deste Contrato.</w:t>
       </w:r>
     </w:p>
-    <w:p pt14:Unid="969b87f6eb924e20bdca3afae2ca3baa">
-      <w:pPr pt14:Unid="43656ff32db1478985e7980401608f53">
-        <w:spacing w:after="120" w:line="288" w:lineRule="auto" pt14:Unid="ac9b03f7ec654aa3b0ad30d5b6cb4ca3"/>
-        <w:jc w:val="both" pt14:Unid="6228c482ccef41af8d192c3da1eb9fad"/>
+    <w:p pt14:Unid="fa11834f95904f658b10bb587487ba8a">
+      <w:pPr pt14:Unid="3aef770927cf461ca002b55208e49244">
+        <w:spacing w:after="120" w:line="288" w:lineRule="auto" pt14:Unid="f2311ff52f684238a10db4294af30794"/>
+        <w:jc w:val="both" pt14:Unid="51d05a447c724542a2ac137c3df30fa9"/>
       </w:pPr>
       <w:r>
         <w:t>8.4 Condições precedentes e declarações: Qualquer cessão sujeita-se à inexistência de default do cedente, cumprimento de lock-up/standstill, e à adesão do cessionário a este Contrato e a eventual Acordo de Quotistas.</w:t>
       </w:r>
     </w:p>
-    <w:p pt14:Unid="99b466a01ae84f3cb19ec6ba77653c49">
-      <w:pPr pt14:Unid="7073fff6add04d8184143187af2c8f07">
-        <w:spacing w:after="120" w:line="288" w:lineRule="auto" pt14:Unid="e1775bf446d8478c840cfa27550579bd"/>
-        <w:jc w:val="both" pt14:Unid="e1c6b63fcbd64e3f948643d7b2f3a95a"/>
+    <w:p pt14:Unid="591a337f980a4e10b588b92f5953987d">
+      <w:pPr pt14:Unid="05dc0ff1f1e64ecab3d3fc34201a54c5">
+        <w:spacing w:after="120" w:line="288" w:lineRule="auto" pt14:Unid="0c7be0b971bd43c2b3da08c6b9713a2b"/>
+        <w:jc w:val="both" pt14:Unid="d7539ed3f44c42d1a4adc0dda6a1744a"/>
       </w:pPr>
       <w:r>
         <w:t>MECANISMOS DE LIQUIDEZ: ROFO/ROFR, TAG-ALONG, DRAG-ALONG</w:t>
       </w:r>
     </w:p>
-    <w:p pt14:Unid="d88eee1e379748f09688c82578dd4a73">
-      <w:pPr pt14:Unid="bf8d0f7b60b944bd99173ad4f5e6e068">
-        <w:spacing w:after="120" w:line="288" w:lineRule="auto" pt14:Unid="5d7a05b3c3b445ce8786454cb5996616"/>
-        <w:jc w:val="both" pt14:Unid="896a7f5575024844a454ccf51db7166e"/>
+    <w:p pt14:Unid="9736d9956b504b50a8e4c0230b37cbd4">
+      <w:pPr pt14:Unid="ba3f6e4b3ba44f4f821afc51a69aeb21">
+        <w:spacing w:after="120" w:line="288" w:lineRule="auto" pt14:Unid="31f7711369854ddb846441b24baf957f"/>
+        <w:jc w:val="both" pt14:Unid="73eeb27c2e8b440d857c2b0c44645e93"/>
       </w:pPr>
       <w:r>
         <w:t>9.1 ROFO (right of first offer) [OPÇÃO – ON]: Antes de negociar com terceiro, o Sócio vendedor ofertará suas quotas aos demais Sócios, informando preço e condições propostos; prazo para resposta: [15] dias; negociação de boa-fé por [15] dias; na ausência de acordo, poderá negociar com terceiro por condições não mais favoráveis do que as ofertadas.</w:t>
       </w:r>
     </w:p>
-    <w:p pt14:Unid="e7a0325f00b5427cb5c8685fce31f888">
-      <w:pPr pt14:Unid="6ff3f646b8db480eac4bf2a5faf22fdd">
-        <w:spacing w:after="120" w:line="288" w:lineRule="auto" pt14:Unid="cb9f9672257f4f968c9e40669fb75e14"/>
-        <w:jc w:val="both" pt14:Unid="8d7ed454b7084ed1bab93299b65ae583"/>
+    <w:p pt14:Unid="9b21c260ac6947a8a0313666db637092">
+      <w:pPr pt14:Unid="dd7a7f1e43604e698fd52fb754b9fa24">
+        <w:spacing w:after="120" w:line="288" w:lineRule="auto" pt14:Unid="a69173aa21a14de9b0882cdf885a9fdf"/>
+        <w:jc w:val="both" pt14:Unid="ffa02893b6494433b8a5356022128531"/>
       </w:pPr>
       <w:r>
         <w:t>9.2 ROFR (right of first refusal) [OPÇÃO – ON]: Recebida proposta firme de terceiro, o Sócio vendedor notificará os demais Sócios (com cópia da proposta), que poderão exercer preferência em [30] dias nas mesmas condições.</w:t>
       </w:r>
     </w:p>
-    <w:p pt14:Unid="a632b6f5f7034e75a871fd68b89a3cda">
-      <w:pPr pt14:Unid="8091becb27c8461ebe9efa7875bcdd5d">
-        <w:spacing w:after="120" w:line="288" w:lineRule="auto" pt14:Unid="8ce827bc0baf4b7490004073cfb5a84e"/>
-        <w:jc w:val="both" pt14:Unid="1704eb472876402696460c68ae67de7d"/>
+    <w:p pt14:Unid="d8c39a8f8ac34caba01564730f92b3cf">
+      <w:pPr pt14:Unid="8b67f4ec938e4d228582cdfe55e7362d">
+        <w:spacing w:after="120" w:line="288" w:lineRule="auto" pt14:Unid="699af6951b974c2ba7ebecae845b4ba5"/>
+        <w:jc w:val="both" pt14:Unid="927bb37d97ca42c498e457bf09c04b4d"/>
       </w:pPr>
       <w:r>
         <w:t>9.3 Tag-along [OPÇÃO – ON]: Na venda que resulte na transferência de controle ou de [50%+] do capital votante/econômico, os Sócios minoritários terão direito de vender suas quotas nas mesmas condições e preço por quota (pari passu), em proporção a sua participação, com prazo de adesão de [15–30] dias.</w:t>
       </w:r>
     </w:p>
-    <w:p pt14:Unid="506f26e6cf9c4e92ae56bfeef76951f9">
-      <w:pPr pt14:Unid="36118de22f504628ad564e1f72085057">
-        <w:spacing w:after="120" w:line="288" w:lineRule="auto" pt14:Unid="0e92cc473c5941679834a7088a8c4689"/>
-        <w:jc w:val="both" pt14:Unid="8d3e9e0f6992453eb5b62579ea7f2bfb"/>
+    <w:p pt14:Unid="313e3397988947b29e1dbaa215eec2b1">
+      <w:pPr pt14:Unid="747bbeb59942467a8352cb1e31758b03">
+        <w:spacing w:after="120" w:line="288" w:lineRule="auto" pt14:Unid="6cf5969f432b4433b5635c42bb919814"/>
+        <w:jc w:val="both" pt14:Unid="32da7b3948334dfb83cda1f1fba44d32"/>
       </w:pPr>
       <w:r>
         <w:t>9.4 Drag-along [OPÇÃO – ON]: Aprovada a venda de [&gt;50–66%] do capital a terceiro, os Sócios remanescentes obrigam-se a vender suas quotas nas mesmas condições (salvaguardas: preço justo, pagamento à vista/escrow, declarações limitadas a título/autoridade, indenizações proporcionais), podendo exigir laudo de avaliação independente se não houver preço de mercado.</w:t>
       </w:r>
     </w:p>
-    <w:p pt14:Unid="c3f6ec05bb7c4bdab82f7c532694fe54">
-      <w:pPr pt14:Unid="fc07776e4c4e4571b18de187ed523036">
-        <w:spacing w:after="120" w:line="288" w:lineRule="auto" pt14:Unid="be39bee2729746bc993605b60498b58c"/>
-        <w:jc w:val="both" pt14:Unid="03511a50fa824ebdb86b0397d4df7ee1"/>
+    <w:p pt14:Unid="bfdef4a5daf047398f01f8d2ae97ae9f">
+      <w:pPr pt14:Unid="ffcabc7b0d6a4348b2deb392b23b4918">
+        <w:spacing w:after="120" w:line="288" w:lineRule="auto" pt14:Unid="4d7c374fda7645f3a988593fdbed0cbd"/>
+        <w:jc w:val="both" pt14:Unid="b6757f424fee4977a15f9fe5fe416329"/>
       </w:pPr>
       <w:r>
         <w:t>9.5 Preço/valoração: Para exercícios de Tag/Drag e ROFR, o preço poderá ser: (i) de mercado; (ii) apurado por múltiplos [EV/EBITDA, receita] com ajustes de dívida líquida e capital de giro alvo; (iii) por laudo independente [avaliador registrado/empresa de auditoria]; critérios definidos no Anexo A.</w:t>
       </w:r>
     </w:p>
-    <w:p pt14:Unid="ba2a9872666341988e9127a737364ada">
-      <w:pPr pt14:Unid="c16e1bf3ecef4be7b86dcf078e0e5920">
-        <w:spacing w:after="120" w:line="288" w:lineRule="auto" pt14:Unid="6f96fae4ecb14260a9aecaad14fe5965"/>
-        <w:jc w:val="both" pt14:Unid="f675e96ec11745edbb4525977b339ab9"/>
+    <w:p pt14:Unid="34b595e6c88d4a49bb66632d124b7dab">
+      <w:pPr pt14:Unid="f26b23f5fe9b43d5b3aa5bdf53b107b3">
+        <w:spacing w:after="120" w:line="288" w:lineRule="auto" pt14:Unid="1f51d8a0230e44da93fbff745ac767bd"/>
+        <w:jc w:val="both" pt14:Unid="2a6b0ec4b2db45b2ac6dab8907ad5143"/>
       </w:pPr>
       <w:r>
         <w:t>GOVERNANÇA, ADMINISTRAÇÃO E REGÊNCIA SUPLETIVA</w:t>
       </w:r>
     </w:p>
-    <w:p pt14:Unid="54076134c2ef476694d7ff6a3bd0e350">
-      <w:pPr pt14:Unid="73fa9925e07940469e0a89186610bb29">
-        <w:spacing w:after="120" w:line="288" w:lineRule="auto" pt14:Unid="bb7d762ed6b74aab8ef0198f26a7b962"/>
-        <w:jc w:val="both" pt14:Unid="2732ae7ac8f14919beeba85fb0cd29e7"/>
+    <w:p pt14:Unid="5f0db3d5185c4291bdc9f34232674326">
+      <w:pPr pt14:Unid="51c5bbdf8d29472e8d2fe2f4e9defbb4">
+        <w:spacing w:after="120" w:line="288" w:lineRule="auto" pt14:Unid="e60e07028a254229bfd62dcb3ad014ee"/>
+        <w:jc w:val="both" pt14:Unid="f4e3f19aaa764016ba8c171e162dede7"/>
       </w:pPr>
       <w:r>
         <w:t>10.1 Regência supletiva: [OPÇÃO A – ON] A Sociedade será regida supletivamente pela Lei nº 6.404/1976 (LSA), no que couber (CC, art. 1.053, parágrafo único). [OPÇÃO B – OFF] A Sociedade será regida exclusivamente pelas normas da LTDA do Código Civil.</w:t>
       </w:r>
     </w:p>
-    <w:p pt14:Unid="cac3cfcde5f04fcda125f01935d1c0e6">
-      <w:pPr pt14:Unid="f815ccc7df3a4047a28c9ab853895ead">
-        <w:spacing w:after="120" w:line="288" w:lineRule="auto" pt14:Unid="09f03a682a404efd8d40e7f5781fbae5"/>
-        <w:jc w:val="both" pt14:Unid="417ff266c0f04baaa9f28df5e50e8d9b"/>
+    <w:p pt14:Unid="8815880e81664edabf39ed72f9a5c9f4">
+      <w:pPr pt14:Unid="f3f735d4b5494bc4bc122f66c443ff9e">
+        <w:spacing w:after="120" w:line="288" w:lineRule="auto" pt14:Unid="132604f6b0044a5e85206a4b923ab0f6"/>
+        <w:jc w:val="both" pt14:Unid="0507dcdf6be846e3b2de15eb8f4362b5"/>
       </w:pPr>
       <w:r>
         <w:t>10.2 Estrutura: A administração caberá a [1] ou mais administradores, Sócios ou não, residentes no Brasil, com mandato de [prazo], eleitos e destituíveis nos termos deste Contrato e da lei.</w:t>
       </w:r>
     </w:p>
-    <w:p pt14:Unid="451a58921e5543d6acd9c8075f5c0703">
-      <w:pPr pt14:Unid="9614ffc792044094971af169aeb4ddc0">
-        <w:spacing w:after="120" w:line="288" w:lineRule="auto" pt14:Unid="adea8a2a09aa48a09d64a39a0709d442"/>
-        <w:jc w:val="both" pt14:Unid="8a096de61a964b8c86d09264557cfe75"/>
+    <w:p pt14:Unid="c63600596c394dec95817dee5b11e3b6">
+      <w:pPr pt14:Unid="cfb9619df287420dbdfc485d5eff3cbe">
+        <w:spacing w:after="120" w:line="288" w:lineRule="auto" pt14:Unid="cdf48ad85e9743479e8f11b0111d3113"/>
+        <w:jc w:val="both" pt14:Unid="b147f8a64ce147fc92fcf9b4a5bd72a6"/>
       </w:pPr>
       <w:r>
         <w:t>10.3 Investidura: A investidura dar-se-á com a assinatura do termo de posse (em livro próprio ou instrumento à parte), após assinatura do contrato e, se aplicável, arquivamento na Junta.</w:t>
       </w:r>
     </w:p>
-    <w:p pt14:Unid="8c9affe9a49146fe9487aa4c25d10c90">
-      <w:pPr pt14:Unid="d97f2e6610844f11a1344c732500e0b3">
-        <w:spacing w:after="120" w:line="288" w:lineRule="auto" pt14:Unid="9622a4e02ce5464d88954af3e23d589b"/>
-        <w:jc w:val="both" pt14:Unid="d0dd3022218845ccbbfce47c6969e2b5"/>
+    <w:p pt14:Unid="75bdaf0c8983404fb22ddbb01affda23">
+      <w:pPr pt14:Unid="2889880ecdd44cee964dca9d65b21732">
+        <w:spacing w:after="120" w:line="288" w:lineRule="auto" pt14:Unid="a95cd1af4a894810a8c0758cf5ae2af3"/>
+        <w:jc w:val="both" pt14:Unid="7f08986aeff0477b97c98fd68e8a9d24"/>
       </w:pPr>
       <w:r>
         <w:t>10.4 Poderes e deveres: Os administradores deverão observar os deveres de diligência e lealdade (CC, art. 1.011), agir no interesse da Sociedade, evitar conflitos de interesse e cumprir políticas internas.</w:t>
       </w:r>
     </w:p>
-    <w:p pt14:Unid="e6203495e5be47ab80da5b3bee3a9ef3">
-      <w:pPr pt14:Unid="7efbcb49cd8946179458e4fe609e81f4">
-        <w:spacing w:after="120" w:line="288" w:lineRule="auto" pt14:Unid="042c2b4f1e7b48ac90cc8c9d7b3b614e"/>
-        <w:jc w:val="both" pt14:Unid="2b72aa8dad7b477b88bf5bd49f28a7d8"/>
+    <w:p pt14:Unid="4f3b043c73a54373a1554f0790666fe0">
+      <w:pPr pt14:Unid="2ddac1123fd946679addb87d9101c994">
+        <w:spacing w:after="120" w:line="288" w:lineRule="auto" pt14:Unid="f75f82aa90df4c17acc5e1b3ab37c823"/>
+        <w:jc w:val="both" pt14:Unid="dd5085b7ae42485fb6b4148142bbf488"/>
       </w:pPr>
       <w:r>
         <w:t>10.5 Representação: A Sociedade será representada por [regra de assinaturas: isoladamente/conjunta por 2 administradores/um administrador + procurador], vedada a prática de atos fora do objeto.</w:t>
       </w:r>
     </w:p>
-    <w:p pt14:Unid="e057c65928ca4a67bc7e7c449fc03845">
-      <w:pPr pt14:Unid="7f42d1d059094f42bf11fb65b26b6a34">
-        <w:spacing w:after="120" w:line="288" w:lineRule="auto" pt14:Unid="d566c6ae33ff429bb96f4473991074bd"/>
-        <w:jc w:val="both" pt14:Unid="0a3842b5c37447ae9db8df2539c24e89"/>
+    <w:p pt14:Unid="90abca3a63eb4589acd556848a514e08">
+      <w:pPr pt14:Unid="beddfd4b6ad742a78a7961c02a26d009">
+        <w:spacing w:after="120" w:line="288" w:lineRule="auto" pt14:Unid="13964c9078474065a5636fedde6f2cc6"/>
+        <w:jc w:val="both" pt14:Unid="bb592217a41b4fec876307a95b7633f7"/>
       </w:pPr>
       <w:r>
         <w:t>10.6 Remuneração: A remuneração anual global dos administradores será fixada por deliberação dos Sócios, cabendo à Administração a distribuição interna, salvo decisão em contrário.</w:t>
       </w:r>
     </w:p>
-    <w:p pt14:Unid="2e273f5d7389453a96dbf0506e4cc3a4">
-      <w:pPr pt14:Unid="c84d5fc3a0ac4ca4b2e4485eab00eac4">
-        <w:spacing w:after="120" w:line="288" w:lineRule="auto" pt14:Unid="bdb67a13b7394df88d43e5edfae0945f"/>
-        <w:jc w:val="both" pt14:Unid="6ad65f5342c2437fbc20fdeafdbddd0a"/>
+    <w:p pt14:Unid="42125e300b534afdad5dae3657f49f4c">
+      <w:pPr pt14:Unid="cc3fa7b7dd234af9b273494e060f5b4d">
+        <w:spacing w:after="120" w:line="288" w:lineRule="auto" pt14:Unid="f7083ddf50e24775be758a8989a0a8d8"/>
+        <w:jc w:val="both" pt14:Unid="4c9926c3d9a14bf691542e606cf2f1d9"/>
       </w:pPr>
       <w:r>
         <w:t>10.7 Impedimentos e conflitos: Administradores deverão revelar conflito de interesse e abster-se de votar/atuar no tema conflituoso. Atos com partes relacionadas exigem aprovação nos termos da Cláusula 11 e política aplicável.</w:t>
       </w:r>
     </w:p>
-    <w:p pt14:Unid="69a276ca2c594632b2ab17a4c4546dfc">
-      <w:pPr pt14:Unid="1ab4b48bb491425c8b1508a51c3d8bf1">
-        <w:spacing w:after="120" w:line="288" w:lineRule="auto" pt14:Unid="6b98596048df452882ccc0aa7ccfcc5a"/>
-        <w:jc w:val="both" pt14:Unid="664d39e6ed504a5aab7a0c6f50ac5e89"/>
+    <w:p pt14:Unid="b4c2597776614cbd8afafe47604d8d04">
+      <w:pPr pt14:Unid="5df1a8fe85cd4f44922e8d2591a61b0c">
+        <w:spacing w:after="120" w:line="288" w:lineRule="auto" pt14:Unid="3cd1f990e8a74ad8a6185efdde731f05"/>
+        <w:jc w:val="both" pt14:Unid="a3a7943189d546c0bccfe51677a6a5b0"/>
       </w:pPr>
       <w:r>
         <w:t>10.8 Substituição/suspensão: Por impedimento, ausência ou vacância, observar-se-á [cronograma de substituição]. A suspensão cautelar poderá ser deliberada por [maioria/2/3] do capital em caso de falta grave.</w:t>
       </w:r>
     </w:p>
-    <w:p pt14:Unid="1c82bb6c1a8f4ee7a07c221a8453f5b2">
-      <w:pPr pt14:Unid="5a30b81de303437ba06ec5f1b8d56392">
-        <w:spacing w:after="120" w:line="288" w:lineRule="auto" pt14:Unid="d9e2922b04404a1cbb53f77b260345b3"/>
-        <w:jc w:val="both" pt14:Unid="c0a549ecc9fc4ab3a765e0a310d37af7"/>
+    <w:p pt14:Unid="8772024b8212481484bae9e153c6c8f0">
+      <w:pPr pt14:Unid="7a63197ff9534c7784222a80e32dfd20">
+        <w:spacing w:after="120" w:line="288" w:lineRule="auto" pt14:Unid="9a9d280b290d438f9490e19215a58fe2"/>
+        <w:jc w:val="both" pt14:Unid="fa28a7475ba942a8a9bff64d61ecce3a"/>
       </w:pPr>
       <w:r>
         <w:t>10.9 Reuniões/assembleias de Sócios: Convocação por [e-mail com confirmação de leitura + aviso no portal], com antecedência mínima de [8–15] dias, salvo renúncia. Admite-se realização digital ou semipresencial, voto a distância e assinaturas eletrônicas, com registro em ata, nos termos da legislação aplicável (Lei 14.030/2020; IN DREI 81/2020).</w:t>
       </w:r>
     </w:p>
-    <w:p pt14:Unid="527f033e13be43adb2c56f606623d1a6">
-      <w:pPr pt14:Unid="a6b0b01d0e1e48e49e3b88f7d8d55c1c">
-        <w:spacing w:after="120" w:line="288" w:lineRule="auto" pt14:Unid="0941f8f263034a4b8759cbc548969bf7"/>
-        <w:jc w:val="both" pt14:Unid="c731779054de48c8985e7587bb375aca"/>
+    <w:p pt14:Unid="caa84b8397d147d882f864c51c4ca95f">
+      <w:pPr pt14:Unid="bd0f34d32bd64ebbafc9607c5d23ea0b">
+        <w:spacing w:after="120" w:line="288" w:lineRule="auto" pt14:Unid="240458da3bcc41d7b6bbc32cc6aa2e4a"/>
+        <w:jc w:val="both" pt14:Unid="27d4eedf71cd4482be84e78f8fee3e6e"/>
       </w:pPr>
       <w:r>
         <w:t>QUÓRUNS E MATÉRIAS RESERVADAS (ATUALIZAÇÃO PELA LEI 14.451/2022)</w:t>
       </w:r>
     </w:p>
-    <w:p pt14:Unid="23276ed27f434e009046c429f49a5fd0">
-      <w:pPr pt14:Unid="93e2903e49224326b386a0d3430decb5">
-        <w:spacing w:after="120" w:line="288" w:lineRule="auto" pt14:Unid="00fbef5555504a81820b8b631b55c1b5"/>
-        <w:jc w:val="both" pt14:Unid="0a2def6622044e2d8a2f1117fd61a37b"/>
+    <w:p pt14:Unid="21f6a7331a044a8087e9ccf698efa26d">
+      <w:pPr pt14:Unid="7aac82489ae24af7bae3172d91027c3e">
+        <w:spacing w:after="120" w:line="288" w:lineRule="auto" pt14:Unid="8abda56be84a4fe7989b874dde2e34e9"/>
+        <w:jc w:val="both" pt14:Unid="a7183edf2d9344ef869021e5899c44bf"/>
       </w:pPr>
       <w:r>
         <w:t>11.1 Deliberações: Salvo quóruns especiais, as deliberações serão tomadas pela maioria do capital social (CC, art. 1.076, II).</w:t>
       </w:r>
     </w:p>
-    <w:p pt14:Unid="a50bfcaf048845d28e35ccfca039b380">
-      <w:pPr pt14:Unid="d531730ef25d49678bb2d0cac14f970b">
-        <w:spacing w:after="120" w:line="288" w:lineRule="auto" pt14:Unid="cda784c8076c4704b0e1730771d8bd40"/>
-        <w:jc w:val="both" pt14:Unid="f42c5e950c724ddb995bf387a2b7bed8"/>
+    <w:p pt14:Unid="e8ff7b65b6054edab47665987d359fab">
+      <w:pPr pt14:Unid="7be5d03ac9904cf990b91753d56e00a5">
+        <w:spacing w:after="120" w:line="288" w:lineRule="auto" pt14:Unid="b6378c4352524f039c3810bb4cec2d7d"/>
+        <w:jc w:val="both" pt14:Unid="635d56154dfa48ad9e26f0408146b97e"/>
       </w:pPr>
       <w:r>
         <w:t>11.2 Quóruns especiais:</w:t>
       </w:r>
     </w:p>
-    <w:p pt14:Unid="c70f9bc92d014979ad5d74bdcbf45e3f">
-      <w:pPr pt14:Unid="162a717bb3404c76b37086ccfc961212">
-        <w:pStyle w:val="ListBullet" pt14:Unid="ef71e5f0c4bb4ddf9ca389ab78059e6c"/>
-        <w:spacing w:after="120" w:line="288" w:lineRule="auto" pt14:Unid="7cf801e801724be5853f721d0a58e8d8"/>
-        <w:jc w:val="both" pt14:Unid="fbf360b7fefb427b85ad2e6c90e4bc84"/>
+    <w:p pt14:Unid="5ff1b794655240b3abbc8b4bffd2d3d7">
+      <w:pPr pt14:Unid="b874b0696a7a4b3cba81e79408616622">
+        <w:pStyle w:val="ListBullet" pt14:Unid="86d5ef3280ab4842b46dc02f9af0773f"/>
+        <w:spacing w:after="120" w:line="288" w:lineRule="auto" pt14:Unid="ab9607c0166449c7b95f8990940f1aa0"/>
+        <w:jc w:val="both" pt14:Unid="2d6ce3dad620483393676e3e8d599697"/>
       </w:pPr>
       <w:r>
         <w:t>Modificação do Contrato Social, incorporação, fusão, dissolução ou cessação de liquidação: exigem voto de, no mínimo, 2/3 do capital social (CC, art. 1.076, I, com redação da Lei 14.451/2022).</w:t>
       </w:r>
     </w:p>
-    <w:p pt14:Unid="ac5535b52ee54e6297de26001ab170c5">
-      <w:pPr pt14:Unid="807dbc0e4dbf46838261d8cc99efa678">
-        <w:pStyle w:val="ListBullet" pt14:Unid="dbab6580c0234579a95a4a85b3bf0f84"/>
-        <w:spacing w:after="120" w:line="288" w:lineRule="auto" pt14:Unid="37b51b7c178f4f04af9bff792aa7632b"/>
-        <w:jc w:val="both" pt14:Unid="9c917ce3d94b44de93bd060f2a4d2dab"/>
+    <w:p pt14:Unid="2787698782554c67ab0a29d7771b1565">
+      <w:pPr pt14:Unid="2f9e7d82b6854cfbbe6bbac44abf70e3">
+        <w:pStyle w:val="ListBullet" pt14:Unid="010fb60a41c74dbc94ee0859c0592aff"/>
+        <w:spacing w:after="120" w:line="288" w:lineRule="auto" pt14:Unid="52ba0fd2db1b42f0b6b49e5533390ab4"/>
+        <w:jc w:val="both" pt14:Unid="8accb32220774cc891fcebbb2045199d"/>
       </w:pPr>
       <w:r>
         <w:t>Designação de administrador não Sócio: (i) 2/3 do capital enquanto não integralizado; (ii) maioria do capital após integralização total (CC, art. 1.061, com redação da Lei 14.451/2022).</w:t>
       </w:r>
     </w:p>
-    <w:p pt14:Unid="cd601f9ea84b4dd590e0159e917b777e">
-      <w:pPr pt14:Unid="32759d0d667a4fdcab16c19c2bfa32c4">
-        <w:spacing w:after="120" w:line="288" w:lineRule="auto" pt14:Unid="5bf4dcacd97748a4bba5c36042cec9b7"/>
-        <w:jc w:val="both" pt14:Unid="4db77cec2354483f81d629abd89d0247"/>
+    <w:p pt14:Unid="38a955ef087e4441879656d95b0c4230">
+      <w:pPr pt14:Unid="ff2b25ac59ca4c3b93f32d62abb61afa">
+        <w:spacing w:after="120" w:line="288" w:lineRule="auto" pt14:Unid="e489815ed4994ca882f0b3b7c33fa6a1"/>
+        <w:jc w:val="both" pt14:Unid="84be8b86fef14231b6f9b814d17d6ee6"/>
       </w:pPr>
       <w:r>
         <w:t>11.3 Matérias Reservadas [OPÇÃO – LISTA PERSONALIZÁVEL]: exigem aprovação por [2/3/maioria qualificada de 60–75%] e/ou veto de determinado Investidor, conforme Anexo A e, se aplicável, Acordo de Quotistas:</w:t>
       </w:r>
     </w:p>
-    <w:p pt14:Unid="f40126542aa8416e977663c2ec076343">
-      <w:pPr pt14:Unid="1f0bb9034a5f41298e9ffc4070864240">
-        <w:pStyle w:val="ListBullet" pt14:Unid="4f98474c83f44af5a72b71b25d9558ab"/>
-        <w:spacing w:after="120" w:line="288" w:lineRule="auto" pt14:Unid="1292c76bfbce4f81b1a3d81ea87eb5de"/>
-        <w:jc w:val="both" pt14:Unid="fcc5ad4a2034451d90203925d687d624"/>
+    <w:p pt14:Unid="23f840788f2b4911bae5fa0dc3c57272">
+      <w:pPr pt14:Unid="19f957ae0a23469d9e638144b91d5910">
+        <w:pStyle w:val="ListBullet" pt14:Unid="57c18de903314899ae02909d1af7b4f0"/>
+        <w:spacing w:after="120" w:line="288" w:lineRule="auto" pt14:Unid="2f1aa1d2ab5f42f8b00889ad77586638"/>
+        <w:jc w:val="both" pt14:Unid="d9997dfa4987458ca30eb8d449375fd8"/>
       </w:pPr>
       <w:r>
         <w:t>Alteração do Contrato Social; aumento/redução de capital; emissão de instrumentos conversíveis.</w:t>
       </w:r>
     </w:p>
-    <w:p pt14:Unid="681114c3721748e9b3dbd8e65931fbc2">
-      <w:pPr pt14:Unid="a34ab4898c214482a7b627eca8fa3ba5">
-        <w:pStyle w:val="ListBullet" pt14:Unid="1d112392f4e44af19d9ec284afb5ba59"/>
-        <w:spacing w:after="120" w:line="288" w:lineRule="auto" pt14:Unid="ab08536ef12b4e2992b1d4b3a38a93d1"/>
-        <w:jc w:val="both" pt14:Unid="321587c3e8354a408ff8225970e35ec9"/>
+    <w:p pt14:Unid="6127982f72184e63abfd5627e764d1e6">
+      <w:pPr pt14:Unid="8d1f58890135434899947e9ac00426a2">
+        <w:pStyle w:val="ListBullet" pt14:Unid="751c035a6eed41cbad99f6e8b4815fa6"/>
+        <w:spacing w:after="120" w:line="288" w:lineRule="auto" pt14:Unid="46fe751248f34131adb83590bdb49c1d"/>
+        <w:jc w:val="both" pt14:Unid="8e96afde7c2c492395eae54924260a6a"/>
       </w:pPr>
       <w:r>
         <w:t>M&amp;A, cisão, incorporação, venda de ativos relevantes ([&gt;20%] do ativo total), reorganização societária.</w:t>
       </w:r>
     </w:p>
-    <w:p pt14:Unid="0851839c0e28469294d547f0109d5574">
-      <w:pPr pt14:Unid="bc2349b41ad34814af96f91ec72675cb">
-        <w:pStyle w:val="ListBullet" pt14:Unid="8b7e7938aeef470a9cce4623682aa817"/>
-        <w:spacing w:after="120" w:line="288" w:lineRule="auto" pt14:Unid="db6ff262861b47ebaac99938969485d1"/>
-        <w:jc w:val="both" pt14:Unid="a53e3e5762844b45907d45669b86acd1"/>
+    <w:p pt14:Unid="e9a67f7eb00c4459b675fc69287eec8c">
+      <w:pPr pt14:Unid="7d630e7af9d14cfb9cd75373b20dc101">
+        <w:pStyle w:val="ListBullet" pt14:Unid="c1e74210de9242738de8b4096f190a9f"/>
+        <w:spacing w:after="120" w:line="288" w:lineRule="auto" pt14:Unid="ce59e82869244be8ae5378f8ed9bb191"/>
+        <w:jc w:val="both" pt14:Unid="b5e0c8f3f3d44d0cbf075fd869441c29"/>
       </w:pPr>
       <w:r>
         <w:t>Endividamento acima de [limite], concessão de garantias acima de [limite].</w:t>
       </w:r>
     </w:p>
-    <w:p pt14:Unid="3a413d6db109420ca659086738a7729b">
-      <w:pPr pt14:Unid="b4433407d2c14174b3b3daa4dcf357cd">
-        <w:pStyle w:val="ListBullet" pt14:Unid="7e566e9027574bfea5fd7f7865d635a6"/>
-        <w:spacing w:after="120" w:line="288" w:lineRule="auto" pt14:Unid="1053e38b6a9f408a9a6150f391e77a54"/>
-        <w:jc w:val="both" pt14:Unid="ea8cb673e972485289ade15c7f80cf93"/>
+    <w:p pt14:Unid="61cb17d0f4334b8db782e9de873fd793">
+      <w:pPr pt14:Unid="4bb01c98dfe94ee3b992371167032d21">
+        <w:pStyle w:val="ListBullet" pt14:Unid="9c4c5005c74b439bbe4877165b317044"/>
+        <w:spacing w:after="120" w:line="288" w:lineRule="auto" pt14:Unid="91524fdf946b4494ac4893929c5f3a7b"/>
+        <w:jc w:val="both" pt14:Unid="6ab2d27ad5564e64854ba185ebb2b13f"/>
       </w:pPr>
       <w:r>
         <w:t>Política de dividendos e constituição de reservas.</w:t>
       </w:r>
     </w:p>
-    <w:p pt14:Unid="4ce90f15ba74402584746b6db0818d9a">
-      <w:pPr pt14:Unid="66fdcca214fe47fcaf6020de72afa1dc">
-        <w:pStyle w:val="ListBullet" pt14:Unid="35067cad9880493c9ea94f364fac2f2e"/>
-        <w:spacing w:after="120" w:line="288" w:lineRule="auto" pt14:Unid="9b3254e7efe243eab5e8d546c0eae9ea"/>
-        <w:jc w:val="both" pt14:Unid="f0d7a128da704753b9420c94c75bbd21"/>
+    <w:p pt14:Unid="819acdaa72d2453198847f1b90e3e5bc">
+      <w:pPr pt14:Unid="1f5a33b069594b3896f99164f1781e4d">
+        <w:pStyle w:val="ListBullet" pt14:Unid="c40a8fb2d5dd4f589a75f78eadfcce4c"/>
+        <w:spacing w:after="120" w:line="288" w:lineRule="auto" pt14:Unid="0af324e4369844229964c75dc3d34576"/>
+        <w:jc w:val="both" pt14:Unid="9c5ff3bbf9ee4d99a8bb511b91367896"/>
       </w:pPr>
       <w:r>
         <w:t>Admissão de novo Sócio; exclusão de Sócio; compra de quotas pela Sociedade.</w:t>
       </w:r>
     </w:p>
-    <w:p pt14:Unid="aaf3a284b5f04c2396bafccff9334076">
-      <w:pPr pt14:Unid="7870712e485a4f4bbaf20f56a86e8c17">
-        <w:pStyle w:val="ListBullet" pt14:Unid="919b6df0413e45bfad7c76497c1d8d0e"/>
-        <w:spacing w:after="120" w:line="288" w:lineRule="auto" pt14:Unid="fc10294993a34ccb933127c67f8fe268"/>
-        <w:jc w:val="both" pt14:Unid="50238928be6b4d75aa6d4613ad68800b"/>
+    <w:p pt14:Unid="068819b769f447c79e10d501ed1427f7">
+      <w:pPr pt14:Unid="f3e8c3ff503b48339ed57c64d720e84a">
+        <w:pStyle w:val="ListBullet" pt14:Unid="cdef7c15d79744ac99900df4388f9e96"/>
+        <w:spacing w:after="120" w:line="288" w:lineRule="auto" pt14:Unid="a425b61570c544a2a56515606a539467"/>
+        <w:jc w:val="both" pt14:Unid="e01bbde4596c42a4ad7366e6040a6900"/>
       </w:pPr>
       <w:r>
         <w:t>Eleição/destituição de administradores; fixação de remuneração.</w:t>
       </w:r>
     </w:p>
-    <w:p pt14:Unid="4598f373ccdb438a9d31d730b20b8626">
-      <w:pPr pt14:Unid="f73734cdf2ae4f8b87cfdf4ac95dbd5f">
-        <w:pStyle w:val="ListBullet" pt14:Unid="77f3551204f747f08257615f9c73a9bd"/>
-        <w:spacing w:after="120" w:line="288" w:lineRule="auto" pt14:Unid="00f0bd6c1e944cd2a63c07d6c8b75b97"/>
-        <w:jc w:val="both" pt14:Unid="47d9f59f401f411fbfcb9120ace9a3a4"/>
+    <w:p pt14:Unid="171cdf8523a64b4dae5570bc691a191d">
+      <w:pPr pt14:Unid="f25b111a544b4a48a98639d848a7fd6e">
+        <w:pStyle w:val="ListBullet" pt14:Unid="f91674914349455aa029386eadb56ed0"/>
+        <w:spacing w:after="120" w:line="288" w:lineRule="auto" pt14:Unid="c2122b2b99564392b4e59a031ea1d2e4"/>
+        <w:jc w:val="both" pt14:Unid="2f7bd60d669940f588d91fffed4b4771"/>
       </w:pPr>
       <w:r>
         <w:t>Aprovação de orçamento anual e plano de negócios.</w:t>
       </w:r>
     </w:p>
-    <w:p pt14:Unid="d621232f122f4376bb58607b2cbc12c3">
-      <w:pPr pt14:Unid="2a930868da614987a19c4748b5924b06">
-        <w:pStyle w:val="ListBullet" pt14:Unid="49fc06ea852b4db2b06ddda84040f4c6"/>
-        <w:spacing w:after="120" w:line="288" w:lineRule="auto" pt14:Unid="59e64a0681e341798f5b4b1659e52c4f"/>
-        <w:jc w:val="both" pt14:Unid="b62a04956994403899b44264d5312899"/>
+    <w:p pt14:Unid="b8ec0af80f604a978f4db3221b85f8d1">
+      <w:pPr pt14:Unid="ccd3121da5214151937341d1fb297be4">
+        <w:pStyle w:val="ListBullet" pt14:Unid="6ed54d82be14465d8e9ed566f64748a3"/>
+        <w:spacing w:after="120" w:line="288" w:lineRule="auto" pt14:Unid="a4f3fb363b8f42f4bffd5aafefaf6158"/>
+        <w:jc w:val="both" pt14:Unid="476697feb7a54f1d89f030b3bc901028"/>
       </w:pPr>
       <w:r>
         <w:t>Opção por Arbitragem; celebração/alteração de Acordo de Quotistas.</w:t>
       </w:r>
     </w:p>
-    <w:p pt14:Unid="85b67d96703641b5a8e23521d2ab1dde">
-      <w:pPr pt14:Unid="de53dcb7bbb14faa9854213056fc4587">
-        <w:spacing w:after="120" w:line="288" w:lineRule="auto" pt14:Unid="88b66443dce045c89059ab491b528c5f"/>
-        <w:jc w:val="both" pt14:Unid="243f2f3225a340fda6a4148eb3402fac"/>
+    <w:p pt14:Unid="86d60dd177dd4672b4183edd029a70fc">
+      <w:pPr pt14:Unid="236a67bb92ee4051bccb1297c20c9a40">
+        <w:spacing w:after="120" w:line="288" w:lineRule="auto" pt14:Unid="eb0e903341f84367a5669ac6c8075c2e"/>
+        <w:jc w:val="both" pt14:Unid="2552b1e547004cbeac1e439068e5337f"/>
       </w:pPr>
       <w:r>
         <w:t>DIREITOS ECONÔMICOS E POLÍTICA DE RESULTADOS</w:t>
       </w:r>
     </w:p>
-    <w:p pt14:Unid="b7c832fe9a474de7b73ecf42a1e81c5d">
-      <w:pPr pt14:Unid="c9d7857a59164acba002ffcd776f37ec">
-        <w:spacing w:after="120" w:line="288" w:lineRule="auto" pt14:Unid="7d168ed211a3423c9c6d44ae99dbbd1c"/>
-        <w:jc w:val="both" pt14:Unid="5f2228ab65d849a6bb82a2da8e4108a3"/>
+    <w:p pt14:Unid="9c6629b58eda4ff0974e3bf0fbfab948">
+      <w:pPr pt14:Unid="d7c991f77a9e4c968a14d40ac8e9ff7d">
+        <w:spacing w:after="120" w:line="288" w:lineRule="auto" pt14:Unid="e1df55fa13444fa1b7f639231d1b3ccc"/>
+        <w:jc w:val="both" pt14:Unid="a5a12cadfb59406aa89a42298729f45a"/>
       </w:pPr>
       <w:r>
         <w:t>12.1 Participação nos lucros e perdas: Salvo estipulação diversa unânime, a distribuição de lucros observará a proporção das quotas (CC, arts. 997, VII; 1.007 e 1.008). É vedada a exclusão de Sócio de participar dos lucros. [OPÇÃO: distribuição diferenciada condicionada a metas/indicadores, respeitados os limites legais e a boa-fé.]</w:t>
       </w:r>
     </w:p>
-    <w:p pt14:Unid="82433dc626f840c6a9e864a63dd95160">
-      <w:pPr pt14:Unid="14bb91c52a0c4bfe906f5bc94fc90bb2">
-        <w:spacing w:after="120" w:line="288" w:lineRule="auto" pt14:Unid="22dd462af1554a048c12b37be9c797ff"/>
-        <w:jc w:val="both" pt14:Unid="894ce31132994632925b6d6bcdf259dd"/>
+    <w:p pt14:Unid="f4c9efe8b54044b9bf68563c66fe3eba">
+      <w:pPr pt14:Unid="1173e15a201e433bafddafc40f4abe06">
+        <w:spacing w:after="120" w:line="288" w:lineRule="auto" pt14:Unid="61a50490210842489a2840063ec07d82"/>
+        <w:jc w:val="both" pt14:Unid="846510703a344ae0bbfc287171acee60"/>
       </w:pPr>
       <w:r>
         <w:t>12.2 Lucros intermediários: Admitida distribuição de lucros com base em balanços/balancetes intermediários, observadas a legislação societária e fiscal, e a preservação da solvência.</w:t>
       </w:r>
     </w:p>
-    <w:p pt14:Unid="b5d66effe702411aa18a7622d6bf3242">
-      <w:pPr pt14:Unid="7e643dabcf5d41f3ae5aa2b65c5e7f4b">
-        <w:spacing w:after="120" w:line="288" w:lineRule="auto" pt14:Unid="cef7f8e09dac415ca9d3f1fdee56fc95"/>
-        <w:jc w:val="both" pt14:Unid="1f4f6ee034dd412ab4fcc414e556c7f4"/>
+    <w:p pt14:Unid="f5cadefd6e504c6ba6f88a813bee494d">
+      <w:pPr pt14:Unid="56f81205d60b48e6ae7bc5c0aa2b95d3">
+        <w:spacing w:after="120" w:line="288" w:lineRule="auto" pt14:Unid="f35d138cb8b64880960a2ecca9d539a4"/>
+        <w:jc w:val="both" pt14:Unid="78999a9b248c46cebf1a824d66b258a5"/>
       </w:pPr>
       <w:r>
         <w:t>12.3 Retenção de lucros: Permitida a retenção para reinvestimento, cobertura de perdas ou formação de reservas, mediante justificativa em orçamento/plano aprovado.</w:t>
       </w:r>
     </w:p>
-    <w:p pt14:Unid="5f3a2485ebbf4db8a0dce204a6bdc2ec">
-      <w:pPr pt14:Unid="24ecc695812f4a6a97788451d8556979">
-        <w:spacing w:after="120" w:line="288" w:lineRule="auto" pt14:Unid="e2585f36921b4f808ba0161afae78033"/>
-        <w:jc w:val="both" pt14:Unid="32609e1e63304ed89377820094e33dd2"/>
+    <w:p pt14:Unid="fc84cc21c2804ae7ba66e79e2bf89c42">
+      <w:pPr pt14:Unid="6f606b3bcbc64d5583fa0e754f5c6b09">
+        <w:spacing w:after="120" w:line="288" w:lineRule="auto" pt14:Unid="28ad8b4ccad843bb816d34f4bcf8e774"/>
+        <w:jc w:val="both" pt14:Unid="0b8a7921bc5b48e0b0fcb52fb3a39c0f"/>
       </w:pPr>
       <w:r>
         <w:t>12.4 Antidiluição [OPÇÃO – ON]:</w:t>
       </w:r>
     </w:p>
-    <w:p pt14:Unid="2a5c18592093449b83bdd4756721fed2">
-      <w:pPr pt14:Unid="99f0a795ceaa447ab8f8b6204034f55b">
-        <w:pStyle w:val="ListBullet" pt14:Unid="1742bb4fac9543848cf58a601c04989f"/>
-        <w:spacing w:after="120" w:line="288" w:lineRule="auto" pt14:Unid="6cee4fb1d6b74f3a88d394ce043285db"/>
-        <w:jc w:val="both" pt14:Unid="2f42a90795134912a2d2294bb898a04e"/>
+    <w:p pt14:Unid="c6f2964c5c5f4812abc65816833fa295">
+      <w:pPr pt14:Unid="071a5511a7914a80991c910950811e20">
+        <w:pStyle w:val="ListBullet" pt14:Unid="c4299da026e647c09b819db6fadd3042"/>
+        <w:spacing w:after="120" w:line="288" w:lineRule="auto" pt14:Unid="06ed4d8e486e4a3eabf702a7933be78a"/>
+        <w:jc w:val="both" pt14:Unid="609ee504bc2b4401b51121f7045058b1"/>
       </w:pPr>
       <w:r>
         <w:t>Weighted average: No aumento de capital por emissão a preço inferior ao preço de referência do Investidor, o Investidor terá direito a ajuste proporcional por fórmula de média ponderada definida no Anexo A.</w:t>
       </w:r>
     </w:p>
-    <w:p pt14:Unid="79b16445e0844a5da1db7b0ad23ff471">
-      <w:pPr pt14:Unid="ae76cf7ba9874f45945d21f8d993676b">
-        <w:pStyle w:val="ListBullet" pt14:Unid="58d16e87d1c140d8a5904df38b43f2ac"/>
-        <w:spacing w:after="120" w:line="288" w:lineRule="auto" pt14:Unid="1118e73b17194418923724566660d922"/>
-        <w:jc w:val="both" pt14:Unid="0d0b6fcbec30478a9163806f250e64e3"/>
+    <w:p pt14:Unid="574939a3146c43e9aa2c98623687f3bf">
+      <w:pPr pt14:Unid="ed0a1c3f2daf40629d0a0dafb4d5cac3">
+        <w:pStyle w:val="ListBullet" pt14:Unid="2963c4746a3b48b686016e2991841a48"/>
+        <w:spacing w:after="120" w:line="288" w:lineRule="auto" pt14:Unid="a7a7cd73d9dc42c985640517fe4645f5"/>
+        <w:jc w:val="both" pt14:Unid="fcb0cb2163cd48d8bffbaf4a36f0878e"/>
       </w:pPr>
       <w:r>
         <w:t>Full ratchet: Alternativamente, o Investidor poderá optar por ajuste integral (full ratchet), mediante emissão adicional de quotas, sujeita aos limites legais e quóruns aplicáveis. [NOTA DO REDATOR: Mecanismos de antidiluição devem ser compatibilizados com o regime de quotas da LTDA, preferencialmente por ajustes em aumentos de capital e direitos de subscrição; validar efeitos contábeis/registrários.]</w:t>
       </w:r>
     </w:p>
-    <w:p pt14:Unid="30488b03daba43bb9ad48f690abd3759">
-      <w:pPr pt14:Unid="822341c3190b4fbd8a1bab0207dbb050">
-        <w:spacing w:after="120" w:line="288" w:lineRule="auto" pt14:Unid="23c6bf14e4494abeb91fa1f6bf1f082d"/>
-        <w:jc w:val="both" pt14:Unid="18b9de0b79cd4703a194ffc20394cff1"/>
+    <w:p pt14:Unid="a26ee30f732e4d2883bc41ecf4a48b63">
+      <w:pPr pt14:Unid="d13178354f8e4998b1f7f7fe0abbc7d8">
+        <w:spacing w:after="120" w:line="288" w:lineRule="auto" pt14:Unid="78b6daa46b0443c1bc91947b4e691733"/>
+        <w:jc w:val="both" pt14:Unid="98a7ad712e264bffa9c1d617f54b5b32"/>
       </w:pPr>
       <w:r>
         <w:t>PROTEÇÕES A INVESTIDORES E MINORITÁRIOS</w:t>
       </w:r>
     </w:p>
-    <w:p pt14:Unid="3e1dbe4003d344a0a517ff64dd1db25e">
-      <w:pPr pt14:Unid="853a8b8cef434e03bf06df57464c15da">
-        <w:spacing w:after="120" w:line="288" w:lineRule="auto" pt14:Unid="6a20a0eee4434c1c9875af973ce82c5e"/>
-        <w:jc w:val="both" pt14:Unid="5c0b5dcc78a24bed9c4eb4e6bed3aab9"/>
+    <w:p pt14:Unid="9848ea6ff026499882df25a8a7e35bd5">
+      <w:pPr pt14:Unid="5b52726b1db44752955116ccd2b66661">
+        <w:spacing w:after="120" w:line="288" w:lineRule="auto" pt14:Unid="60a8b590a9ac48068a4f44976e433260"/>
+        <w:jc w:val="both" pt14:Unid="885250682a87496f84e959b4bcca65ac"/>
       </w:pPr>
       <w:r>
         <w:t>13.1 Direitos de informação: A Administração fornecerá aos Investidores: (i) demonstrações financeiras anuais [auditadas, se aplicável]; (ii) balancetes trimestrais; (iii) relatórios de gestão e KPIs; (iv) acesso aos livros e documentos, mediante aviso prévio de [5] dias.</w:t>
       </w:r>
     </w:p>
-    <w:p pt14:Unid="898c0a46feec4a9085a5c9bf983c9217">
-      <w:pPr pt14:Unid="e519ec25e75a4fd588c87f72e352cc4d">
-        <w:spacing w:after="120" w:line="288" w:lineRule="auto" pt14:Unid="61122385ee014bcdaa5b3ffe91910a69"/>
-        <w:jc w:val="both" pt14:Unid="cf57c14821a84de1aa8dbdf3ef520e84"/>
+    <w:p pt14:Unid="ddb5eaf029b84cce8de9424500488c4a">
+      <w:pPr pt14:Unid="a138b7c63e1e447ea74cf782fab8308a">
+        <w:spacing w:after="120" w:line="288" w:lineRule="auto" pt14:Unid="1a6483a9b24644f1b330089c5e4f5e33"/>
+        <w:jc w:val="both" pt14:Unid="776d0e8d3e21432ea7724a9512668a57"/>
       </w:pPr>
       <w:r>
         <w:t>13.2 Auditoria: Investidores poderão, às suas expensas, realizar auditorias financeiras/jurídicas com aviso prévio e sem perturbar as operações, respeitada a confidencialidade.</w:t>
       </w:r>
     </w:p>
-    <w:p pt14:Unid="185bf8d779e14fb9944feeb815d8e9e4">
-      <w:pPr pt14:Unid="24ddbc00b5e74ad8affc43adf51fe535">
-        <w:spacing w:after="120" w:line="288" w:lineRule="auto" pt14:Unid="ef48ee59aa9d4765bb21c4aad1adcc80"/>
-        <w:jc w:val="both" pt14:Unid="76d77cd9e65d49cf887a623530e7cf40"/>
+    <w:p pt14:Unid="5f437656e790442c9328c65542471aa4">
+      <w:pPr pt14:Unid="6344871151dd4f3ba61b35c777968e5d">
+        <w:spacing w:after="120" w:line="288" w:lineRule="auto" pt14:Unid="d832ba8640cf44ae9f4394e446667c97"/>
+        <w:jc w:val="both" pt14:Unid="799f1175f7214adfb7985b98d6d790d1"/>
       </w:pPr>
       <w:r>
         <w:t>13.3 MFN/pari passu [OPÇÃO – ON]: Qualquer direito econômico outorgado a novos investidores em condições mais favoráveis será estendido aos Investidores existentes que detenham cláusula MFN, mediante notificação.</w:t>
       </w:r>
     </w:p>
-    <w:p pt14:Unid="0e842b43ff244f88ada74469baebf4f4">
-      <w:pPr pt14:Unid="eb8ca77ca8ea4ae69a3d87d10839f6c4">
-        <w:spacing w:after="120" w:line="288" w:lineRule="auto" pt14:Unid="0d0ba43be455429fada86cfdbd551333"/>
-        <w:jc w:val="both" pt14:Unid="880e20fc2d8d4147b6d0c0c915392b12"/>
+    <w:p pt14:Unid="212a98c7d7644f7585a12dcaea8549be">
+      <w:pPr pt14:Unid="f05a91a9ad1944d5bca548480b6cdd50">
+        <w:spacing w:after="120" w:line="288" w:lineRule="auto" pt14:Unid="8a66b7deabe34e43bfe3c6900c977d8b"/>
+        <w:jc w:val="both" pt14:Unid="359c6a01a8c146f188b526f9c9684cad"/>
       </w:pPr>
       <w:r>
         <w:t>CONFLITOS DE INTERESSE E DEVERES FIDUCIÁRIOS</w:t>
       </w:r>
     </w:p>
-    <w:p pt14:Unid="a131465e3ae94e4b9138a626f8ec2e4d">
-      <w:pPr pt14:Unid="57556aa8ed14484b82a703b92417194e">
-        <w:spacing w:after="120" w:line="288" w:lineRule="auto" pt14:Unid="064f62fb657f403a9382f32c5fe1c25e"/>
-        <w:jc w:val="both" pt14:Unid="42a89ecfb6ef41479b453120fe2d4415"/>
+    <w:p pt14:Unid="dcc9dc28e934437398f9f035669c87af">
+      <w:pPr pt14:Unid="96c0cc1de53d4e76ad442e8fe6b6c5bb">
+        <w:spacing w:after="120" w:line="288" w:lineRule="auto" pt14:Unid="8fda34611c5b42fc9650ce75cbc26df8"/>
+        <w:jc w:val="both" pt14:Unid="541f6989e4be4bf2a19178302529a5ac"/>
       </w:pPr>
       <w:r>
         <w:t>14.1 Os administradores e Sócios comprometem-se a: (i) divulgar conflitos de interesse; (ii) abster-se de votar em matérias em que tenham interesse conflitante; (iii) observar os deveres de diligência e lealdade (CC, art. 1.011).</w:t>
       </w:r>
     </w:p>
-    <w:p pt14:Unid="1d4f370cd26a4f28b2a2938bb7f07b80">
-      <w:pPr pt14:Unid="ee58b4b846e74ab5aec0a9cfe43f4739">
-        <w:spacing w:after="120" w:line="288" w:lineRule="auto" pt14:Unid="9edc6bb571894a11b18eaa8715efcee9"/>
-        <w:jc w:val="both" pt14:Unid="c5d573a2687740ff91c4472ef0f6198e"/>
+    <w:p pt14:Unid="c6bd3629476848e2b4a4388527a8f112">
+      <w:pPr pt14:Unid="9730fa7ee550465cbafd4f5435482c40">
+        <w:spacing w:after="120" w:line="288" w:lineRule="auto" pt14:Unid="aac43c43fbfc492c8c8d01ba9354d2b8"/>
+        <w:jc w:val="both" pt14:Unid="afa51d3e90c749e5aef1c0554a6e0a5a"/>
       </w:pPr>
       <w:r>
         <w:t>14.2 Operações com partes relacionadas exigem aprovação por [maioria qualificada], em condições de mercado e com documentação adequada.</w:t>
       </w:r>
     </w:p>
-    <w:p pt14:Unid="6ea9f54f0502481aa0b1f1951edf4456">
-      <w:pPr pt14:Unid="d58101aa9ecd4e3e873cbe879620e30d">
-        <w:spacing w:after="120" w:line="288" w:lineRule="auto" pt14:Unid="ea6b3c8bf2174dd18766f91573b4ab6c"/>
-        <w:jc w:val="both" pt14:Unid="8d9e03cc514747348cdfc186486ba5fa"/>
+    <w:p pt14:Unid="8c8079624ca54025a106c7a79c3ad028">
+      <w:pPr pt14:Unid="9dd72d21e47b43539f6ca25d7a300bdb">
+        <w:spacing w:after="120" w:line="288" w:lineRule="auto" pt14:Unid="ec5182ded45e49d596fd15af9886d63e"/>
+        <w:jc w:val="both" pt14:Unid="c25e60fbeed844a3b62579d33375f019"/>
       </w:pPr>
       <w:r>
         <w:t>ADMISSÃO, RETIRADA E EXCLUSÃO DE SÓCIOS; HAVERES</w:t>
       </w:r>
     </w:p>
-    <w:p pt14:Unid="394d3646024b4017a79d1c6192815cd1">
-      <w:pPr pt14:Unid="0c3c05ec78fd4761a0c4e86cdb75ab29">
-        <w:spacing w:after="120" w:line="288" w:lineRule="auto" pt14:Unid="85b909059a044cadbdbed588379e5d97"/>
-        <w:jc w:val="both" pt14:Unid="7c237b4c815c4452850aec6990d70762"/>
+    <w:p pt14:Unid="d3a9cce05df649f0835317c5798d18f9">
+      <w:pPr pt14:Unid="7e9145c1d08f4db5be09253e1c369d70">
+        <w:spacing w:after="120" w:line="288" w:lineRule="auto" pt14:Unid="f195f388d8f4415cbd2d53617cfa6bb5"/>
+        <w:jc w:val="both" pt14:Unid="d09eb39a3c114f3d846bc379a68bdf8c"/>
       </w:pPr>
       <w:r>
         <w:t>15.1 Admissão de Sócio: Depende de deliberação nos termos da Cláusula 11 e adesão integral ao Contrato Social e Acordo de Quotistas, quando houver.</w:t>
       </w:r>
     </w:p>
-    <w:p pt14:Unid="2b255404e87247209d2c35b05db4281a">
-      <w:pPr pt14:Unid="fcff908168124e7ca8650b909e7bc1dc">
-        <w:spacing w:after="120" w:line="288" w:lineRule="auto" pt14:Unid="32158d0fe686410992915676147f78b9"/>
-        <w:jc w:val="both" pt14:Unid="db773a31184a47c7823cbf1a06c54987"/>
+    <w:p pt14:Unid="77403e422c844791a072568cd4e8b46a">
+      <w:pPr pt14:Unid="4af65a2d552444c586ce7046bd913455">
+        <w:spacing w:after="120" w:line="288" w:lineRule="auto" pt14:Unid="487318a6b68f4c6ba4469585040059e3"/>
+        <w:jc w:val="both" pt14:Unid="38e4477de2f94681822a0b82e888ba66"/>
       </w:pPr>
       <w:r>
         <w:t>15.2 Retirada/denúncia: O Sócio poderá retirar-se nas hipóteses legais, mediante notificação com [60] dias de antecedência, se por prazo indeterminado, ou nos casos previstos em lei/contrato, com apuração de haveres.</w:t>
       </w:r>
     </w:p>
-    <w:p pt14:Unid="01076398270e40509d188d3341e5f91f">
-      <w:pPr pt14:Unid="aa7fc241d4004a108a30035ffc850d2a">
-        <w:spacing w:after="120" w:line="288" w:lineRule="auto" pt14:Unid="559c45cbaeaa44a299cb02afb651621d"/>
-        <w:jc w:val="both" pt14:Unid="e5872e8cf90b4738b3788f02af0580dd"/>
+    <w:p pt14:Unid="ef52da9d23da435186896df9320b7b4d">
+      <w:pPr pt14:Unid="52d23e61658c42fc93645cb8a7e009aa">
+        <w:spacing w:after="120" w:line="288" w:lineRule="auto" pt14:Unid="95b1ced21b984293863a4871b2436a88"/>
+        <w:jc w:val="both" pt14:Unid="89d74b8424b040149771fc76a5475f26"/>
       </w:pPr>
       <w:r>
         <w:t>15.3 Exclusão por justa causa (CC, art. 1.085): Poderá ocorrer por deliberação de Sócios titulares de mais da metade do capital social, em reunião especialmente convocada, assegurados contraditório e ampla defesa, nas hipóteses de falta grave ou inegável incapacidade de cumprir suas obrigações.</w:t>
       </w:r>
     </w:p>
-    <w:p pt14:Unid="c68409f17deb4954b8a03ed92b9d17c6">
-      <w:pPr pt14:Unid="ab11bf7f1183428fb5dff8c332baca5a">
-        <w:spacing w:after="120" w:line="288" w:lineRule="auto" pt14:Unid="816e7e58dec04aa5a424c34bb51357ca"/>
-        <w:jc w:val="both" pt14:Unid="a34251d02f344522a9d77e57da569f57"/>
+    <w:p pt14:Unid="e8d6fb620bd541b4a8b654ad64c39427">
+      <w:pPr pt14:Unid="5fcfb87f6bd04ed181e56bfb1fdcbfe7">
+        <w:spacing w:after="120" w:line="288" w:lineRule="auto" pt14:Unid="0b12490a50fb4707b103a1cd27bc6fe5"/>
+        <w:jc w:val="both" pt14:Unid="88beb2eacdfc4703a0dff16e1cbd7e9f"/>
       </w:pPr>
       <w:r>
         <w:t>15.4 Apuração de haveres: Será apurada com base no valor econômico da Sociedade na data-base do evento (DCF/múltiplos/laudo independente), com ajustes de dívida líquida e capital de giro alvo, pagamento em até [X] parcelas mensais, corrigidas por [índice], com juros de [Y]% a.a., e garantia [se aplicável]. [NOTA: Alinhar com práticas contábeis e evitar conflito com regras fiscais.]</w:t>
       </w:r>
     </w:p>
-    <w:p pt14:Unid="9d92465813804cc7bab89c60647a81a6">
-      <w:pPr pt14:Unid="32cc20c4bb1340efa2e4e8dd9762ba35">
-        <w:spacing w:after="120" w:line="288" w:lineRule="auto" pt14:Unid="d9c46c31a7384259b6afb2f6050672dd"/>
-        <w:jc w:val="both" pt14:Unid="29bc71b0dcc6400cac19d0c6a76e71c1"/>
+    <w:p pt14:Unid="ad42e6d7875e4f018440497674ad5713">
+      <w:pPr pt14:Unid="c0c7391fc2a04f88a6241fff8bb0d012">
+        <w:spacing w:after="120" w:line="288" w:lineRule="auto" pt14:Unid="d5eb2d8213164025b8d9e2c0810a88b7"/>
+        <w:jc w:val="both" pt14:Unid="d4e838e740834a328939bdc254a6c8dd"/>
       </w:pPr>
       <w:r>
         <w:t>COMPLIANCE, CONFIDENCIALIDADE, PROTEÇÃO DE DADOS E PROPRIEDADE INTELECTUAL</w:t>
       </w:r>
     </w:p>
-    <w:p pt14:Unid="f3161a79c5794b3c8e3b592014b5c0eb">
-      <w:pPr pt14:Unid="bd7b8b432b094c609e200a705eda1ac8">
-        <w:spacing w:after="120" w:line="288" w:lineRule="auto" pt14:Unid="2c621e2cb1bc421eb130430f57292e86"/>
-        <w:jc w:val="both" pt14:Unid="e82960cff05546548495c07d9a1636c6"/>
+    <w:p pt14:Unid="66ae7a8a686d4fb8af9514cb6945e0f9">
+      <w:pPr pt14:Unid="c4c24844b9054d3c8218278e717bbf02">
+        <w:spacing w:after="120" w:line="288" w:lineRule="auto" pt14:Unid="6aaca992cc594407b2f87ed010729fca"/>
+        <w:jc w:val="both" pt14:Unid="b9d78e2e21ae49ea95a0527226381b4a"/>
       </w:pPr>
       <w:r>
         <w:t>16.1 Confidencialidade: Sócios e administradores manterão sigilo sobre informações confidenciais da Sociedade, por [5] anos após seu desligamento, exceto por exigência legal/regulatória ou autorização prévia.</w:t>
       </w:r>
     </w:p>
-    <w:p pt14:Unid="c716c325a58643548fecbee564de20df">
-      <w:pPr pt14:Unid="f63bc3235245476a9b37202240f8e5fd">
-        <w:spacing w:after="120" w:line="288" w:lineRule="auto" pt14:Unid="af1164554a934f85930ad0a74181ba1a"/>
-        <w:jc w:val="both" pt14:Unid="27af4494830347e88798baa975101abd"/>
+    <w:p pt14:Unid="7ff3ece4c76f4a1b9e939052f49d68d8">
+      <w:pPr pt14:Unid="f7befe719a244ed687756f3384791560">
+        <w:spacing w:after="120" w:line="288" w:lineRule="auto" pt14:Unid="4de190d6eef14ab191d100e45296994f"/>
+        <w:jc w:val="both" pt14:Unid="1dc61b3abc1649c1bf80ef02e7e07b94"/>
       </w:pPr>
       <w:r>
         <w:t>16.2 Anticorrupção: Os Sócios e a Administração observarão a Lei nº 12.846/2013 e o Decreto nº 11.129/2022, abstendo-se de práticas de corrupção, fraude a licitações, lavagem de dinheiro, ou outras ilícitas; sujeitam-se a auditorias e sanções internas em caso de violação.</w:t>
       </w:r>
     </w:p>
-    <w:p pt14:Unid="b6d37758ef6943ceb1938bb2ea3b1062">
-      <w:pPr pt14:Unid="903f2ae36e004648b4c518370ab1b275">
-        <w:spacing w:after="120" w:line="288" w:lineRule="auto" pt14:Unid="d35310b99986421188ede5cc31ca1541"/>
-        <w:jc w:val="both" pt14:Unid="80f79fa8f3ca4ff4800cfc842845314c"/>
+    <w:p pt14:Unid="b6de8fb28216470194fa381c353469cc">
+      <w:pPr pt14:Unid="f55bc9a525194e0f8b36ec8d84402ed7">
+        <w:spacing w:after="120" w:line="288" w:lineRule="auto" pt14:Unid="e4ceb60cd7504c4c9a575651b0115e1d"/>
+        <w:jc w:val="both" pt14:Unid="9341ccddc3b14cd79ed49b468a9a8ce7"/>
       </w:pPr>
       <w:r>
         <w:t>16.3 LGPD (Lei nº 13.709/2018):</w:t>
       </w:r>
     </w:p>
-    <w:p pt14:Unid="0634868c0bab4aecb36698825960c5b2">
-      <w:pPr pt14:Unid="12816ac686ee45e7be174028b9a239ab">
-        <w:pStyle w:val="ListBullet" pt14:Unid="ad433655ccd14c1b8404d384b1b64f38"/>
-        <w:spacing w:after="120" w:line="288" w:lineRule="auto" pt14:Unid="410e976b60454430a6694e2029bd52bb"/>
-        <w:jc w:val="both" pt14:Unid="ca321580d03e4507a46864729c7f1ff7"/>
+    <w:p pt14:Unid="a00bf66261be4fc5b017777257bba9d5">
+      <w:pPr pt14:Unid="b7e82219d8854ae78ca8e08fc262e6e8">
+        <w:pStyle w:val="ListBullet" pt14:Unid="d9d2157c558241a98bdefbce6134249d"/>
+        <w:spacing w:after="120" w:line="288" w:lineRule="auto" pt14:Unid="a77637525a8d421bbb0a90d850c6077e"/>
+        <w:jc w:val="both" pt14:Unid="a91328e96d484bf9a9bf7c3c53cb8642"/>
       </w:pPr>
       <w:r>
         <w:t>Papéis: [OPÇÃO] A Sociedade atuará como Controladora [e/ou Operadora] dos dados pessoais que tratar.</w:t>
       </w:r>
     </w:p>
-    <w:p pt14:Unid="d167f3a447654672b99c03de2f3ee76c">
-      <w:pPr pt14:Unid="fbc3ae0c19cb44798f928e6138712b23">
-        <w:pStyle w:val="ListBullet" pt14:Unid="78966192d7ca4a5983d28d7765e41a43"/>
-        <w:spacing w:after="120" w:line="288" w:lineRule="auto" pt14:Unid="c4b487cbdb6c4fa68d54eec596673e40"/>
-        <w:jc w:val="both" pt14:Unid="a896b54fcdfa4d79a2032cf98251d49c"/>
+    <w:p pt14:Unid="fbdd7f0e6d9d43858c5c312d7b75a170">
+      <w:pPr pt14:Unid="359d104444aa4b41b5dba4c2ee9b818b">
+        <w:pStyle w:val="ListBullet" pt14:Unid="fa350bb6939d44908bbcdcc849eb2c67"/>
+        <w:spacing w:after="120" w:line="288" w:lineRule="auto" pt14:Unid="a02a34a39630453691029ad593ca9f60"/>
+        <w:jc w:val="both" pt14:Unid="fbb568c6d1aa45efb688f03b0cbd21e1"/>
       </w:pPr>
       <w:r>
         <w:t>Bases legais: O tratamento observará as bases legais aplicáveis (execução de contrato, cumprimento de obrigação legal, legítimo interesse, consentimento, etc.).</w:t>
       </w:r>
     </w:p>
-    <w:p pt14:Unid="288d8a8fdd924d979c652f08d38b9ab8">
-      <w:pPr pt14:Unid="8c9c1ba678874bbaaf64e142c6773676">
-        <w:pStyle w:val="ListBullet" pt14:Unid="80c7e762eafd4bea883e52808122ad90"/>
-        <w:spacing w:after="120" w:line="288" w:lineRule="auto" pt14:Unid="d6935b3342494104a4c3b19e9d7a5645"/>
-        <w:jc w:val="both" pt14:Unid="7d9147613cbb48698b75c7edf3113fb9"/>
+    <w:p pt14:Unid="37e8eab7528d4b1c939bf2e70d14eb5b">
+      <w:pPr pt14:Unid="9a58966f267741ea9a4d248e62238342">
+        <w:pStyle w:val="ListBullet" pt14:Unid="0968c57abcdf44de96398d3640bdb9b9"/>
+        <w:spacing w:after="120" w:line="288" w:lineRule="auto" pt14:Unid="8c1b9830c06045859cd0b91dd6802b06"/>
+        <w:jc w:val="both" pt14:Unid="2e0b37662db941daafff276d83523c19"/>
       </w:pPr>
       <w:r>
         <w:t>Segurança: A Sociedade manterá medidas técnicas e organizacionais para proteção de dados, plano de resposta a incidentes, política de privacidade e registro de operações.</w:t>
       </w:r>
     </w:p>
-    <w:p pt14:Unid="a8e7946825864bf890adb131d6f659ab">
-      <w:pPr pt14:Unid="68adc11a01ed4feb90f64c06f406c8bc">
-        <w:pStyle w:val="ListBullet" pt14:Unid="800cfde31c814292a33ada0971f33b16"/>
-        <w:spacing w:after="120" w:line="288" w:lineRule="auto" pt14:Unid="b23f1de313a94294a08096ecee5d0f09"/>
-        <w:jc w:val="both" pt14:Unid="b9e0bad5fa3b44ba87524dd1f9300ac7"/>
+    <w:p pt14:Unid="757b85c54b1247ccb054465feb8300bb">
+      <w:pPr pt14:Unid="260c405a1a934cee8533199e0f30796d">
+        <w:pStyle w:val="ListBullet" pt14:Unid="8def96875454424d85380761efec15a5"/>
+        <w:spacing w:after="120" w:line="288" w:lineRule="auto" pt14:Unid="4728fee31a564a93b54cbb21682077c7"/>
+        <w:jc w:val="both" pt14:Unid="9c12c3ff962244cf8c50edc70ff09ce2"/>
       </w:pPr>
       <w:r>
         <w:t>DPO/Encarregado: [Nome/email], quando exigido por lei ou adotado voluntariamente.</w:t>
       </w:r>
     </w:p>
-    <w:p pt14:Unid="07f2bc4b328349af9d03c839c14c520e">
-      <w:pPr pt14:Unid="a2d5d391e1f04cd18eb7fd56b1c83939">
-        <w:pStyle w:val="ListBullet" pt14:Unid="3ad8e8f67f3c4d0b9bd9093a94b62985"/>
-        <w:spacing w:after="120" w:line="288" w:lineRule="auto" pt14:Unid="0be92e22239e45b7a072e61c0e5fc1e2"/>
-        <w:jc w:val="both" pt14:Unid="1218fbac28b04c8aab7ab26b10d8b7a7"/>
+    <w:p pt14:Unid="4be8ed3b6ab34c1796988863e2edd684">
+      <w:pPr pt14:Unid="5419a239e5624d99badff4c380dad7cd">
+        <w:pStyle w:val="ListBullet" pt14:Unid="022bbbd2e5814ebc8a2395a774e5448e"/>
+        <w:spacing w:after="120" w:line="288" w:lineRule="auto" pt14:Unid="ce10eaa018bb498e9ccf2c5262998ec9"/>
+        <w:jc w:val="both" pt14:Unid="6a30615b02514fcb8a5d733d6494a4a5"/>
       </w:pPr>
       <w:r>
         <w:t>Incidentes: Notificação à ANPD e titulares quando necessário; reporte aos Sócios relevante para a governança.</w:t>
       </w:r>
     </w:p>
-    <w:p pt14:Unid="bf6b77a865674a4eaf6b5f0008ba16e5">
-      <w:pPr pt14:Unid="20eb7d27893043e69962f83c5b9220c2">
-        <w:pStyle w:val="ListBullet" pt14:Unid="e98bff7050394568bbef4a4f0d2fd416"/>
-        <w:spacing w:after="120" w:line="288" w:lineRule="auto" pt14:Unid="c84aa657032044349f389bea6bf333ae"/>
-        <w:jc w:val="both" pt14:Unid="5b67de0844e0435aa20131106e2e450f"/>
+    <w:p pt14:Unid="8ab15148d9a94f2691177c97bbcd6194">
+      <w:pPr pt14:Unid="9477d3413481499795506df800712809">
+        <w:pStyle w:val="ListBullet" pt14:Unid="68afcda64d8444cdacc417a1bfb72bd7"/>
+        <w:spacing w:after="120" w:line="288" w:lineRule="auto" pt14:Unid="87ecea40bf2f402283235b28ce35c4c0"/>
+        <w:jc w:val="both" pt14:Unid="38df28a2d9554692be28633a22506507"/>
       </w:pPr>
       <w:r>
         <w:t>Contratos com terceiros: Cláusulas de proteção de dados e auditoria.</w:t>
       </w:r>
     </w:p>
-    <w:p pt14:Unid="5bb21f6831f5438e830f078fa819898b">
-      <w:pPr pt14:Unid="69dea387fbed43bdbd61ae6233b413ff">
-        <w:spacing w:after="120" w:line="288" w:lineRule="auto" pt14:Unid="2b2c4ce070504121ad5e0f4a9906c3ed"/>
-        <w:jc w:val="both" pt14:Unid="3f0cf19130264191a8d73671e5c1b731"/>
+    <w:p pt14:Unid="2546d32fc42c40b398f12aff78fb4306">
+      <w:pPr pt14:Unid="4cbdd825ec854b10a0ac7b269bb736ff">
+        <w:spacing w:after="120" w:line="288" w:lineRule="auto" pt14:Unid="05c4ab17dbbf464099673a9593d41c48"/>
+        <w:jc w:val="both" pt14:Unid="b21e711d04ea431fa8e516dcd80a8331"/>
       </w:pPr>
       <w:r>
         <w:t>16.4 Propriedade Intelectual:</w:t>
       </w:r>
     </w:p>
-    <w:p pt14:Unid="170aa47869d840258086e8a4528e6d53">
-      <w:pPr pt14:Unid="9d82441beae14099ad3b0a808e16414e">
-        <w:pStyle w:val="ListBullet" pt14:Unid="e3791b90c65e4cb7b5ad5a76fae90219"/>
-        <w:spacing w:after="120" w:line="288" w:lineRule="auto" pt14:Unid="cdc4b155f5034fcc81d2d5958e94216d"/>
-        <w:jc w:val="both" pt14:Unid="0056bd140de843838dea27fb488b0c1e"/>
+    <w:p pt14:Unid="8bb2e3ed90b8406d8a3d389ba4b664a4">
+      <w:pPr pt14:Unid="cd4fb13a47a042bd884095baf0b28247">
+        <w:pStyle w:val="ListBullet" pt14:Unid="85d1e652beb64d5698cad122e18c3d19"/>
+        <w:spacing w:after="120" w:line="288" w:lineRule="auto" pt14:Unid="7d94d27e53c3462ebf10e5d7aa291099"/>
+        <w:jc w:val="both" pt14:Unid="b5bad2737eeb45c9a1a4dfc486c3b5f9"/>
       </w:pPr>
       <w:r>
         <w:t>Titularidade: Pertencerá à Sociedade toda a PI desenvolvida por administradores, empregados, prestadores e Sócios no âmbito do objeto social e com recursos/sigilo da Sociedade, mediante cessão/licença apropriada.</w:t>
       </w:r>
     </w:p>
-    <w:p pt14:Unid="70bc68bc1cdc4860a87d0ce16252fd87">
-      <w:pPr pt14:Unid="1a3dcc943bea44d085bf10b01b0ccea2">
-        <w:pStyle w:val="ListBullet" pt14:Unid="8af0607dbc894299899d0b4da64d1580"/>
-        <w:spacing w:after="120" w:line="288" w:lineRule="auto" pt14:Unid="47a754cc182f4a5fa0062556a35587b0"/>
-        <w:jc w:val="both" pt14:Unid="3e8efebe9b524f4e9442ad9f62998400"/>
+    <w:p pt14:Unid="fdca2befd103472f816e7d6765bec9fb">
+      <w:pPr pt14:Unid="75566ceeecca4322bd2c57b296e33214">
+        <w:pStyle w:val="ListBullet" pt14:Unid="88859daa305e4e798cb8565169e24cec"/>
+        <w:spacing w:after="120" w:line="288" w:lineRule="auto" pt14:Unid="f3c9c041a61344d086852d288c8e9803"/>
+        <w:jc w:val="both" pt14:Unid="fb39af1a190e4b02a10dc024f5395a8c"/>
       </w:pPr>
       <w:r>
         <w:t>Registros: A Administração diligenciará os registros (INPI, software, marcas, patentes) e preservará segredos de negócio.</w:t>
       </w:r>
     </w:p>
-    <w:p pt14:Unid="5b4ff8e8dc3e443a96ec7becc8579fb4">
-      <w:pPr pt14:Unid="98abeefd294448988563dcde752852b1">
-        <w:pStyle w:val="ListBullet" pt14:Unid="157fc6e227704018a91c2a79363ae379"/>
-        <w:spacing w:after="120" w:line="288" w:lineRule="auto" pt14:Unid="dfad76e8c82f4907a3b488407d5eb80f"/>
-        <w:jc w:val="both" pt14:Unid="9ca4dc18c1bf440d9468f2f618b19155"/>
+    <w:p pt14:Unid="fefe661eae3a4efbb6a691f589bd3ee3">
+      <w:pPr pt14:Unid="4670a4aa194641f39bed0942ea6a92e0">
+        <w:pStyle w:val="ListBullet" pt14:Unid="83e9a3854b974e60bbb482f8917215bb"/>
+        <w:spacing w:after="120" w:line="288" w:lineRule="auto" pt14:Unid="c31b8a5e44ee40e08da740b4380795a6"/>
+        <w:jc w:val="both" pt14:Unid="c146ac28f30446189575df081cf73bce"/>
       </w:pPr>
       <w:r>
         <w:t>Garantias: Os Sócios declaram que ativos aportados não violam direitos de terceiros.</w:t>
       </w:r>
     </w:p>
-    <w:p pt14:Unid="836630d5e46d4f0d9d8ffc80d6bc5917">
-      <w:pPr pt14:Unid="8c6f522990944150b545c61145417f54">
-        <w:spacing w:after="120" w:line="288" w:lineRule="auto" pt14:Unid="a04bb2b87f53452e9cf64b9546e34e2d"/>
-        <w:jc w:val="both" pt14:Unid="d60321395f424aed949516f765e3d4aa"/>
+    <w:p pt14:Unid="aa0fa1aa2ecb486798d5f37ee51e9ec7">
+      <w:pPr pt14:Unid="a1b1fb44cc364c7c854289b075c2e3c0">
+        <w:spacing w:after="120" w:line="288" w:lineRule="auto" pt14:Unid="ea2ed7ce80374169b0852499051cb108"/>
+        <w:jc w:val="both" pt14:Unid="3a23742d01a4431c85783c572677e128"/>
       </w:pPr>
       <w:r>
         <w:t>NÃO CONCORRÊNCIA E NÃO ALICIAMENTO</w:t>
       </w:r>
     </w:p>
-    <w:p pt14:Unid="377cb6e8e0a5481aa4928baefeb24c07">
-      <w:pPr pt14:Unid="d339045b0c0d47939f917e6518be57a0">
-        <w:spacing w:after="120" w:line="288" w:lineRule="auto" pt14:Unid="c75da958631e4304b2b6814eb112b33f"/>
-        <w:jc w:val="both" pt14:Unid="4aef41c854a841eb85b9c7bff904713b"/>
+    <w:p pt14:Unid="cb587640dabc4de6a1aebc51f8293b44">
+      <w:pPr pt14:Unid="8beb8dede4c1417c9a7d9f06fc1be298">
+        <w:spacing w:after="120" w:line="288" w:lineRule="auto" pt14:Unid="bbefd4e3fac648d7b56d5227bc2109c9"/>
+        <w:jc w:val="both" pt14:Unid="9590b1ce33e047bf8a163d5d303939c0"/>
       </w:pPr>
       <w:r>
         <w:t>17.1 Não concorrência [OPÇÃO – ON]: Os Sócios e administradores obrigam-se a não exercer, direta ou indiretamente, atividades concorrentes com o objeto social, pelo prazo de [12–24] meses após o desligamento, no território [Brasil/regiões específicas], limitado ao escopo [definir], sob pena de multa de [R$]/[x%] do faturamento, além de perdas e danos. [NOTA DO REDATOR: Modular prazo/território/escopo para proporcionalidade; considerar compensação financeira para robustez; jurisprudência do STJ é cautelosa com vedações ilimitadas.]</w:t>
       </w:r>
     </w:p>
-    <w:p pt14:Unid="4645bcde8722464d87d5c95b13da0708">
-      <w:pPr pt14:Unid="bea6377b96f44bf2acff8255d81f03c8">
-        <w:spacing w:after="120" w:line="288" w:lineRule="auto" pt14:Unid="4231f930ff214fe5a3631f6f75227eb7"/>
-        <w:jc w:val="both" pt14:Unid="8ef8d871b9ce4dfabc2eb1817203d5f9"/>
+    <w:p pt14:Unid="5d768f73feea457e9c27f8c6b679afe7">
+      <w:pPr pt14:Unid="cfc04d210e2b4b93b53eb68e2d24941a">
+        <w:spacing w:after="120" w:line="288" w:lineRule="auto" pt14:Unid="3abe4f18b9464dc684650e4ddc3a9aad"/>
+        <w:jc w:val="both" pt14:Unid="98d58ad5ca1d4352860e331ccd52d363"/>
       </w:pPr>
       <w:r>
         <w:t>17.2 Não aliciamento: Vedado aliciar empregados, prestadores, clientes ou fornecedores estratégicos da Sociedade pelo prazo de [12–24] meses após o desligamento, sob pena de multa de [R$]/[x%] do valor do contrato aliciado.</w:t>
       </w:r>
     </w:p>
-    <w:p pt14:Unid="d208b2fd66754591b4c150a8ea8b6390">
-      <w:pPr pt14:Unid="5fcf020bd5364ad78852e276011ae992">
-        <w:spacing w:after="120" w:line="288" w:lineRule="auto" pt14:Unid="a86a6408961840e9857dafe5b1eabb8d"/>
-        <w:jc w:val="both" pt14:Unid="f5c42e44f37444fb85314bd5edfb2d82"/>
+    <w:p pt14:Unid="7a688cdab7764a0b93eaab55627d3b59">
+      <w:pPr pt14:Unid="5bfd1adf20ea4bbfb155fc5307750f96">
+        <w:spacing w:after="120" w:line="288" w:lineRule="auto" pt14:Unid="ea545c3e91a24d4eab5787abd79fb333"/>
+        <w:jc w:val="both" pt14:Unid="774a581322ed4bcb8293ab9fbf6fda29"/>
       </w:pPr>
       <w:r>
         <w:t>OPÇÕES DE COMPRA/VENDA; EVENTOS-GATILHO</w:t>
       </w:r>
     </w:p>
-    <w:p pt14:Unid="9d4cc6ab84ac47dc92363ebdfd2f1e36">
-      <w:pPr pt14:Unid="fabc7259b8e049ed8d428c15709a0382">
-        <w:spacing w:after="120" w:line="288" w:lineRule="auto" pt14:Unid="1084a8987df54adfab9dc05306d5ebac"/>
-        <w:jc w:val="both" pt14:Unid="0e34bb4136f642ab87dca12902df91c0"/>
+    <w:p pt14:Unid="fbbf8310964343f29c31540872f0e9c2">
+      <w:pPr pt14:Unid="eba8d0a7c3b44f8c9ddffe94d06b2906">
+        <w:spacing w:after="120" w:line="288" w:lineRule="auto" pt14:Unid="e451e39cddf24a93ad616cfda0bf27c8"/>
+        <w:jc w:val="both" pt14:Unid="8672c0a9b3d94c60b6cb8a522ab0789e"/>
       </w:pPr>
       <w:r>
         <w:t>18.1 Opções Put/Call: As partes poderão deter opções de compra e/ou venda de quotas (buy-sell) exercíveis em eventos-gatilho: morte, invalidez, desligamento (good/bad leaver), descumprimento de vesting/lock-up, mudança de controle, deadlock, violação material.</w:t>
       </w:r>
     </w:p>
-    <w:p pt14:Unid="8e5080aecc024ed6aa077b0b6372f723">
-      <w:pPr pt14:Unid="f6d4d02118d84d8a94ff4e16ecfffbe7">
-        <w:spacing w:after="120" w:line="288" w:lineRule="auto" pt14:Unid="0d13310a15cc413ab29cf1365994e457"/>
-        <w:jc w:val="both" pt14:Unid="7c324be376f74cc7ae5329db5da11be4"/>
+    <w:p pt14:Unid="c7fda9b3a83a4910a3e4505fb850332b">
+      <w:pPr pt14:Unid="d72ffc6f277e468fb4b2faf7ad10c6c2">
+        <w:spacing w:after="120" w:line="288" w:lineRule="auto" pt14:Unid="848941bc49064b42a6bf9c2bd6f33af7"/>
+        <w:jc w:val="both" pt14:Unid="277a506a9cc843fabee18803c06e3b4d"/>
       </w:pPr>
       <w:r>
         <w:t>18.2 Precificação: O preço será apurado por [múltiplos/DCF/laudo independente] com ajustes de dívida líquida e capital de giro alvo, e eventuais earn-outs atrelados a metas. Pagamento à vista ou parcelado, com garantias proporcionais.</w:t>
       </w:r>
     </w:p>
-    <w:p pt14:Unid="6b91d1f80b2b449ca2e7479b4171d980">
-      <w:pPr pt14:Unid="111213124207419c932f446d59a3d1c5">
-        <w:spacing w:after="120" w:line="288" w:lineRule="auto" pt14:Unid="5255ef1cff1f4a82ba04f2a9b389541e"/>
-        <w:jc w:val="both" pt14:Unid="9948d0d16ef4423bad8c0a6ba8916d20"/>
+    <w:p pt14:Unid="1211fe1b493046d89f0aef2c099d3dca">
+      <w:pPr pt14:Unid="005e281f83da49e792b402ecf884ac39">
+        <w:spacing w:after="120" w:line="288" w:lineRule="auto" pt14:Unid="314cb055ed88424ea7dd8762c29597eb"/>
+        <w:jc w:val="both" pt14:Unid="0bf12bb250c8487b87790110304a5e73"/>
       </w:pPr>
       <w:r>
         <w:t>18.3 Shotgun/Russian roulette [OPÇÃO – ON]: Em impasse (deadlock) definido na Cláusula 19.1, qualquer Sócio poderá ofertar preço por 100% das quotas do outro; o destinatário deverá, no prazo de [30] dias, optar por comprar ou vender pelo mesmo preço/condições.</w:t>
       </w:r>
     </w:p>
-    <w:p pt14:Unid="92e79e15737c4ca893b1c6bfbc58709a">
-      <w:pPr pt14:Unid="5bd815ed52c14a1c990dd6a4fa1f918c">
-        <w:spacing w:after="120" w:line="288" w:lineRule="auto" pt14:Unid="60ab896460304529b5bc8a783fabf89d"/>
-        <w:jc w:val="both" pt14:Unid="3d6f3e07a0da40b89c5dd9fcd0f322e9"/>
+    <w:p pt14:Unid="e3baa9c03d274752b1dcd6cedd624b26">
+      <w:pPr pt14:Unid="9f077bd3b89f4e599b1c66bce6e7f8da">
+        <w:spacing w:after="120" w:line="288" w:lineRule="auto" pt14:Unid="8e9c341cd16345c2ae234bb0f8731d85"/>
+        <w:jc w:val="both" pt14:Unid="6f14283480474a8f9f509aa62671e6d0"/>
       </w:pPr>
       <w:r>
         <w:t>18.4 Texas shoot-out [OPÇÃO – ON]: Alternativamente, as partes apresentarão propostas seladas de compra por 100% das quotas do outro; a maior proposta vence, adquirindo as quotas pelo preço ofertado.</w:t>
       </w:r>
     </w:p>
-    <w:p pt14:Unid="863d84be85454a0a9318569578ef626b">
-      <w:pPr pt14:Unid="897ce7c11a684104a147896dde63021e">
-        <w:spacing w:after="120" w:line="288" w:lineRule="auto" pt14:Unid="1cdec53b0a3a4d5d95e9f70eb878ec8c"/>
-        <w:jc w:val="both" pt14:Unid="d03a385872f347839cb733e5838132e9"/>
+    <w:p pt14:Unid="6d03bc9130f144e48c68823bd0fba5c1">
+      <w:pPr pt14:Unid="f775bff5c2a8480487970b25c45f615e">
+        <w:spacing w:after="120" w:line="288" w:lineRule="auto" pt14:Unid="612d892e5ebc484da0a1efc9e6191150"/>
+        <w:jc w:val="both" pt14:Unid="50715a9a3e04405db942bc593d84bc21"/>
       </w:pPr>
       <w:r>
         <w:t>DEADLOCK E RESOLUÇÃO DE DISPUTAS ENTRE SÓCIOS</w:t>
       </w:r>
     </w:p>
-    <w:p pt14:Unid="bb371a4a6c2f44bdbe5118fc226cf0cd">
-      <w:pPr pt14:Unid="5fd1d332686042a2b4eb6081f4e78be1">
-        <w:spacing w:after="120" w:line="288" w:lineRule="auto" pt14:Unid="9d75139ff3474b439580dcc7b30b2238"/>
-        <w:jc w:val="both" pt14:Unid="6ad71982102c41d091fc562c3c28953b"/>
+    <w:p pt14:Unid="d66780d01677421586caab07579d5409">
+      <w:pPr pt14:Unid="70192f8a362244f4ba56599143c4c059">
+        <w:spacing w:after="120" w:line="288" w:lineRule="auto" pt14:Unid="23eff435beea4dce89d5f112fae5abed"/>
+        <w:jc w:val="both" pt14:Unid="59b80c393b9f4c7ba5f27f219b727dc1"/>
       </w:pPr>
       <w:r>
         <w:t>19.1 Deadlock: Considera-se impasse a ausência de decisão sobre Matéria Reservada após [2] reuniões válidas no prazo de [30] dias. Escalonamento:</w:t>
       </w:r>
     </w:p>
-    <w:p pt14:Unid="ae57a4dd94174d228327d7291d453373">
-      <w:pPr pt14:Unid="d9cc8d233c8345e69b7b9bcac126f0cc">
-        <w:pStyle w:val="ListBullet" pt14:Unid="03e797aef68647f6b739a5780cf335d9"/>
-        <w:spacing w:after="120" w:line="288" w:lineRule="auto" pt14:Unid="a40ad76100da4179a3963b1cd4465c37"/>
-        <w:jc w:val="both" pt14:Unid="34936507530d43739885859a6b35acb9"/>
+    <w:p pt14:Unid="6e78662bb7a4428cb6ae7b666103b8c0">
+      <w:pPr pt14:Unid="d02755dfd80141c0bd9a54bb3347ca5d">
+        <w:pStyle w:val="ListBullet" pt14:Unid="b2dd5d8233284ea39ea635af09bb26da"/>
+        <w:spacing w:after="120" w:line="288" w:lineRule="auto" pt14:Unid="c30f8e941f6c462699e159b9bf3094ef"/>
+        <w:jc w:val="both" pt14:Unid="9acece79ec124c779cdaa759f974bcd8"/>
       </w:pPr>
       <w:r>
         <w:t>Etapa 1: Mesa de Sócios e Administradores em até [10] dias.</w:t>
       </w:r>
     </w:p>
-    <w:p pt14:Unid="39a59e58524d401e97ef16555a64ef6a">
-      <w:pPr pt14:Unid="fc89ed4c19bf4622837533818c3898d5">
-        <w:pStyle w:val="ListBullet" pt14:Unid="7673fe8116144bf18c0b389afa3c6133"/>
-        <w:spacing w:after="120" w:line="288" w:lineRule="auto" pt14:Unid="7126c7c7a94a4909b1e4588362376eea"/>
-        <w:jc w:val="both" pt14:Unid="f8c444787b5e451bb6fe5a481dcbcda2"/>
+    <w:p pt14:Unid="fd3ae1203b8e4e15ac7287150b2b78ed">
+      <w:pPr pt14:Unid="1eb0520fc3914582b878d2ff6cb121b7">
+        <w:pStyle w:val="ListBullet" pt14:Unid="a064586508404a958ce8bcbb7a00b206"/>
+        <w:spacing w:after="120" w:line="288" w:lineRule="auto" pt14:Unid="5dd245560cae4a87adc38b528d63ee41"/>
+        <w:jc w:val="both" pt14:Unid="fbfb361ffc604d3c906538e65fec0e38"/>
       </w:pPr>
       <w:r>
         <w:t>Etapa 2: Mediação institucional [Câmara escolhida] por [30] dias.</w:t>
       </w:r>
     </w:p>
-    <w:p pt14:Unid="1e0f2768fe2746a996e1b57ca4d01265">
-      <w:pPr pt14:Unid="e414b10c586a4f1694a360353eb2daa5">
-        <w:pStyle w:val="ListBullet" pt14:Unid="f0505219215d4f44a1b6062d9c3c8f18"/>
-        <w:spacing w:after="120" w:line="288" w:lineRule="auto" pt14:Unid="bf316fb7424e456c8a0b3cfeaeaf7cfd"/>
-        <w:jc w:val="both" pt14:Unid="52823053dafd4ed7b97a88e5be27bf94"/>
+    <w:p pt14:Unid="eee197265b9f41479f470932c116cce9">
+      <w:pPr pt14:Unid="8b812788cf8749989cf63bc8bdb4e03e">
+        <w:pStyle w:val="ListBullet" pt14:Unid="4041fc0464df4875a8e6916a0d0a747a"/>
+        <w:spacing w:after="120" w:line="288" w:lineRule="auto" pt14:Unid="5fe926fd63814bcfa3e00d5c4d87cf9a"/>
+        <w:jc w:val="both" pt14:Unid="acad07c22dbb46e48cd27bced265f4ca"/>
       </w:pPr>
       <w:r>
         <w:t>Etapa 3: Mecanismo de buy-sell (Russian roulette/Texas shoot-out) conforme Cláusula 18 ou Arbitragem conforme Cláusula 20.</w:t>
       </w:r>
     </w:p>
-    <w:p pt14:Unid="6493a44a99994ee7895a1480499d6653">
-      <w:pPr pt14:Unid="9e13cf4f45204fc989a5e5c9e0d2695b">
-        <w:spacing w:after="120" w:line="288" w:lineRule="auto" pt14:Unid="881635e6e79e4dc6a76f81e21b28f77e"/>
-        <w:jc w:val="both" pt14:Unid="0d3db27127b0445ab785de3019e3f214"/>
+    <w:p pt14:Unid="f955cc2f456c442eb5e6d5fcfc308ff1">
+      <w:pPr pt14:Unid="49a3d9ac15994e03a42349166d969d73">
+        <w:spacing w:after="120" w:line="288" w:lineRule="auto" pt14:Unid="f1852e98e94b46cd92d137877327504a"/>
+        <w:jc w:val="both" pt14:Unid="fcd2f3be786941d2b2b2805fb0ccc9a4"/>
       </w:pPr>
       <w:r>
         <w:t>ARBITRAGEM, LEI APLICÁVEL E FORO</w:t>
       </w:r>
     </w:p>
-    <w:p pt14:Unid="8521d566ea894d6aa290cbf027d1d728">
-      <w:pPr pt14:Unid="4c7994185e4a47318188bf8e71262210">
-        <w:spacing w:after="120" w:line="288" w:lineRule="auto" pt14:Unid="2d9e0b242a034e5ebbf0185a4ff3df87"/>
-        <w:jc w:val="both" pt14:Unid="0f467c95f22648afbe302a4d5c0fb4bc"/>
+    <w:p pt14:Unid="edd4465e9a2d4de3a1c0711dcdf16325">
+      <w:pPr pt14:Unid="7a1070582b1340f9bf065302d3e14784">
+        <w:spacing w:after="120" w:line="288" w:lineRule="auto" pt14:Unid="496846fa56d74753a1b58ab9a2a20854"/>
+        <w:jc w:val="both" pt14:Unid="362e60f4e86b4a1b953b3afca746fb75"/>
       </w:pPr>
       <w:r>
         <w:t>20.1 Lei aplicável: Lei brasileira.</w:t>
       </w:r>
     </w:p>
-    <w:p pt14:Unid="bbddf46bc9724109ac01263ebba2020b">
-      <w:pPr pt14:Unid="66abbe88db364e2daa57cff542b55ac6">
-        <w:spacing w:after="120" w:line="288" w:lineRule="auto" pt14:Unid="2cad175fddc049a49fabb223a52081f8"/>
-        <w:jc w:val="both" pt14:Unid="a2258781af674cd09d726c68101768b5"/>
+    <w:p pt14:Unid="a76ab7895fa4489c93cb5d81a88d70ed">
+      <w:pPr pt14:Unid="f5354d65163645c788d902dc1aabb8f7">
+        <w:spacing w:after="120" w:line="288" w:lineRule="auto" pt14:Unid="07f22559addc4ed7855a43caa19f0601"/>
+        <w:jc w:val="both" pt14:Unid="d580227a63d64fdebca29d50ae33a4e8"/>
       </w:pPr>
       <w:r>
         <w:t>20.2 Arbitragem [OPÇÃO A – ON]: Qualquer disputa oriunda deste Contrato Social será definitivamente resolvida por arbitragem, administrada pela [CAM-CCBC/CAM-B3/CBMA], nos termos de seu Regulamento, por [1 ou 3] árbitro(s), com sede em [Cidade/UF], língua portuguesa, confidencial, aplicando-se a lei brasileira. Medidas de urgência poderão ser requeridas ao árbitro de emergência ou ao Poder Judiciário, sem caracterizar renúncia à arbitragem. A competência do tribunal arbitral para dirimir a própria competência é reconhecida. 20.3 Foro estatal [OPÇÃO B – OFF]: Na ausência de arbitragem, as partes elegem o foro da Comarca de [Cidade/UF], com renúncia a qualquer outro, por mais privilegiado que seja.</w:t>
       </w:r>
     </w:p>
-    <w:p pt14:Unid="fc5dff67ac824a3fb3be856d8ebf76f1">
-      <w:pPr pt14:Unid="531f87aa4d41400d812fbe71eea5f939">
-        <w:spacing w:after="120" w:line="288" w:lineRule="auto" pt14:Unid="7dc34284ef8841eb95073a85320a59a7"/>
-        <w:jc w:val="both" pt14:Unid="bd8e427e691e4b89a6b2b02874ae80a1"/>
+    <w:p pt14:Unid="de98ae0f26814300b5c97412f8f83642">
+      <w:pPr pt14:Unid="eac7fbcf4abd4986badaad4bb7cb4cf6">
+        <w:spacing w:after="120" w:line="288" w:lineRule="auto" pt14:Unid="96aed548ddff4aa98764127acdfb3e5b"/>
+        <w:jc w:val="both" pt14:Unid="f15e727370c2491ca4c5e9709d7ab4cd"/>
       </w:pPr>
       <w:r>
         <w:t>RESPONSABILIDADES, GARANTIAS, LIMITAÇÕES E INDENIZAÇÃO</w:t>
       </w:r>
     </w:p>
-    <w:p pt14:Unid="9a7f4c36e25f404380ae148ea28b070c">
-      <w:pPr pt14:Unid="e9bc3fa2433743fdb58a25808c3c0191">
-        <w:spacing w:after="120" w:line="288" w:lineRule="auto" pt14:Unid="2e106e5e567a4e51a1f50890ca22bb90"/>
-        <w:jc w:val="both" pt14:Unid="da70ba7a2d0d483983810ea0936e4a08"/>
+    <w:p pt14:Unid="79fb1ef6ebd9431a9f3b4871473523ce">
+      <w:pPr pt14:Unid="8cc38653e25f4edf81df001573de18ac">
+        <w:spacing w:after="120" w:line="288" w:lineRule="auto" pt14:Unid="48ac889a83774cd5a950d46321538e8c"/>
+        <w:jc w:val="both" pt14:Unid="714242331a084c70a7c2de4cf6ae386f"/>
       </w:pPr>
       <w:r>
         <w:t>21.1 Cada Sócio declara ter capacidade e poderes para a celebração deste Contrato, inexistindo impedimentos legais.</w:t>
       </w:r>
     </w:p>
-    <w:p pt14:Unid="e76dacad75ad4c76a596d75d3c45007d">
-      <w:pPr pt14:Unid="d1823a961f8045e2a48bbeba61458d01">
-        <w:spacing w:after="120" w:line="288" w:lineRule="auto" pt14:Unid="f494b781c3b6433581dad4b7e67ef960"/>
-        <w:jc w:val="both" pt14:Unid="6e82c72611cf422e826ba0bae685df4f"/>
+    <w:p pt14:Unid="b61d1d4958554a5d87d8ae24e969fb55">
+      <w:pPr pt14:Unid="634ddcff4622444fb21de99b64984ffa">
+        <w:spacing w:after="120" w:line="288" w:lineRule="auto" pt14:Unid="33d1c8d499d8483881db105abb1ebc72"/>
+        <w:jc w:val="both" pt14:Unid="ece201118d46489aba5b308196dcd480"/>
       </w:pPr>
       <w:r>
         <w:t>21.2 Limitação de responsabilidade: A responsabilidade de cada Sócio limita-se ao valor de suas quotas, mas todos respondem solidariamente pela integralização do capital (CC, art. 1.052).</w:t>
       </w:r>
     </w:p>
-    <w:p pt14:Unid="11e20ac76ee34ed78e5b4574948530e2">
-      <w:pPr pt14:Unid="25bdbdef3f204dd4bd66202c8191edac">
-        <w:spacing w:after="120" w:line="288" w:lineRule="auto" pt14:Unid="08e2b8b3598340728bff76d1367c6bac"/>
-        <w:jc w:val="both" pt14:Unid="d0ff2e61c12b41abb24d5437b9f3c224"/>
+    <w:p pt14:Unid="074e0fc391034cfeb24eec14c10f9051">
+      <w:pPr pt14:Unid="d1e54d1b14cd4db5b28f2fb7cba2efec">
+        <w:spacing w:after="120" w:line="288" w:lineRule="auto" pt14:Unid="b1ece3ddc2c54945a52684ac6f5e60e7"/>
+        <w:jc w:val="both" pt14:Unid="6dc09d8f407c476792a25ff510edffc5"/>
       </w:pPr>
       <w:r>
         <w:t>21.3 Indenização: O Sócio/Administrador que causar dano à Sociedade ou a terceiros por ação/omissão culposa ou dolosa responderá por perdas e danos, podendo a Sociedade ajuizar medidas regressivas.</w:t>
       </w:r>
     </w:p>
-    <w:p pt14:Unid="8be4d290db704006a63564f975bdbff4">
-      <w:pPr pt14:Unid="918d467d1e104566b864ae9c44ccee75">
-        <w:spacing w:after="120" w:line="288" w:lineRule="auto" pt14:Unid="b05b5ead8c85424ab4c2e4ef3d8a7ad8"/>
-        <w:jc w:val="both" pt14:Unid="7d6ad839925248688f6ae0f034c85b0e"/>
+    <w:p pt14:Unid="1f472cb6172b4718a2e26c02cc909d8a">
+      <w:pPr pt14:Unid="df492f59c0c94b03a3bf4aa255d5edc7">
+        <w:spacing w:after="120" w:line="288" w:lineRule="auto" pt14:Unid="65ec035386b940f4b29a8cad2cc2ac72"/>
+        <w:jc w:val="both" pt14:Unid="4497056e5e704b0ea8d98c556a85dcec"/>
       </w:pPr>
       <w:r>
         <w:t>21.4 Exclusão de danos indiretos: Ficam excluídos lucros cessantes, danos consequenciais e punitivos, salvo dolo ou disposição legal específica.</w:t>
       </w:r>
     </w:p>
-    <w:p pt14:Unid="90e2b3be67b04d91bfefbfc2bf6a9dad">
-      <w:pPr pt14:Unid="c3df741aa8ee46959c69cee6a6b514b3">
-        <w:spacing w:after="120" w:line="288" w:lineRule="auto" pt14:Unid="68dd8b4709ce42789d4041214262d0ad"/>
-        <w:jc w:val="both" pt14:Unid="446e65e091704da3abbf92ffc3ad42f8"/>
+    <w:p pt14:Unid="d44716b04110493ba85ce34ef4e68df5">
+      <w:pPr pt14:Unid="13ce448b8b8e4561a1792a62c14ded51">
+        <w:spacing w:after="120" w:line="288" w:lineRule="auto" pt14:Unid="68afbaa3e34a499ba43071af189fa4f3"/>
+        <w:jc w:val="both" pt14:Unid="10d6ca3f663b4d278079a9dcd56c6697"/>
       </w:pPr>
       <w:r>
         <w:t>DURAÇÃO, EFEITOS E ENCERRAMENTO</w:t>
       </w:r>
     </w:p>
-    <w:p pt14:Unid="799b30bfa2114d249d54fefd8f49132e">
-      <w:pPr pt14:Unid="bf6b4cf3418741c3bea154bb4b75e122">
-        <w:spacing w:after="120" w:line="288" w:lineRule="auto" pt14:Unid="1fadc1ca178d4d8d93b56e63e13338fb"/>
-        <w:jc w:val="both" pt14:Unid="deb2c482c2e54a6ab01dc310d6d66019"/>
+    <w:p pt14:Unid="d2afed9b64ae4d6b96cb3652c62fc252">
+      <w:pPr pt14:Unid="edabfc571d66428581ad848d1467bf9a">
+        <w:spacing w:after="120" w:line="288" w:lineRule="auto" pt14:Unid="9c4fbdf39f80442498e1d8c8ff0b9a88"/>
+        <w:jc w:val="both" pt14:Unid="20fb205e04954f58821b1e51cf6c0629"/>
       </w:pPr>
       <w:r>
         <w:t>22.1 Este Contrato vigerá a partir de sua assinatura, produzindo efeitos entre as partes, e perante terceiros após arquivamento na Junta Comercial competente (IN DREI 81/2020).</w:t>
       </w:r>
     </w:p>
-    <w:p pt14:Unid="694b7bd852234a3980272f0e0b3a58f1">
-      <w:pPr pt14:Unid="878abf702fac45e9a3dde5486a3c7eaf">
-        <w:spacing w:after="120" w:line="288" w:lineRule="auto" pt14:Unid="980ef3a1588143d7896854a1cae7b5cf"/>
-        <w:jc w:val="both" pt14:Unid="dfa3909c62264b6db4ebca55c0b1a19f"/>
+    <w:p pt14:Unid="9e81547b0326475e8cea951c3e75e891">
+      <w:pPr pt14:Unid="c400be1b8f454610b3c92a6f077aa871">
+        <w:spacing w:after="120" w:line="288" w:lineRule="auto" pt14:Unid="8bc8ffb33ce2473c8f16d37d0e59c344"/>
+        <w:jc w:val="both" pt14:Unid="501e7bfa2b364ba087c94c9e27b95567"/>
       </w:pPr>
       <w:r>
         <w:t>22.2 Na dissolução, proceder-se-á à liquidação, pagamento de obrigações, partilha de haveres e baixa nos registros competentes.</w:t>
       </w:r>
     </w:p>
-    <w:p pt14:Unid="1d868227f4914f528ff711351b761855">
-      <w:pPr pt14:Unid="91a384086b7843bbaff6db0c5254dad1">
-        <w:spacing w:after="120" w:line="288" w:lineRule="auto" pt14:Unid="3dbff78b82d74a37acd1c8578ceaae4c"/>
-        <w:jc w:val="both" pt14:Unid="ef71882805d144fb846901084773b11b"/>
+    <w:p pt14:Unid="f60b14fed3b34f5e85fc20b583510b73">
+      <w:pPr pt14:Unid="7613d5ba563c426db4d4c15199170cf2">
+        <w:spacing w:after="120" w:line="288" w:lineRule="auto" pt14:Unid="7657141fedf14408b0959d33d48b913b"/>
+        <w:jc w:val="both" pt14:Unid="e58bf0cb3c6c45baac5d9cfc2eb6522f"/>
       </w:pPr>
       <w:r>
         <w:t>COMUNICAÇÕES, ALTERAÇÕES E DISPOSIÇÕES GERAIS</w:t>
       </w:r>
     </w:p>
-    <w:p pt14:Unid="7684fe9202a64a5d9e828f5385aca276">
-      <w:pPr pt14:Unid="bedb97b649e649c4825374460a6df377">
-        <w:spacing w:after="120" w:line="288" w:lineRule="auto" pt14:Unid="aee0db513ccb4a53a48b40d0b14c69f5"/>
-        <w:jc w:val="both" pt14:Unid="25c5b6300a0f46c2a12b0eb13000f1ff"/>
+    <w:p pt14:Unid="65e6bbda4788435bbf3d6b2e4b3d6a35">
+      <w:pPr pt14:Unid="7d073ffe1a1845b4accc0ce4ea9ce14b">
+        <w:spacing w:after="120" w:line="288" w:lineRule="auto" pt14:Unid="39273afff3194ee9b274607c87ff145a"/>
+        <w:jc w:val="both" pt14:Unid="d9f25f8b24874c5ab6da3589d1aaefb2"/>
       </w:pPr>
       <w:r>
         <w:t>23.1 Comunicações: Serão consideradas válidas as notificações enviadas por escrito para os endereços físicos e eletrônicos constantes deste Contrato, inclusive via e-mail [endereços], com confirmação de leitura/recebimento, admitidos meios eletrônicos.</w:t>
       </w:r>
     </w:p>
-    <w:p pt14:Unid="6e9e0ffcead7476cb5205b8162a481c8">
-      <w:pPr pt14:Unid="5a4d27586f234dddb591fa1e5c15eff0">
-        <w:spacing w:after="120" w:line="288" w:lineRule="auto" pt14:Unid="89e829127a8e40f7b8648e79181df4dc"/>
-        <w:jc w:val="both" pt14:Unid="9b92595fdacc4d9d8982c883abb404a1"/>
+    <w:p pt14:Unid="4b4acbd454324a78aead1fd4ebaaead3">
+      <w:pPr pt14:Unid="2a8f4c4f354e4d0a987d12616d103221">
+        <w:spacing w:after="120" w:line="288" w:lineRule="auto" pt14:Unid="ce2e3093dac84641af6a2b9b118b2307"/>
+        <w:jc w:val="both" pt14:Unid="a20b8f348e884605895e013fad5e36ad"/>
       </w:pPr>
       <w:r>
         <w:t>23.2 Alterações: Qualquer alteração deste Contrato dependerá de deliberação nos termos da Cláusula 11 e será formalizada por aditivo arquivado na Junta.</w:t>
       </w:r>
     </w:p>
-    <w:p pt14:Unid="6e01f39d99774a118ca096d174ac638f">
-      <w:pPr pt14:Unid="2fba3842463e4aa9bf958ece36cdb0d7">
-        <w:spacing w:after="120" w:line="288" w:lineRule="auto" pt14:Unid="dba90ba6f91341f6b84d7ed084923bf9"/>
-        <w:jc w:val="both" pt14:Unid="49dc3af8ef7143f1904eff80c44332d1"/>
+    <w:p pt14:Unid="01ddecd59d1146129ac9628be4bcb3e6">
+      <w:pPr pt14:Unid="58312574a85e41cb88638b3f59a9d393">
+        <w:spacing w:after="120" w:line="288" w:lineRule="auto" pt14:Unid="d6285936042e409a92013c2cb30f5e9d"/>
+        <w:jc w:val="both" pt14:Unid="0cea3fb727d24c9181e75a470ff1fe76"/>
       </w:pPr>
       <w:r>
         <w:t>23.3 Cessão: Direitos e obrigações não poderão ser cedidos sem aprovação nos termos da Cláusula 8.</w:t>
       </w:r>
     </w:p>
-    <w:p pt14:Unid="67389bf6af60476c9cbb5dcb3418ff93">
-      <w:pPr pt14:Unid="2f61d3e9bdb14dcbbb5ea847fe47c3e9">
-        <w:spacing w:after="120" w:line="288" w:lineRule="auto" pt14:Unid="c72ddf21465240d1a05420bd4c46fda0"/>
-        <w:jc w:val="both" pt14:Unid="bce21b03eb4e4ac8b3d836409ce552de"/>
+    <w:p pt14:Unid="d5b620dc1da743c78f464b89e9df48d8">
+      <w:pPr pt14:Unid="f72477d794e64655afb24335a725416f">
+        <w:spacing w:after="120" w:line="288" w:lineRule="auto" pt14:Unid="75a1a58609994220a62f1c7cc2a0f835"/>
+        <w:jc w:val="both" pt14:Unid="6b9dc6b16d6d416dbf806bce09b3cc45"/>
       </w:pPr>
       <w:r>
         <w:t>23.4 Força maior: Nenhuma parte será responsável por descumprimento causado por eventos de força maior ou caso fortuito, comunicados em prazo razoável.</w:t>
       </w:r>
     </w:p>
-    <w:p pt14:Unid="dfe4a7a4661a44de922efa4708e62997">
-      <w:pPr pt14:Unid="fcf9a981dc794a0a88ee4f3cf51a05a6">
-        <w:spacing w:after="120" w:line="288" w:lineRule="auto" pt14:Unid="87c742d4dc4f4617800f79add401e39c"/>
-        <w:jc w:val="both" pt14:Unid="ce08bd3c08d347309881534c6f1776e6"/>
+    <w:p pt14:Unid="83290b4f0ea648d08d19130883a3958e">
+      <w:pPr pt14:Unid="19083fab131d40dbac0e9a8bcf1f3cb4">
+        <w:spacing w:after="120" w:line="288" w:lineRule="auto" pt14:Unid="e5cb11cd2faf42bd83410bfa06bf3abe"/>
+        <w:jc w:val="both" pt14:Unid="a74ba52828d5417e84c4939f90b8e7a7"/>
       </w:pPr>
       <w:r>
         <w:t>23.5 Inteireza e independência: Este Contrato constitui o acordo integral entre as partes e, se alguma cláusula for considerada nula/inexequível, as demais permanecerão válidas.</w:t>
       </w:r>
     </w:p>
-    <w:p pt14:Unid="8c241a69c19d46a492e8c1482063a590">
-      <w:pPr pt14:Unid="1117303dafec48a5bcab3a34166d7570">
-        <w:spacing w:after="120" w:line="288" w:lineRule="auto" pt14:Unid="b48e460d141d49cba2fd660c844ea856"/>
-        <w:jc w:val="both" pt14:Unid="20ad446ed29948f695c5a5f63d472513"/>
+    <w:p pt14:Unid="4dd3b561a8dc426ba12449abb832ba3f">
+      <w:pPr pt14:Unid="15433d7000b44005b0e1cc4027f73a29">
+        <w:spacing w:after="120" w:line="288" w:lineRule="auto" pt14:Unid="d77d0452f68a4377b5c2fdf591e5b41f"/>
+        <w:jc w:val="both" pt14:Unid="8bc8c37a036c4b41a103f3457db0a837"/>
       </w:pPr>
       <w:r>
         <w:t>ASSINATURAS, LOCAL E DATA; ASSINATURA ELETRÔNICA</w:t>
       </w:r>
     </w:p>
-    <w:p pt14:Unid="f599e87dc4334bce96bb25327db60a5e">
-      <w:pPr pt14:Unid="9e5eec4bce0c45339b569e4ef03f5cd1">
-        <w:spacing w:after="120" w:line="288" w:lineRule="auto" pt14:Unid="ba13461089be46b39f552751b80f554b"/>
-        <w:jc w:val="both" pt14:Unid="690d3aa19199440ca7c1fd92d5e68470"/>
+    <w:p pt14:Unid="bd4462d984af465daced3addf786e6e1">
+      <w:pPr pt14:Unid="8e40987465b848d484fcbabc82d82e0d">
+        <w:spacing w:after="120" w:line="288" w:lineRule="auto" pt14:Unid="291b584ac3ee4f88b705cae6d2464717"/>
+        <w:jc w:val="both" pt14:Unid="0901a914703d4dcfb922830c5753c4fb"/>
       </w:pPr>
       <w:r>
         <w:t>24.1 Firmado em [Cidade/UF], na data de [DATA].</w:t>
       </w:r>
     </w:p>
-    <w:p pt14:Unid="752641b9588a49d5906e5a2f55cc6529">
-      <w:pPr pt14:Unid="180027ecdaf94ed3811b2629523397b3">
-        <w:spacing w:after="120" w:line="288" w:lineRule="auto" pt14:Unid="0dcc229cd379426f83bf6810c073c330"/>
-        <w:jc w:val="both" pt14:Unid="1c4a40411531460ab109c75252ceac61"/>
+    <w:p pt14:Unid="53d9d75be3564f1db5ff263b13fe6398">
+      <w:pPr pt14:Unid="a16e453382df40d1ac6d3a26e698520a">
+        <w:spacing w:after="120" w:line="288" w:lineRule="auto" pt14:Unid="14b1a76af5e04a9080a22e78fd67db2a"/>
+        <w:jc w:val="both" pt14:Unid="a0ff210f886444638738e7727f9ff3ed"/>
       </w:pPr>
       <w:r>
         <w:t>24.2 Este instrumento admite assinatura eletrônica qualificada (ICP-Brasil) ou por meio da conta gov.br com múltiplo fator de autenticação, nos termos da IN DREI 81/2020 e normativas vigentes [NOTA: observar ofícios-circulares do DREI aplicáveis]. Testemunhas são dispensadas para fins societários, salvo exigência específica da Junta.</w:t>
       </w:r>
     </w:p>
-    <w:p pt14:Unid="2c99eb5e7ff0426b9d53c4cbafafcbad">
-      <w:pPr pt14:Unid="9a7f8d4b38d445ba9e48f0893717d017">
-        <w:spacing w:after="120" w:line="288" w:lineRule="auto" pt14:Unid="0b19a7eca8614080942e5f45bd8ad72f"/>
-        <w:jc w:val="both" pt14:Unid="5b86cd7250a14f8cb8efb5d7bd1fa759"/>
+    <w:p pt14:Unid="9482ab8774a84b34b432f730db2efe77">
+      <w:pPr pt14:Unid="d7bf27596d5c4725831b875548fcdf28">
+        <w:spacing w:after="120" w:line="288" w:lineRule="auto" pt14:Unid="cc18d89ef7e14e52b967c51a8f283643"/>
+        <w:jc w:val="both" pt14:Unid="92534d373e9f4ef8ada32ec3d20bd797"/>
       </w:pPr>
       <w:r>
         <w:t>Sócios:</w:t>
       </w:r>
     </w:p>
-    <w:p pt14:Unid="43fcc8a7e9784ec7bdd87cb67584bca7">
-      <w:pPr pt14:Unid="a899cdb28d904c5f85d8dc518b96b664">
-        <w:pStyle w:val="ListBullet" pt14:Unid="522065fba28c44b19a3746fb9de67ca3"/>
-        <w:spacing w:after="120" w:line="288" w:lineRule="auto" pt14:Unid="16bf746dc4e640b3b17be09d9b3dac9f"/>
-        <w:jc w:val="both" pt14:Unid="67a286b9a33242cda718ec559056bdf4"/>
+    <w:p pt14:Unid="0393890698b243f89d9879a091d4bd74">
+      <w:pPr pt14:Unid="72a4843b631c4fc68101115a8eae1a07">
+        <w:pStyle w:val="ListBullet" pt14:Unid="abb3360dc32a4553961d8e156f0217d6"/>
+        <w:spacing w:after="120" w:line="288" w:lineRule="auto" pt14:Unid="44b3527a50fc495c94c4fbdd3528765f"/>
+        <w:jc w:val="both" pt14:Unid="fcb6b4d065d44a36b3ec42c161187065"/>
       </w:pPr>
       <w:r>
         <w:t>[Nome e assinatura]</w:t>
       </w:r>
     </w:p>
-    <w:p pt14:Unid="3d2c1224d9114dce8901d9c95c6808b8">
-      <w:pPr pt14:Unid="7916e142d6ea4501b6516c7d3fd2e4c0">
-        <w:pStyle w:val="ListBullet" pt14:Unid="21648de3c9d44020845bdc37ed5406eb"/>
-        <w:spacing w:after="120" w:line="288" w:lineRule="auto" pt14:Unid="ef3ff0f217db466fa2ebfdad75be016b"/>
-        <w:jc w:val="both" pt14:Unid="4c3882679296443c9534a300433aecfc"/>
+    <w:p pt14:Unid="01f998dc76b74e73a539ed27fadac34d">
+      <w:pPr pt14:Unid="5594eb954fd746e0b432eac13b4a2492">
+        <w:pStyle w:val="ListBullet" pt14:Unid="42e64220410f42c5a7de28eb611dffc6"/>
+        <w:spacing w:after="120" w:line="288" w:lineRule="auto" pt14:Unid="9d6b2944d20a4281bbec3d64ff37b8c8"/>
+        <w:jc w:val="both" pt14:Unid="736bc5e499ae401cab4c5ffbfe7ec01d"/>
       </w:pPr>
       <w:r>
         <w:t>[Nome e assinatura]</w:t>
       </w:r>
     </w:p>
-    <w:p pt14:Unid="5332203a9ad84415a4eeb84569b2320a">
-      <w:pPr pt14:Unid="c1f0ce28fb5d48a5be0d39bcf275e0e2">
-        <w:spacing w:after="120" w:line="288" w:lineRule="auto" pt14:Unid="4f1b469908e045738cb9603d354190d2"/>
-        <w:jc w:val="both" pt14:Unid="88dd40206cb7489db2b04c66e7887238"/>
+    <w:p pt14:Unid="5e203ddadc0a4c3092164a187cd8fec9">
+      <w:pPr pt14:Unid="028149869ab14f9088a4e9ab2945037b">
+        <w:spacing w:after="120" w:line="288" w:lineRule="auto" pt14:Unid="527c3ff7ae824a0ea55eb5de11ebb08d"/>
+        <w:jc w:val="both" pt14:Unid="097516dae8bd4adea656124881d99dcb"/>
       </w:pPr>
       <w:r>
         <w:t>Administradores (termo de posse, se aplicável):</w:t>
       </w:r>
     </w:p>
-    <w:p pt14:Unid="57137d2111714cef8764239a1b578205">
-      <w:pPr pt14:Unid="c3f9ef02188945aebee688d5caf14917">
-        <w:pStyle w:val="ListBullet" pt14:Unid="e5895d9d1ca74d30b2653d139a3a2e90"/>
-        <w:spacing w:after="120" w:line="288" w:lineRule="auto" pt14:Unid="d4136dc838394452a1f2763b27b5c8b2"/>
-        <w:jc w:val="both" pt14:Unid="35aeed21a93a49c29e5207d578877f0f"/>
+    <w:p pt14:Unid="cc43d46050e349f49fc5a323f2547989">
+      <w:pPr pt14:Unid="3c163c532c1040dd9a33be66205398dc">
+        <w:pStyle w:val="ListBullet" pt14:Unid="27bec3e1692a40bba7788f15cec479f4"/>
+        <w:spacing w:after="120" w:line="288" w:lineRule="auto" pt14:Unid="6c9d8ba4cd4749c5a14f7bf30e659be2"/>
+        <w:jc w:val="both" pt14:Unid="3154f22ac0f649fba8ee1e7012af3e72"/>
       </w:pPr>
       <w:r>
         <w:t>[Nome e assinatura]</w:t>
       </w:r>
     </w:p>
-    <w:p pt14:Unid="50feb2fbce74429ea07061645f6e7f24">
-      <w:pPr pt14:Unid="bb55782a985147cd88b2415632c6b151">
-        <w:spacing w:after="120" w:line="288" w:lineRule="auto" pt14:Unid="da834631e90a487dabb188a8c7d9b97d"/>
-        <w:jc w:val="both" pt14:Unid="1759cf5a160b418caeeabeddca9c2ea5"/>
+    <w:p pt14:Unid="eb0732a750f0402d9358dc603e5f4e42">
+      <w:pPr pt14:Unid="fb8ebfde1bae4e7d8533418f19626006">
+        <w:spacing w:after="120" w:line="288" w:lineRule="auto" pt14:Unid="4ff96f7361b54e48b0c2a01c4994f000"/>
+        <w:jc w:val="both" pt14:Unid="9e4b7ef6b68748109a690c1a493a102e"/>
       </w:pPr>
       <w:r>
         <w:t>[Espaço para certificação digital, QR Code, ou hash do documento]</w:t>
       </w:r>
     </w:p>
-    <w:p pt14:Unid="d7d48100b34a46f98a80a4250ebeddbc">
-      <w:pPr pt14:Unid="80c8d56593bc42c0ab37f328c0c6b154">
-        <w:spacing w:after="120" w:line="288" w:lineRule="auto" pt14:Unid="5c7d7266ca644fd793e79336d2b8b11d"/>
-        <w:jc w:val="both" pt14:Unid="6d86b237d0604698b13000628c1ac2fe"/>
+    <w:p pt14:Unid="17c8ddd6dffe4bd0b8e0709a6c5d3e5f">
+      <w:pPr pt14:Unid="199acbbeb94840e0aea507c723627009">
+        <w:spacing w:after="120" w:line="288" w:lineRule="auto" pt14:Unid="fa1e9d0356e1400fbaa6aef64399bb9e"/>
+        <w:jc w:val="both" pt14:Unid="2c3acee3f1424f3bb0cfcf9b5594751d"/>
       </w:pPr>
       <w:r>
         <w:t>— FIM DO CONTRATO SOCIAL (VERSÃO LTDA) —</w:t>
       </w:r>
     </w:p>
-    <w:p pt14:Unid="aa088dc8f5a4481486621b68185cb940">
-      <w:pPr pt14:Unid="80c50ff5661d49de8c30097821113e7f">
-        <w:spacing w:after="120" w:line="288" w:lineRule="auto" pt14:Unid="a35f4047c3204c0699eb3c6342c7d80d"/>
-        <w:jc w:val="both" pt14:Unid="785fc8153b3945deaeed1eb61eed6aa6"/>
+    <w:p pt14:Unid="d4c0caef90514d20a52696b5777c14c6">
+      <w:pPr pt14:Unid="faed30a12137471a84630eb00e5d9d70">
+        <w:spacing w:after="120" w:line="288" w:lineRule="auto" pt14:Unid="a881a5cf43054ab19e397419011a13c2"/>
+        <w:jc w:val="both" pt14:Unid="fccff36191e840f994f47386ee377751"/>
       </w:pPr>
       <w:r>
         <w:t>VARIANTE: CONTRATO SOCIAL DE SOCIEDADE LIMITADA UNIPESSOAL (SLU)</w:t>
       </w:r>
     </w:p>
-    <w:p pt14:Unid="910678cfc8dc43b796336fb37ee83341">
-      <w:pPr pt14:Unid="5dc376ff06314d4c98445aa486aa3e91">
-        <w:spacing w:after="120" w:line="288" w:lineRule="auto" pt14:Unid="79c62f216c25429da6c4b4aea14f74ff"/>
-        <w:jc w:val="both" pt14:Unid="627c75ece879476ea609fbdea1d353f3"/>
+    <w:p pt14:Unid="bff8a2532acb4abfb18bc1ed6f24189e">
+      <w:pPr pt14:Unid="482237da7e354f28b08c3d35731bf9b3">
+        <w:spacing w:after="120" w:line="288" w:lineRule="auto" pt14:Unid="34eeccd8d91c45ee811341d633118490"/>
+        <w:jc w:val="both" pt14:Unid="278269fa9d224bb6a8a6808205d53695"/>
       </w:pPr>
       <w:r>
         <w:t>[Adaptar as cláusulas acima para Sócio Único, mantendo a estrutura, com as seguintes observações principais:]</w:t>
       </w:r>
     </w:p>
-    <w:p pt14:Unid="9c0b6a65a83e44b38d7a3408ed8cdb66">
-      <w:pPr pt14:Unid="74f8ad38bfe54787b344cff2ec657d1d">
-        <w:pStyle w:val="ListBullet" pt14:Unid="dc2f0703601942f8bc5d5b3ace9467d7"/>
-        <w:spacing w:after="120" w:line="288" w:lineRule="auto" pt14:Unid="e09ef5a87371430cb7fd1b92bda507b3"/>
-        <w:jc w:val="both" pt14:Unid="79e797dabe354c6da170a91f29098688"/>
+    <w:p pt14:Unid="2a2701f4c1dc4f39b9b6a0c96c84e630">
+      <w:pPr pt14:Unid="7747e307d16f438282c8a15769c4e685">
+        <w:pStyle w:val="ListBullet" pt14:Unid="a1ff8f5a34794456aef90e0f461d2fbf"/>
+        <w:spacing w:after="120" w:line="288" w:lineRule="auto" pt14:Unid="713d97920ec84e069fcdb2f80ce23ef1"/>
+        <w:jc w:val="both" pt14:Unid="7860ce6612964a7187f4ecfec1e361eb"/>
       </w:pPr>
       <w:r>
         <w:t>Sócio Único: [QUALIFICAÇÃO COMPLETA], doravante “Sócio Único”.</w:t>
       </w:r>
     </w:p>
-    <w:p pt14:Unid="a629489e48304b08b4b6246a89e4a82a">
-      <w:pPr pt14:Unid="d7993340f06048a488ee8a87a1b50ee5">
-        <w:pStyle w:val="ListBullet" pt14:Unid="2df2ccb1079146dfb848c441554c5179"/>
-        <w:spacing w:after="120" w:line="288" w:lineRule="auto" pt14:Unid="c43511e1d124445fae1c4ad9d31c70ca"/>
-        <w:jc w:val="both" pt14:Unid="be43a61c87494b0faad4fe51f5882092"/>
+    <w:p pt14:Unid="68416b54aa6d47c1bad58bcac3ba6bef">
+      <w:pPr pt14:Unid="0879d24670ef455aaf1d27efd78581c8">
+        <w:pStyle w:val="ListBullet" pt14:Unid="b2084a6b758648229875fb00cb8297a8"/>
+        <w:spacing w:after="120" w:line="288" w:lineRule="auto" pt14:Unid="5f910aa807a54078b2808a4f55f11d07"/>
+        <w:jc w:val="both" pt14:Unid="aed24f6b77894079ae44c847a6c2141e"/>
       </w:pPr>
       <w:r>
         <w:t>A SLU reger-se-á pelo CC, art. 1.052, parágrafo único, e demais dispositivos aplicáveis às limitadas; responsabilidade limitada ao capital integralizado; sem necessidade de capital mínimo específico.</w:t>
       </w:r>
     </w:p>
-    <w:p pt14:Unid="293369f24d974f08ad5e9df05978ef78">
-      <w:pPr pt14:Unid="fb19b99b84c74a75b749eed5309a392c">
-        <w:pStyle w:val="ListBullet" pt14:Unid="8cd65852d60945698492e1cd32b715dd"/>
-        <w:spacing w:after="120" w:line="288" w:lineRule="auto" pt14:Unid="94986dcc43574e4c915bc669e49cf273"/>
-        <w:jc w:val="both" pt14:Unid="9589f146cfdb4b7987cfddea8950bf10"/>
+    <w:p pt14:Unid="f823ba673f1f493aa7614930b7d48cfb">
+      <w:pPr pt14:Unid="2ba7077f50a4477d8966ab03b415636b">
+        <w:pStyle w:val="ListBullet" pt14:Unid="99c4f3a7734c4bb1a8ab459ef35853b6"/>
+        <w:spacing w:after="120" w:line="288" w:lineRule="auto" pt14:Unid="5ccbaea4e40a46efbb4edf33e100db5e"/>
+        <w:jc w:val="both" pt14:Unid="c49aa14dfa6d4d76a4bfaa9e461266de"/>
       </w:pPr>
       <w:r>
         <w:t>Capital Social: R$ [VALOR], integralizado pelo Sócio Único em [dinheiro/bens], conforme laudo se aplicável.</w:t>
       </w:r>
     </w:p>
-    <w:p pt14:Unid="7e1ca986c2af4f2eb055b3711b415045">
-      <w:pPr pt14:Unid="29eb91df26ba4d858b0f639bff2bff71">
-        <w:pStyle w:val="ListBullet" pt14:Unid="c6cd9123fa024d10a285f84aa23d3dd1"/>
-        <w:spacing w:after="120" w:line="288" w:lineRule="auto" pt14:Unid="02f28ed72353456e9ee40bc5be1d1c30"/>
-        <w:jc w:val="both" pt14:Unid="729bb681fbb94afba2deab23036f41be"/>
+    <w:p pt14:Unid="534b1efc6c53418b817a724cc2acdc40">
+      <w:pPr pt14:Unid="664db50ef6f340199d678cd486c4120d">
+        <w:pStyle w:val="ListBullet" pt14:Unid="3203345114ff4c3e90dc116c852b1ebb"/>
+        <w:spacing w:after="120" w:line="288" w:lineRule="auto" pt14:Unid="7e9128c7323f4597a552498dc9a55f6e"/>
+        <w:jc w:val="both" pt14:Unid="21b0960c1640401cbc11e656e5945dd2"/>
       </w:pPr>
       <w:r>
         <w:t>Administração: Exercida pelo Sócio Único ou por administrador por ele nomeado, com investidura mediante termo de posse.</w:t>
       </w:r>
     </w:p>
-    <w:p pt14:Unid="f2d2b35b809d4a5eb409c3cc51c69de0">
-      <w:pPr pt14:Unid="33d22fe8726242ef9f6b2dc676986f09">
-        <w:pStyle w:val="ListBullet" pt14:Unid="87dc085335f146bcb1c454f021f897fc"/>
-        <w:spacing w:after="120" w:line="288" w:lineRule="auto" pt14:Unid="b2f4771e285a402ca83df30560a0cc09"/>
-        <w:jc w:val="both" pt14:Unid="add79a545f5640ca984987bcaa60e757"/>
+    <w:p pt14:Unid="fba6907e99b34826b616aedd7635d26a">
+      <w:pPr pt14:Unid="20affe580ad64cb283f4ded66e86e49a">
+        <w:pStyle w:val="ListBullet" pt14:Unid="8cec7290a6084ba99b0208f9437d02c6"/>
+        <w:spacing w:after="120" w:line="288" w:lineRule="auto" pt14:Unid="2a355e0020d94c9f85bc966068337b32"/>
+        <w:jc w:val="both" pt14:Unid="9a5b1a7836cb40ca8230c94d3cada762"/>
       </w:pPr>
       <w:r>
         <w:t>Deliberações: Lavradas em atas/declarações do Sócio Único e arquivadas quando exigido.</w:t>
       </w:r>
     </w:p>
-    <w:p pt14:Unid="24ba54e04e9a4029afffa0fa64834e10">
-      <w:pPr pt14:Unid="0cf8bac737374b5293634c93b7594b0d">
-        <w:pStyle w:val="ListBullet" pt14:Unid="f6e3c099466c45f3bd58c54cd601948a"/>
-        <w:spacing w:after="120" w:line="288" w:lineRule="auto" pt14:Unid="9ffc16fd014b4bcd9c306b6eb83c03be"/>
-        <w:jc w:val="both" pt14:Unid="c09d0ea98fac4f01afda9a23bca1dd29"/>
+    <w:p pt14:Unid="0c26e5db7a3a437a81a47ef4b0f7fe65">
+      <w:pPr pt14:Unid="f9bd9e7145a34c18ac4a80907953737f">
+        <w:pStyle w:val="ListBullet" pt14:Unid="55ebcb735eef495789854266c7948298"/>
+        <w:spacing w:after="120" w:line="288" w:lineRule="auto" pt14:Unid="e2ef949f78ec4bb9adc8f719af703764"/>
+        <w:jc w:val="both" pt14:Unid="02c54ccf0e4d4da5977dd61ff5aceb49"/>
       </w:pPr>
       <w:r>
         <w:t>Futuras entradas: Prever a possibilidade de admissão de novos Sócios, convertendo-se automaticamente em LTDA pluripessoal, mediante aditivo.</w:t>
       </w:r>
     </w:p>
-    <w:p pt14:Unid="7b92669e98a94b5cb671f8be14802fd9">
-      <w:pPr pt14:Unid="b7239cf91fa14684b1a87e7090022ce3">
-        <w:pStyle w:val="ListBullet" pt14:Unid="ce2dd5fba83f4d4c8c030c56ec1a889d"/>
-        <w:spacing w:after="120" w:line="288" w:lineRule="auto" pt14:Unid="8386d536448147b4b6e164187f3551f6"/>
-        <w:jc w:val="both" pt14:Unid="bd82cc73c2da462ab536193ef6968275"/>
+    <w:p pt14:Unid="1eb805f830064a6db2c889718cbcf4c9">
+      <w:pPr pt14:Unid="fae0cc6e7fed4e5399e90d68c1954581">
+        <w:pStyle w:val="ListBullet" pt14:Unid="241cb6b9339b4811b29b6d165c7ffb4e"/>
+        <w:spacing w:after="120" w:line="288" w:lineRule="auto" pt14:Unid="04a100ea2bca4c829b7b30ed9726a078"/>
+        <w:jc w:val="both" pt14:Unid="9f204bfc4894411180bbb4b7edb05886"/>
       </w:pPr>
       <w:r>
         <w:t>Assinatura: Permitir assinatura eletrônica (ICP-Brasil/gov.br com 2FA), conforme diretrizes do DREI.</w:t>
       </w:r>
     </w:p>
-    <w:p pt14:Unid="9c43447505f74f88a2e855424822c533">
-      <w:pPr pt14:Unid="7abf502ea4f04cc2acd732613e13de06">
-        <w:spacing w:after="120" w:line="288" w:lineRule="auto" pt14:Unid="cfe8a26c08b24046af363115e36c517c"/>
-        <w:jc w:val="both" pt14:Unid="7ae9fbaa16d841ca81a1df9f9f878095"/>
+    <w:p pt14:Unid="f14dc4b516514efaa05567b258f0331a">
+      <w:pPr pt14:Unid="abd18bb0bde94c7f9cc57d937dbb5872">
+        <w:spacing w:after="120" w:line="288" w:lineRule="auto" pt14:Unid="9a7b2854377f4286bcb1e4069515c4d2"/>
+        <w:jc w:val="both" pt14:Unid="5191a78bc42046f48bd0d7fa040de155"/>
       </w:pPr>
       <w:r>
         <w:t>— FIM DA VARIANTE SLU —</w:t>
       </w:r>
     </w:p>
-    <w:p pt14:Unid="b329e626e9e54cb6adfc72612aa9796a">
-      <w:pPr pt14:Unid="6966bd3dfcbe49b3917f3ec4236f6330">
-        <w:spacing w:after="120" w:line="288" w:lineRule="auto" pt14:Unid="5e617fdeb0594fcd8f91cd0fafa7ae69"/>
-        <w:jc w:val="both" pt14:Unid="b693fcd895654b54b81f7051d1db07b4"/>
+    <w:p pt14:Unid="a840e05fd1154a7eb6092efcb3ccfe0f">
+      <w:pPr pt14:Unid="33ab8e3e81244f34853e96e0b3dc5da0">
+        <w:spacing w:after="120" w:line="288" w:lineRule="auto" pt14:Unid="f29d5003617444ef9d9f2b5c5b8ce337"/>
+        <w:jc w:val="both" pt14:Unid="721dc977df7146deb3c8e8069444857b"/>
       </w:pPr>
       <w:r>
         <w:t>ANEXO A — TERM SHEET (CAPTURA DE VARIÁVEIS)</w:t>
       </w:r>
     </w:p>
-    <w:p pt14:Unid="a741d7ff804d4d3eb46b9337bbd73ad4">
-      <w:pPr pt14:Unid="34ac28c2c7e14a47bf75e2f985455c70">
-        <w:spacing w:after="120" w:line="288" w:lineRule="auto" pt14:Unid="6eda046cc0664aefa97eb47583e221d4"/>
-        <w:jc w:val="both" pt14:Unid="d2a8a2801c304530bdf475d0f1ef5984"/>
+    <w:p pt14:Unid="834048ff73d64da4872cf60fa0225a5f">
+      <w:pPr pt14:Unid="ed322e1e8a874491abc5b1d9ec7bcd46">
+        <w:spacing w:after="120" w:line="288" w:lineRule="auto" pt14:Unid="74ead6af5649451dabc190cfcc8a9dcd"/>
+        <w:jc w:val="both" pt14:Unid="0bb3db8bb5d440b894e02608ffaa73d2"/>
       </w:pPr>
       <w:r>
         <w:t>Preencha para geração da versão “clean”:</w:t>
       </w:r>
     </w:p>
-    <w:p pt14:Unid="ad7747edc2bd45b9994eac28ad7b07fb">
-      <w:pPr pt14:Unid="1255b17ee42045838d3fe223c1299a0a">
-        <w:pStyle w:val="ListBullet" pt14:Unid="43739e43facb41ce832a34a7c21923e6"/>
-        <w:spacing w:after="120" w:line="288" w:lineRule="auto" pt14:Unid="a83e6ca4931b40c1a35d87f01c09deb9"/>
-        <w:jc w:val="both" pt14:Unid="686bf2b3185a4c348c4e29af9a573ae5"/>
+    <w:p pt14:Unid="3bcbdfe361774a1c8bd96aeb9ba9172c">
+      <w:pPr pt14:Unid="296f6e26455c4a58b2e6ff065275e664">
+        <w:pStyle w:val="ListBullet" pt14:Unid="78cee5601d654cc0884a78f2829046c1"/>
+        <w:spacing w:after="120" w:line="288" w:lineRule="auto" pt14:Unid="b89d584c08934f62a535c47677c04817"/>
+        <w:jc w:val="both" pt14:Unid="180f5e0b38ee4c8daa2dfacb5aaa9f51"/>
       </w:pPr>
       <w:r>
         <w:t>Denominação/Nome empresarial: [ ]</w:t>
       </w:r>
     </w:p>
-    <w:p pt14:Unid="c1b1c977177b489d8012db47a981cf9b">
-      <w:pPr pt14:Unid="614795872d6749d4a021c0d9ec93b2e9">
-        <w:pStyle w:val="ListBullet" pt14:Unid="cca129eeb2d7498f9c0146758016e76d"/>
-        <w:spacing w:after="120" w:line="288" w:lineRule="auto" pt14:Unid="a228017f6e3848cb8ed927c1fd92d607"/>
-        <w:jc w:val="both" pt14:Unid="64270683d27242a3a0d1ee7ad7d891d4"/>
+    <w:p pt14:Unid="0e09eee036ee4300bd0495d61ac28648">
+      <w:pPr pt14:Unid="049a251cd56e4748adaef39aa10ef201">
+        <w:pStyle w:val="ListBullet" pt14:Unid="cc71389b485f43dbae2b3bc0d512754a"/>
+        <w:spacing w:after="120" w:line="288" w:lineRule="auto" pt14:Unid="ad4872e4f27c4cdbb2c144d147ae082f"/>
+        <w:jc w:val="both" pt14:Unid="9ab1f6a443774f38a1aafca4ac51186d"/>
       </w:pPr>
       <w:r>
         <w:t>Sede (endereço completo): [ ]</w:t>
       </w:r>
     </w:p>
-    <w:p pt14:Unid="ccc87616781c49d38133d8a9f8ac92b0">
-      <w:pPr pt14:Unid="7be66f6ed19f47fcb59a11462a8eb9df">
-        <w:pStyle w:val="ListBullet" pt14:Unid="6edaa50b4bc341509945d70aa6eba5de"/>
-        <w:spacing w:after="120" w:line="288" w:lineRule="auto" pt14:Unid="706b7c3b92634d8ab71b92cd224056f9"/>
-        <w:jc w:val="both" pt14:Unid="fd49d554a50a4aa8a2f595350be3464a"/>
+    <w:p pt14:Unid="8f9c3c67105541f2807a23d004d6d997">
+      <w:pPr pt14:Unid="cf526f146de0469aa6101d78acc684f2">
+        <w:pStyle w:val="ListBullet" pt14:Unid="a25ef2d75513402081adbcfe21758fd8"/>
+        <w:spacing w:after="120" w:line="288" w:lineRule="auto" pt14:Unid="b82c68296fb5496a85af2494e468fd89"/>
+        <w:jc w:val="both" pt14:Unid="4c8cd1b2a2c5446fa60f9299cc5c6798"/>
       </w:pPr>
       <w:r>
         <w:t>Objeto social (CNAE principal e secundários): [ ]</w:t>
       </w:r>
     </w:p>
-    <w:p pt14:Unid="94fb81c3be4a43a2b3cc5fd25ca76db4">
-      <w:pPr pt14:Unid="2997e6debc3d46c3a239cba8b1fe1d14">
-        <w:pStyle w:val="ListBullet" pt14:Unid="dc5a5b7186bd40c98536612dc5a4b973"/>
-        <w:spacing w:after="120" w:line="288" w:lineRule="auto" pt14:Unid="f91037cb6a8140a59dde6a629ac8fb1b"/>
-        <w:jc w:val="both" pt14:Unid="82acee8a50ce48d395867d81f5e28b94"/>
+    <w:p pt14:Unid="ffb3e724f33c45c2b6a1bd2fb1ae16f5">
+      <w:pPr pt14:Unid="d88f01fee14d4c57b22ba6feaf5a0078">
+        <w:pStyle w:val="ListBullet" pt14:Unid="b150d4e30868457b97b3e4821b5854f9"/>
+        <w:spacing w:after="120" w:line="288" w:lineRule="auto" pt14:Unid="15b3eb2a1ce340aab3eb880713a561f6"/>
+        <w:jc w:val="both" pt14:Unid="a1aa4b4c256042b09b4f608c1ed28d52"/>
       </w:pPr>
       <w:r>
         <w:t>Prazo de duração: [ ]</w:t>
       </w:r>
     </w:p>
-    <w:p pt14:Unid="47240a82e5b844bdab7a41aee7569f6d">
-      <w:pPr pt14:Unid="704c593f8e8f40dfabd69022c5afaddc">
-        <w:pStyle w:val="ListBullet" pt14:Unid="1c7a2ea22f6746dfa368d8279d5c673c"/>
-        <w:spacing w:after="120" w:line="288" w:lineRule="auto" pt14:Unid="c3c22fe9af8f4d8ab074bc8b6ca544c4"/>
-        <w:jc w:val="both" pt14:Unid="8d5fb8b18bfd4f99a9cf03512f18131c"/>
+    <w:p pt14:Unid="9ae00eb13a1443609007457c53ef8ee2">
+      <w:pPr pt14:Unid="63306502499e4096b6fc38e89128f464">
+        <w:pStyle w:val="ListBullet" pt14:Unid="d65d68fed12747048c1b95890bd2638f"/>
+        <w:spacing w:after="120" w:line="288" w:lineRule="auto" pt14:Unid="d9c914a3548546f1948b66c3f59151c6"/>
+        <w:jc w:val="both" pt14:Unid="1af48673c19a4e1b9e626a9e33204972"/>
       </w:pPr>
       <w:r>
         <w:t>Exercício social (data de encerramento): [ ]</w:t>
       </w:r>
     </w:p>
-    <w:p pt14:Unid="63b5ad1f99154c8c822f75c88fcec29e">
-      <w:pPr pt14:Unid="019ca829880e4643907bc7ba581cb247">
-        <w:pStyle w:val="ListBullet" pt14:Unid="0a0f77b0457f4ca5ad3da15a8cb51c2d"/>
-        <w:spacing w:after="120" w:line="288" w:lineRule="auto" pt14:Unid="d230eceebfb74c0a99712e356d57cf2c"/>
-        <w:jc w:val="both" pt14:Unid="dbc5b37101d0457b8e6b707f5c17e613"/>
+    <w:p pt14:Unid="3ec7e1c1228746a2a983480f378668fe">
+      <w:pPr pt14:Unid="a763f0f0ee1f44af9a2d92391db5be70">
+        <w:pStyle w:val="ListBullet" pt14:Unid="b4905d35e3bd4897bd94e32bd14e3e2e"/>
+        <w:spacing w:after="120" w:line="288" w:lineRule="auto" pt14:Unid="8b6a9698f07a4d938a9c5a07b66adc80"/>
+        <w:jc w:val="both" pt14:Unid="41d30c55d12f4f04bce5c8bf2bab7339"/>
       </w:pPr>
       <w:r>
         <w:t>Sócios (PF/PJ), quotas e percentuais: [ ]</w:t>
       </w:r>
     </w:p>
-    <w:p pt14:Unid="86171ca87cd1489d949d8dc331c80adc">
-      <w:pPr pt14:Unid="006baeffde074cc184e7909eeebea29d">
-        <w:pStyle w:val="ListBullet" pt14:Unid="186b50ea37e24e8396af91dcd25dcbe1"/>
-        <w:spacing w:after="120" w:line="288" w:lineRule="auto" pt14:Unid="eff8f584a2844409b1e9e43572e04daa"/>
-        <w:jc w:val="both" pt14:Unid="87f913733c824f218de6894036cd0347"/>
+    <w:p pt14:Unid="e218cb932d7c4d2b958abdc061a02854">
+      <w:pPr pt14:Unid="fed610059bf54375b7add46bee2594b3">
+        <w:pStyle w:val="ListBullet" pt14:Unid="cce91ce2ab1c4b8dbf4c50fb270c6cd7"/>
+        <w:spacing w:after="120" w:line="288" w:lineRule="auto" pt14:Unid="85a8fd71c6e94d6c8023df700ccd7cf7"/>
+        <w:jc w:val="both" pt14:Unid="706f8f712e4a489fad0d1c725ff4187e"/>
       </w:pPr>
       <w:r>
         <w:t>Capital social, forma e cronograma de integralização: [ ]</w:t>
       </w:r>
     </w:p>
-    <w:p pt14:Unid="54ea2826d44240fe8393e9d625f0f209">
-      <w:pPr pt14:Unid="0eb30141b0064de2a76fe62b0e0b6b02">
-        <w:pStyle w:val="ListBullet" pt14:Unid="f3dbdaeb81ba42da85be523067d0162e"/>
-        <w:spacing w:after="120" w:line="288" w:lineRule="auto" pt14:Unid="7ed45549aff94d129cf78724a2b65485"/>
-        <w:jc w:val="both" pt14:Unid="4eecee3cfb0946a5906268fa6ce17481"/>
+    <w:p pt14:Unid="150df178d6c44009a6a3f91e29cfbb01">
+      <w:pPr pt14:Unid="e61b1d6c6734401b92a13cab6ff0d380">
+        <w:pStyle w:val="ListBullet" pt14:Unid="a57198d3b35e468983f93c3954d7f3ff"/>
+        <w:spacing w:after="120" w:line="288" w:lineRule="auto" pt14:Unid="906e2c0ae626421f935e0628fd26c96e"/>
+        <w:jc w:val="both" pt14:Unid="f1c7a52d754441aabb0a7e61bac0872e"/>
       </w:pPr>
       <w:r>
         <w:t>Administração (nomes, se sócios ou não; poderes; substituição; regime de assinaturas): [ ]</w:t>
       </w:r>
     </w:p>
-    <w:p pt14:Unid="7f9d4313bbe743ef91955a84eb3c0707">
-      <w:pPr pt14:Unid="0588af13ac4b4a88a60ff24459b4b30f">
-        <w:pStyle w:val="ListBullet" pt14:Unid="b2244b8ff998402a8cd14473af9040f1"/>
-        <w:spacing w:after="120" w:line="288" w:lineRule="auto" pt14:Unid="543f9239dab141299bd0d793f8be741a"/>
-        <w:jc w:val="both" pt14:Unid="ba45bba5623449a2ac14e45ebc3ae089"/>
+    <w:p pt14:Unid="b72fbe34a38344d0a0f7989233ca89c7">
+      <w:pPr pt14:Unid="5a4ba86e111a4eb1abb468af44cb7a86">
+        <w:pStyle w:val="ListBullet" pt14:Unid="85375f3d521142f8aad3c8cadb28de57"/>
+        <w:spacing w:after="120" w:line="288" w:lineRule="auto" pt14:Unid="68f440482c7a47a2a61d5b74baa556c7"/>
+        <w:jc w:val="both" pt14:Unid="f24c5aa0b5674b9c83c5d726edbee825"/>
       </w:pPr>
       <w:r>
         <w:t>Regência supletiva LSA: [ON/OFF]</w:t>
       </w:r>
     </w:p>
-    <w:p pt14:Unid="3abbbfab1ba74dfe9c83ed229fe19802">
-      <w:pPr pt14:Unid="21a3084836844c8c8c0d2bd713b6d78a">
-        <w:pStyle w:val="ListBullet" pt14:Unid="0de97def56464df59afe3eee80d9f0b6"/>
-        <w:spacing w:after="120" w:line="288" w:lineRule="auto" pt14:Unid="d74be8041d5e4ad8853e93714c5ec08a"/>
-        <w:jc w:val="both" pt14:Unid="447e3e615a454af980c18d78a7db7505"/>
+    <w:p pt14:Unid="288b9b92320a4f1095d4fac40e2f9afc">
+      <w:pPr pt14:Unid="68bfcc5b04994cdb893d162c048fc2ce">
+        <w:pStyle w:val="ListBullet" pt14:Unid="04e0a94b317d4d42baa086ac0cf2e047"/>
+        <w:spacing w:after="120" w:line="288" w:lineRule="auto" pt14:Unid="66157ad0d4504d71baf42535944de885"/>
+        <w:jc w:val="both" pt14:Unid="114f9ad044664ba08cb79fccf5743669"/>
       </w:pPr>
       <w:r>
         <w:t>Lock-up e standstill (prazo, exceções): [ ]</w:t>
       </w:r>
     </w:p>
-    <w:p pt14:Unid="a5ec5b3900fb40cb9450e07c8f5ae931">
-      <w:pPr pt14:Unid="cc36ace7e94a4ad4b92d53df1e1c5416">
-        <w:pStyle w:val="ListBullet" pt14:Unid="6b555380a84f4f92b24cd76c683b6fe2"/>
-        <w:spacing w:after="120" w:line="288" w:lineRule="auto" pt14:Unid="7a155b0066bf4237b73491b45a989a67"/>
-        <w:jc w:val="both" pt14:Unid="c3eb424a91d745c6ba5bec2e85c1fd20"/>
+    <w:p pt14:Unid="9c502a6be3f3485aa422805f46c414cc">
+      <w:pPr pt14:Unid="1944049d18a54336a95751be231a6da9">
+        <w:pStyle w:val="ListBullet" pt14:Unid="04691ebbe8c743fc8476d265c1d90071"/>
+        <w:spacing w:after="120" w:line="288" w:lineRule="auto" pt14:Unid="7bedf8e692dd4acaa710ebbe42dc3ea5"/>
+        <w:jc w:val="both" pt14:Unid="59171484e6574b809028245e5d7c1eb5"/>
       </w:pPr>
       <w:r>
         <w:t>Aumentos de capital (direito de preferência, prazos): [ ]</w:t>
       </w:r>
     </w:p>
-    <w:p pt14:Unid="88658c845d16404092f99b0dbc9bb99e">
-      <w:pPr pt14:Unid="ae4ace98371f44fab1b1740533d6b785">
-        <w:pStyle w:val="ListBullet" pt14:Unid="7bafb148ee604949832e4a4b8e930b1d"/>
-        <w:spacing w:after="120" w:line="288" w:lineRule="auto" pt14:Unid="473b4bc51a0542e2bfeca67a61cfaaf9"/>
-        <w:jc w:val="both" pt14:Unid="b360f44d667f47879050f68dd7da26f5"/>
+    <w:p pt14:Unid="fbf81030dfab4a29ba1241f19c5ac360">
+      <w:pPr pt14:Unid="d461f6ad00234f6abbac232c6b067504">
+        <w:pStyle w:val="ListBullet" pt14:Unid="ffc762516b0c45ecadcd95dcecdcaece"/>
+        <w:spacing w:after="120" w:line="288" w:lineRule="auto" pt14:Unid="c84a9f77568e4215b94ec763dab64da2"/>
+        <w:jc w:val="both" pt14:Unid="e5a177d5a46b41ea9d3ce8a36c4e86e3"/>
       </w:pPr>
       <w:r>
         <w:t>ROFO/ROFR (prazos, procedimentos): [ ]</w:t>
       </w:r>
     </w:p>
-    <w:p pt14:Unid="ab2ea9e2a4004a95828bce6cb2eba0c4">
-      <w:pPr pt14:Unid="4701d2f8ef114bcab7362a6a9d005009">
-        <w:pStyle w:val="ListBullet" pt14:Unid="2df30e8fa3c4491cb3b3f1017f8830cf"/>
-        <w:spacing w:after="120" w:line="288" w:lineRule="auto" pt14:Unid="066380e0e98644da96dca260a576d5f6"/>
-        <w:jc w:val="both" pt14:Unid="7069b41f7ea642d9bd95cf493d6c557d"/>
+    <w:p pt14:Unid="d31353448f57462499b92de5c689d7b8">
+      <w:pPr pt14:Unid="d01ef199dc1b444fa121d608605c5239">
+        <w:pStyle w:val="ListBullet" pt14:Unid="411e651ad08c40b9a324d15f2718c0ac"/>
+        <w:spacing w:after="120" w:line="288" w:lineRule="auto" pt14:Unid="ba6e5c246e3a46db9bfa74940db80e24"/>
+        <w:jc w:val="both" pt14:Unid="9d1a50afbec84070b9cfcc42aaa09a8f"/>
       </w:pPr>
       <w:r>
         <w:t>Tag/Drag (gatilhos, preço, avaliações, condições precedentes, reps &amp; warranties): [ ]</w:t>
       </w:r>
     </w:p>
-    <w:p pt14:Unid="fa9c09885f6d445e98db6872c5920caa">
-      <w:pPr pt14:Unid="872dab88d30e44bda2a52d3c784db4aa">
-        <w:pStyle w:val="ListBullet" pt14:Unid="19edfc83eb384dbaa9cdafaa12fe58ca"/>
-        <w:spacing w:after="120" w:line="288" w:lineRule="auto" pt14:Unid="bfd56d18eafe4051ba15b6adbeb02e59"/>
-        <w:jc w:val="both" pt14:Unid="b869847f406247d0925783ad50b9ad2b"/>
+    <w:p pt14:Unid="33ec3a09cb71416bbf8d7dace02d81d4">
+      <w:pPr pt14:Unid="45ebe552ed8e4232bff51ef6e86f1735">
+        <w:pStyle w:val="ListBullet" pt14:Unid="e3d89ab92dde44ec9b3286f204dcaf30"/>
+        <w:spacing w:after="120" w:line="288" w:lineRule="auto" pt14:Unid="adfc7c32521c425e9891098c1be13a77"/>
+        <w:jc w:val="both" pt14:Unid="d42c6060ee124d169f73129d130894b0"/>
       </w:pPr>
       <w:r>
         <w:t>Política de dividendos (periódica, reservas, retenção, métricas): [ ]</w:t>
       </w:r>
     </w:p>
-    <w:p pt14:Unid="b4aa0b91ece54953b82ab65c9d23ed10">
-      <w:pPr pt14:Unid="eb0a948bd4a94170bc091225034344f4">
-        <w:pStyle w:val="ListBullet" pt14:Unid="5f56c067fe1f40c2b1e009c237f6a0cb"/>
-        <w:spacing w:after="120" w:line="288" w:lineRule="auto" pt14:Unid="b058fc4acf5b4a6e8622c847d9ed25fa"/>
-        <w:jc w:val="both" pt14:Unid="0ed2b8c9d69141fc8b633e7e5bc09605"/>
+    <w:p pt14:Unid="1e973f504a524861b8acd7e871ce158c">
+      <w:pPr pt14:Unid="e0a179b84d18452ba04d279c4fdd6020">
+        <w:pStyle w:val="ListBullet" pt14:Unid="a7380f2d578047398e178fce53a59545"/>
+        <w:spacing w:after="120" w:line="288" w:lineRule="auto" pt14:Unid="3872fd712c16455a88ff8dff8408c7e2"/>
+        <w:jc w:val="both" pt14:Unid="c31b4381931d49b392b754d9de71cc83"/>
       </w:pPr>
       <w:r>
         <w:t>Antidiluição (weighted average/full ratchet; fórmula): [ ]</w:t>
       </w:r>
     </w:p>
-    <w:p pt14:Unid="70e38d9a5f5048e289a3861ff388f6c8">
-      <w:pPr pt14:Unid="e1225178987e4df88b842f0287415c39">
-        <w:pStyle w:val="ListBullet" pt14:Unid="432b4b55916a4c2daadd4935ab09e9f0"/>
-        <w:spacing w:after="120" w:line="288" w:lineRule="auto" pt14:Unid="f7fe370b66994c90813b52e1f2135555"/>
-        <w:jc w:val="both" pt14:Unid="365e890230364ab6a7af935912b32d7b"/>
+    <w:p pt14:Unid="537730b44e244a58a899217b0aa5a10f">
+      <w:pPr pt14:Unid="2431c84a2d044e33a15481d52f75da72">
+        <w:pStyle w:val="ListBullet" pt14:Unid="45c7c7289b0543a5b4be2ee1e3656d8c"/>
+        <w:spacing w:after="120" w:line="288" w:lineRule="auto" pt14:Unid="976803e9848b4fa7807b0cead750007f"/>
+        <w:jc w:val="both" pt14:Unid="5e55a05f0b7141169ca85df9d4a0f00c"/>
       </w:pPr>
       <w:r>
         <w:t>Matérias Reservadas e quóruns/vetos: [ ]</w:t>
       </w:r>
     </w:p>
-    <w:p pt14:Unid="215e8ffc656048b288f7a6e946f4c9d7">
-      <w:pPr pt14:Unid="35cb4ecebba2474c8057d67bbdff2a39">
-        <w:pStyle w:val="ListBullet" pt14:Unid="2cf1019b9af24d9f81c418756802c9e2"/>
-        <w:spacing w:after="120" w:line="288" w:lineRule="auto" pt14:Unid="5e774dfde43e420fa92dee7ccbd431a4"/>
-        <w:jc w:val="both" pt14:Unid="5daf82c451a14972ac7686406f87ef83"/>
+    <w:p pt14:Unid="e22af35de22747d6b7f87275012d27e5">
+      <w:pPr pt14:Unid="6c0843db8649425383f5ae41c9f5ba0a">
+        <w:pStyle w:val="ListBullet" pt14:Unid="351d1e45b05541ce94c84784f928c6d0"/>
+        <w:spacing w:after="120" w:line="288" w:lineRule="auto" pt14:Unid="b1abd1575c364bffa9e019d13ed446a2"/>
+        <w:jc w:val="both" pt14:Unid="9d90463b84b94b46a543c9ee77ec6f19"/>
       </w:pPr>
       <w:r>
         <w:t>Não concorrência e não aliciamento (prazo, escopo, território, multa, compensação): [ ]</w:t>
       </w:r>
     </w:p>
-    <w:p pt14:Unid="07e88785b2ae49ad8be6eb0802233018">
-      <w:pPr pt14:Unid="ffa1056f197f4d88a00b5307d95131ac">
-        <w:pStyle w:val="ListBullet" pt14:Unid="a7903f9c646d4f9d9a72bc4c9307d249"/>
-        <w:spacing w:after="120" w:line="288" w:lineRule="auto" pt14:Unid="309fb96c9c2e416a9fb1a2ed88045b9c"/>
-        <w:jc w:val="both" pt14:Unid="390408c011fd48459f221c1ad052fc93"/>
+    <w:p pt14:Unid="0f77eba86bcf4b5ca8c98e3261806f03">
+      <w:pPr pt14:Unid="20f3374181184c779a6bda54fc29d0a7">
+        <w:pStyle w:val="ListBullet" pt14:Unid="8755fa59deb84e4f8d695cc2eb029caf"/>
+        <w:spacing w:after="120" w:line="288" w:lineRule="auto" pt14:Unid="91bc29f99cc64be683589e4718a805e8"/>
+        <w:jc w:val="both" pt14:Unid="4f6db7d9f1be4747874aa2f3964c738c"/>
       </w:pPr>
       <w:r>
         <w:t>Opções put/call; shotgun/roulette/shoot-out (parâmetros, prazos): [ ]</w:t>
       </w:r>
     </w:p>
-    <w:p pt14:Unid="aad27bafe6014859829a4260e849d0cf">
-      <w:pPr pt14:Unid="12eab5e1bf0f471ebbd28fd0fba482a8">
-        <w:pStyle w:val="ListBullet" pt14:Unid="f263a7da441c487e90a85a15221456eb"/>
-        <w:spacing w:after="120" w:line="288" w:lineRule="auto" pt14:Unid="289330be4e9a497c9ecf1342a7b682b7"/>
-        <w:jc w:val="both" pt14:Unid="6d51a7aa963d4e148f9fdb68463bb35a"/>
+    <w:p pt14:Unid="2f592b2920ac4847a000809098e57e49">
+      <w:pPr pt14:Unid="5ecdfd0ec0f6468f99719469b4337eee">
+        <w:pStyle w:val="ListBullet" pt14:Unid="57612fbcdfd4413a81aa743724bb673f"/>
+        <w:spacing w:after="120" w:line="288" w:lineRule="auto" pt14:Unid="60715183222c44eea49ecff5f4672cdf"/>
+        <w:jc w:val="both" pt14:Unid="f0e52671454349c280a00d60a2c70a63"/>
       </w:pPr>
       <w:r>
         <w:t>Deadlock (definição, etapas de solução): [ ]</w:t>
       </w:r>
     </w:p>
-    <w:p pt14:Unid="dc519270c652476a8b92b7373a75950b">
-      <w:pPr pt14:Unid="5c22504f20934f508bab0adea553ab58">
-        <w:pStyle w:val="ListBullet" pt14:Unid="19a813892f3d4ac8a8ab100533c91e1e"/>
-        <w:spacing w:after="120" w:line="288" w:lineRule="auto" pt14:Unid="1fe8afebac394a7e94a7a0a9ee85b0e4"/>
-        <w:jc w:val="both" pt14:Unid="dabd0f2d28484876a82216fec6f43ca2"/>
+    <w:p pt14:Unid="286d6cb802d941e985731d07e1e73d88">
+      <w:pPr pt14:Unid="3e7ff8162bcd4d6d8793caca38f61523">
+        <w:pStyle w:val="ListBullet" pt14:Unid="2e329ba40f42495bbf29acf7b92359eb"/>
+        <w:spacing w:after="120" w:line="288" w:lineRule="auto" pt14:Unid="873622ab58be48528bf17b8e4f599403"/>
+        <w:jc w:val="both" pt14:Unid="6f1df17c30bd42a1806772b899f029d3"/>
       </w:pPr>
       <w:r>
         <w:t>Arbitragem (Câmara, sede, nº de árbitros; ou foro estatal): [ ]</w:t>
       </w:r>
     </w:p>
-    <w:p pt14:Unid="f8b86ee9f9a045adac4d0f741404cc4a">
-      <w:pPr pt14:Unid="c04d2aa1698f4777862685724d6cabe0">
-        <w:pStyle w:val="ListBullet" pt14:Unid="cee1d1589cec43e59b72773bcc9ee6de"/>
-        <w:spacing w:after="120" w:line="288" w:lineRule="auto" pt14:Unid="1448a4f991e04426bc9e2e9229478b58"/>
-        <w:jc w:val="both" pt14:Unid="d02e1bea0ffa4f04b75ae83c0fbc3231"/>
+    <w:p pt14:Unid="83f90bd076704f4fb6f61faacd190edd">
+      <w:pPr pt14:Unid="6b2e3f8eddce4bacbbab17a8e3c20920">
+        <w:pStyle w:val="ListBullet" pt14:Unid="725da7718acc4e958bbc68df8be30b2b"/>
+        <w:spacing w:after="120" w:line="288" w:lineRule="auto" pt14:Unid="5a82278acbf440bab6816693f7f12b6e"/>
+        <w:jc w:val="both" pt14:Unid="9405d4865cf445c49ae2c1aedd49ef20"/>
       </w:pPr>
       <w:r>
         <w:t>LGPD (papéis, DPO, políticas, bases legais): [ ]</w:t>
       </w:r>
     </w:p>
-    <w:p pt14:Unid="c52fd969c11b48c6ac1cd2e7544ecb6e">
-      <w:pPr pt14:Unid="9d08df5f34664d47b7f68590ceadb815">
-        <w:pStyle w:val="ListBullet" pt14:Unid="7613a38cf38a43bcbd8bffa7bd5e8f6e"/>
-        <w:spacing w:after="120" w:line="288" w:lineRule="auto" pt14:Unid="bcf1bf50a1504a5bbd3bfa7891c983a6"/>
-        <w:jc w:val="both" pt14:Unid="26ad1777c51e4b1f9189bf75138d6849"/>
+    <w:p pt14:Unid="340a6a8e410d4243bcb345702f88de5f">
+      <w:pPr pt14:Unid="87822f715d844e22aa4f0dbf54d2a815">
+        <w:pStyle w:val="ListBullet" pt14:Unid="8e77632163ed42c88afe91984c2bc70c"/>
+        <w:spacing w:after="120" w:line="288" w:lineRule="auto" pt14:Unid="e7ef41c0249a4364aed58a1d22d86338"/>
+        <w:jc w:val="both" pt14:Unid="e6a5e48873564916aef75f6c7821d2bd"/>
       </w:pPr>
       <w:r>
         <w:t>Compliance anticorrupção (políticas, auditorias): [ ]</w:t>
       </w:r>
     </w:p>
-    <w:p pt14:Unid="4940e0721ff0466b94f52511d4f20d52">
-      <w:pPr pt14:Unid="b70a539764aa4fc4aab3b75de85533bb">
-        <w:pStyle w:val="ListBullet" pt14:Unid="433b7b072241470f91800f7e318f4afb"/>
-        <w:spacing w:after="120" w:line="288" w:lineRule="auto" pt14:Unid="aa41760f393b4542840f4f33d5b74c9b"/>
-        <w:jc w:val="both" pt14:Unid="99b75e2a880541128d68ee5b303a4ab3"/>
+    <w:p pt14:Unid="6acceabd33ed4630912775cd58c3fa62">
+      <w:pPr pt14:Unid="e4fc9f6bd5724b75921d0c861530fd25">
+        <w:pStyle w:val="ListBullet" pt14:Unid="479d2e014cdf48c0ac45880d9de340e9"/>
+        <w:spacing w:after="120" w:line="288" w:lineRule="auto" pt14:Unid="e238e89caca54530ac145a4b0df5466a"/>
+        <w:jc w:val="both" pt14:Unid="5ec978e5fe3441939f53a2f2a0fc7e08"/>
       </w:pPr>
       <w:r>
         <w:t>Direitos de informação/auditoria (frequência, escopo): [ ]</w:t>
       </w:r>
     </w:p>
-    <w:p pt14:Unid="ac2804e0f8174d7eae9d93bbbc79c97f">
-      <w:pPr pt14:Unid="dcbbfdeb622c4b0e8a9174f443c5142f">
-        <w:pStyle w:val="ListBullet" pt14:Unid="8459a3bac0cd4541be8bf6388743e74c"/>
-        <w:spacing w:after="120" w:line="288" w:lineRule="auto" pt14:Unid="c62da30e5b024f3f9056d21029adca83"/>
-        <w:jc w:val="both" pt14:Unid="3dd5a83147bc433284459ab92eedac00"/>
+    <w:p pt14:Unid="d4f3208d36b6485280f9e6e1d3c52cb3">
+      <w:pPr pt14:Unid="0bf0e4472f1548ae97597dea7f6c4817">
+        <w:pStyle w:val="ListBullet" pt14:Unid="6fc4e38addc140b99619ec8903f00ce7"/>
+        <w:spacing w:after="120" w:line="288" w:lineRule="auto" pt14:Unid="ec16f54ca9814efebaf1236b48264e79"/>
+        <w:jc w:val="both" pt14:Unid="5fdaaefbe9364668944851a586737ad0"/>
       </w:pPr>
       <w:r>
         <w:t>Eventos-gatilho (morte/invalidez/saída; good/bad leaver; vesting): [ ]</w:t>
       </w:r>
     </w:p>
-    <w:p pt14:Unid="4073433768ea40a49bc7c8a18828eb06">
-      <w:pPr pt14:Unid="aabcbdef0ce44e15949a7846f862daaf">
-        <w:pStyle w:val="ListBullet" pt14:Unid="eadb5027583a4d2ab3166850efce1c4f"/>
-        <w:spacing w:after="120" w:line="288" w:lineRule="auto" pt14:Unid="930e3bdc210c45b3b6819d9ef778fe86"/>
-        <w:jc w:val="both" pt14:Unid="ad28ef2b9ee646da9dd8936b14e75e3b"/>
+    <w:p pt14:Unid="9ddd6b5a8e85422f8b372148d58ebe28">
+      <w:pPr pt14:Unid="3f2895436e854185ad7ed0fff77d7a22">
+        <w:pStyle w:val="ListBullet" pt14:Unid="c66277d9c093438394ca45dae91108ea"/>
+        <w:spacing w:after="120" w:line="288" w:lineRule="auto" pt14:Unid="2d7b5e9a43b942cfb0f6f7271b8ea150"/>
+        <w:jc w:val="both" pt14:Unid="15740a20869b4ef18f9dd1277665c64a"/>
       </w:pPr>
       <w:r>
         <w:t>Prazos de aviso e cura (default): [ ]</w:t>
       </w:r>
     </w:p>
-    <w:p pt14:Unid="6300b85c26ed45a09e7b2966a332aad6">
-      <w:pPr pt14:Unid="cb6d8bef253b4e609597dfbaeb5fe551">
-        <w:pStyle w:val="ListBullet" pt14:Unid="2af4800667fc4abc8414388fc12bf965"/>
-        <w:spacing w:after="120" w:line="288" w:lineRule="auto" pt14:Unid="0f15c7c1d31f48bb958fac9cbc0a9974"/>
-        <w:jc w:val="both" pt14:Unid="f4189d1714b042689968d9f8f7946e24"/>
+    <w:p pt14:Unid="7393669b2c8e4db3a4c64bcd4f4a5287">
+      <w:pPr pt14:Unid="d8ac5960011d4f099b2739cde2ebdfa1">
+        <w:pStyle w:val="ListBullet" pt14:Unid="12e7ee0550864df08f622fd30833a6e2"/>
+        <w:spacing w:after="120" w:line="288" w:lineRule="auto" pt14:Unid="19ae5239e1f542e593baa4c8a19b9280"/>
+        <w:jc w:val="both" pt14:Unid="33f1c812f55e4f0a82b4d306a06445f1"/>
       </w:pPr>
       <w:r>
         <w:t>Cronograma de assinaturas e registro (Junta, NIRE, Redesim; assinatura digital): [ ]</w:t>
       </w:r>
     </w:p>
-    <w:p pt14:Unid="f938315d734442c7b4c5128c911e368a">
-      <w:pPr pt14:Unid="0affa28fb5534e8687111aeff52c57b2">
-        <w:spacing w:after="120" w:line="288" w:lineRule="auto" pt14:Unid="4f2db5cda2ea4396af48ae54d02049e5"/>
-        <w:jc w:val="both" pt14:Unid="d42d07b88264432ca84e762fec43776c"/>
+    <w:p pt14:Unid="16ad6daf4055485fb981ae903c74597a">
+      <w:pPr pt14:Unid="6130ac235e7648a090624ee106a235e8">
+        <w:spacing w:after="120" w:line="288" w:lineRule="auto" pt14:Unid="2f1d7dc84364456fa75db6da36324743"/>
+        <w:jc w:val="both" pt14:Unid="a3b21774e1cb465e8586e65a7f98388e"/>
       </w:pPr>
       <w:r>
         <w:t>CHECKLIST DE ARQUIVAMENTO (JUNTAS COMERCIAIS — IN DREI 81/2020)</w:t>
       </w:r>
     </w:p>
-    <w:p pt14:Unid="c1f2e55b9bdc4016a6ecc7b4768508f8">
-      <w:pPr pt14:Unid="42fe7bd24fd34511b45840bf9ab335ed">
-        <w:pStyle w:val="ListBullet" pt14:Unid="caf935a23094491f95bf4732ed9cd36a"/>
-        <w:spacing w:after="120" w:line="288" w:lineRule="auto" pt14:Unid="1398aec9f9f64a508785e5f3070c6a8b"/>
-        <w:jc w:val="both" pt14:Unid="985ffbdd7c85409f863e2f8facc01f20"/>
+    <w:p pt14:Unid="c97327aeab5f47a086c0961aacd053c7">
+      <w:pPr pt14:Unid="8f7a6d093dd341ecb98060267de7519a">
+        <w:pStyle w:val="ListBullet" pt14:Unid="7ca1b841b3a548d2a43a276306b321cf"/>
+        <w:spacing w:after="120" w:line="288" w:lineRule="auto" pt14:Unid="80f61ecf751b4005b9ace1a1486e86e8"/>
+        <w:jc w:val="both" pt14:Unid="f07aaeed55e34436900eef39399248e1"/>
       </w:pPr>
       <w:r>
         <w:t>Contrato Social/aditivo em versão “clean”, sem comentários, assinado conforme exigências (assinatura eletrônica válida: ICP-Brasil/gov.br com 2FA, quando aceito).</w:t>
       </w:r>
     </w:p>
-    <w:p pt14:Unid="1066fe5e971d40388c81512c9a5f76c0">
-      <w:pPr pt14:Unid="30cf2ecdcfa945c7b0fcaec53eb2bb27">
-        <w:pStyle w:val="ListBullet" pt14:Unid="0e1f48614ab54359bed8a707ec4a5701"/>
-        <w:spacing w:after="120" w:line="288" w:lineRule="auto" pt14:Unid="32b5f2bb83934d89beaab08b95a715fc"/>
-        <w:jc w:val="both" pt14:Unid="b523363481a34eb08b1e8f1a84bc917c"/>
+    <w:p pt14:Unid="49f6297a9c324a8b842f464b87dd65cf">
+      <w:pPr pt14:Unid="3352f525f4d04fbd9d87d9ee354ad403">
+        <w:pStyle w:val="ListBullet" pt14:Unid="fc9715d0b9d946a48304914d490f4ec8"/>
+        <w:spacing w:after="120" w:line="288" w:lineRule="auto" pt14:Unid="7c7f6a6eda914e3fa817e35c026c16e8"/>
+        <w:jc w:val="both" pt14:Unid="e579c3769ace43afac42747f20425726"/>
       </w:pPr>
       <w:r>
         <w:t>Qualificação completa dos Sócios/administradores (documentos de identidade; CNPJ/Contrato Social, se PJ).</w:t>
       </w:r>
     </w:p>
-    <w:p pt14:Unid="5ac5b36d28b34f9ea7f0a2e7d666bf73">
-      <w:pPr pt14:Unid="a99849e5fe40476697ee90624d9f1a61">
-        <w:pStyle w:val="ListBullet" pt14:Unid="b87f6a566fda4b6490d01cfc3d59bc18"/>
-        <w:spacing w:after="120" w:line="288" w:lineRule="auto" pt14:Unid="cb11feb5aa824c228c09ebfccb69611f"/>
-        <w:jc w:val="both" pt14:Unid="d520e919c4804800a33811afaa5da876"/>
+    <w:p pt14:Unid="f4f3f119594e423fbeede57fa13b4cb3">
+      <w:pPr pt14:Unid="80a7bde1e86b4586ae518b8fcd7c175a">
+        <w:pStyle w:val="ListBullet" pt14:Unid="af21c99690134f3b85a0a9c3ec6b1822"/>
+        <w:spacing w:after="120" w:line="288" w:lineRule="auto" pt14:Unid="f3d63ddc869d44e39ae7ed58c89e22f8"/>
+        <w:jc w:val="both" pt14:Unid="ba8b77d85a874ee8935da0427b97290d"/>
       </w:pPr>
       <w:r>
         <w:t>Indicação do nome empresarial com “Ltda.” e verificação de disponibilidade.</w:t>
       </w:r>
     </w:p>
-    <w:p pt14:Unid="5894613288654a6991e21abb1eaf78ae">
-      <w:pPr pt14:Unid="48d32bafc62a4cc89c586fb07fd50562">
-        <w:pStyle w:val="ListBullet" pt14:Unid="5c16050ab55b4d5698b93744303db08e"/>
-        <w:spacing w:after="120" w:line="288" w:lineRule="auto" pt14:Unid="d9ef5a3049734c47b38ae084ff9d78ec"/>
-        <w:jc w:val="both" pt14:Unid="c231bcc8015d469f8d8b7b318167155d"/>
+    <w:p pt14:Unid="f12dfde5365b47a4a3d8290858be0405">
+      <w:pPr pt14:Unid="1ce3f500442040c4b77022a00e7f62c4">
+        <w:pStyle w:val="ListBullet" pt14:Unid="6affd6f02511464c894b7a225186ec91"/>
+        <w:spacing w:after="120" w:line="288" w:lineRule="auto" pt14:Unid="e864b5f750ce409f9467b111c2a9a4b1"/>
+        <w:jc w:val="both" pt14:Unid="f70a1542e1c24be49345e64e92d584d6"/>
       </w:pPr>
       <w:r>
         <w:t>Endereço completo da sede; CEP, município e UF corretos.</w:t>
       </w:r>
     </w:p>
-    <w:p pt14:Unid="d82df5e56fcb4e5bb73d17f6080f1e61">
-      <w:pPr pt14:Unid="238456490f924265b9e110ed8090dc51">
-        <w:pStyle w:val="ListBullet" pt14:Unid="7b155dd9349745daa4d8327b72b7bdd8"/>
-        <w:spacing w:after="120" w:line="288" w:lineRule="auto" pt14:Unid="bcdd2d27592645f4890987eaee664593"/>
-        <w:jc w:val="both" pt14:Unid="0ca2ba6fac5e4cefbe944318ec01adb7"/>
+    <w:p pt14:Unid="29fdb39355884ad9b7d1ce4c5cd8d3a7">
+      <w:pPr pt14:Unid="f99b21769c6b466e86528c4dcb72fe22">
+        <w:pStyle w:val="ListBullet" pt14:Unid="6dbfc952af05474cb62c5a6a3caece0f"/>
+        <w:spacing w:after="120" w:line="288" w:lineRule="auto" pt14:Unid="819bc4bee7a5433086e950be69caac52"/>
+        <w:jc w:val="both" pt14:Unid="414a6023173f450c9dac74712049c68b"/>
       </w:pPr>
       <w:r>
         <w:t>Objeto social claro e lícito; CNAE principal e secundários consistentes.</w:t>
       </w:r>
     </w:p>
-    <w:p pt14:Unid="dfdd80ddd64d4c24978e0842617cfaf8">
-      <w:pPr pt14:Unid="de23cca26c74408e9643d380e937ae19">
-        <w:pStyle w:val="ListBullet" pt14:Unid="b84321d2b4ad4b3aaca6e575fe0e1f76"/>
-        <w:spacing w:after="120" w:line="288" w:lineRule="auto" pt14:Unid="7ed3d4518c514ade9165e30971d23593"/>
-        <w:jc w:val="both" pt14:Unid="e90377de08ab4dd79bd61f48a08b9d6a"/>
+    <w:p pt14:Unid="ae3a6260cc0b4e239976165d93167c66">
+      <w:pPr pt14:Unid="284d28da4e6747119863c3adcf2df334">
+        <w:pStyle w:val="ListBullet" pt14:Unid="6e98ec649b53466587108ded418dbcb9"/>
+        <w:spacing w:after="120" w:line="288" w:lineRule="auto" pt14:Unid="daec97bd0cc542e1ab5f1fdcecdb97e1"/>
+        <w:jc w:val="both" pt14:Unid="fa70be6ba54348e2b073401f8bc1c8b5"/>
       </w:pPr>
       <w:r>
         <w:t>Capital social, quotas por Sócio, forma e cronograma de integralização; laudo/descrição de bens (se conferência de bens).</w:t>
       </w:r>
     </w:p>
-    <w:p pt14:Unid="ae7cd49feac14872b3a708321e26d1cb">
-      <w:pPr pt14:Unid="f2fcb2bf2582468fac392bf3dc4f854d">
-        <w:pStyle w:val="ListBullet" pt14:Unid="98015df648a44889840d9d5b27c8be90"/>
-        <w:spacing w:after="120" w:line="288" w:lineRule="auto" pt14:Unid="4db841f493b14443916e7edb43c613e6"/>
-        <w:jc w:val="both" pt14:Unid="7db3c82978064334a10b5fd9d23304fb"/>
+    <w:p pt14:Unid="00a8e8f0567a407598f2d6f80e1186c9">
+      <w:pPr pt14:Unid="17fb68c8db704d52b80f3c0e0ca5febf">
+        <w:pStyle w:val="ListBullet" pt14:Unid="afeaa2d86c254b718fd2c7c8edbf06c9"/>
+        <w:spacing w:after="120" w:line="288" w:lineRule="auto" pt14:Unid="a638a7e926344479a0a22e1de7b58935"/>
+        <w:jc w:val="both" pt14:Unid="48cfe51b4fc84cc083aa82826a18f2c0"/>
       </w:pPr>
       <w:r>
         <w:t>Nomeação de administrador(es), poderes e investidura (termo de posse, se exigido).</w:t>
       </w:r>
     </w:p>
-    <w:p pt14:Unid="3df0071640b04921b488826dbdcb23d4">
-      <w:pPr pt14:Unid="46745fcf941f44778de988c955739cf1">
-        <w:pStyle w:val="ListBullet" pt14:Unid="8d8cebfddc9f43fba4ce4bf78ac36aa6"/>
-        <w:spacing w:after="120" w:line="288" w:lineRule="auto" pt14:Unid="f0d7636307dd49b3a18defa77899397e"/>
-        <w:jc w:val="both" pt14:Unid="2799e9d21be243e19f374b3e375bd256"/>
+    <w:p pt14:Unid="e1e26ee361554c03b5907daa64627b6b">
+      <w:pPr pt14:Unid="a718f1b3562c452aa2c04df6deb04c62">
+        <w:pStyle w:val="ListBullet" pt14:Unid="ab24b7650d3347b485944a4db5291e0f"/>
+        <w:spacing w:after="120" w:line="288" w:lineRule="auto" pt14:Unid="8bd1848bd1334a0d8bb745ba866b18f5"/>
+        <w:jc w:val="both" pt14:Unid="552e4652434a48b0b443169fb5b3403e"/>
       </w:pPr>
       <w:r>
         <w:t>Regras de cessão de quotas e preferência; menção ao art. 1.057 do CC.</w:t>
       </w:r>
     </w:p>
-    <w:p pt14:Unid="3eed08536de64ab6949a81ab306c692f">
-      <w:pPr pt14:Unid="f04fef4504ac4998bdf35b4a59def3d8">
-        <w:pStyle w:val="ListBullet" pt14:Unid="5b7afa1609e4477196e129aec7843635"/>
-        <w:spacing w:after="120" w:line="288" w:lineRule="auto" pt14:Unid="5c010da1236f4ae7b04f39e2f4184f2a"/>
-        <w:jc w:val="both" pt14:Unid="c849d2b9c3ad485d8f7c1c2bd3bb8782"/>
+    <w:p pt14:Unid="1a9838497a4943f49290ea1fb64edb89">
+      <w:pPr pt14:Unid="9bd6375193ec4339a87ec8245ee0b274">
+        <w:pStyle w:val="ListBullet" pt14:Unid="a56dd1c7251f487d8b94e2f1c3deb38c"/>
+        <w:spacing w:after="120" w:line="288" w:lineRule="auto" pt14:Unid="9af0146cc94748ad9f5d70b5d6e76699"/>
+        <w:jc w:val="both" pt14:Unid="20c4cdf9a2a643a79873a4b3b03aaa62"/>
       </w:pPr>
       <w:r>
         <w:t>Prazo de duração; exercício social; foro/arbitragem.</w:t>
       </w:r>
     </w:p>
-    <w:p pt14:Unid="5f8c136b666c46e0bba92f9708468b66">
-      <w:pPr pt14:Unid="6da133182e6a40d598541c4c8d45b8ec">
-        <w:pStyle w:val="ListBullet" pt14:Unid="fd3193627e584066a162b6ba66974a04"/>
-        <w:spacing w:after="120" w:line="288" w:lineRule="auto" pt14:Unid="8097a53669b44324b9382ded61e537c8"/>
-        <w:jc w:val="both" pt14:Unid="89aec8175fbc4a088657a429d98b8860"/>
+    <w:p pt14:Unid="ff76614f25f2485d9fa5e6d4c01ffab7">
+      <w:pPr pt14:Unid="6081ee26ee4b40bd9b519b9b88d3aa7c">
+        <w:pStyle w:val="ListBullet" pt14:Unid="d4ba2f42d3634590b89834b3097159d9"/>
+        <w:spacing w:after="120" w:line="288" w:lineRule="auto" pt14:Unid="a163533a174f4ec4801ccfbb3510313d"/>
+        <w:jc w:val="both" pt14:Unid="ad7741da2e3a4eecaa5a684eb9e3a288"/>
       </w:pPr>
       <w:r>
         <w:t>Taxas de arquivamento pagas; DARF/DUA e comprovantes anexos.</w:t>
       </w:r>
     </w:p>
-    <w:p pt14:Unid="11c6236b38b142218f9d213f10ffc23f">
-      <w:pPr pt14:Unid="af08d96c27034984a5c1d6e446e6c8b5">
-        <w:pStyle w:val="ListBullet" pt14:Unid="a49d7ad7007b4313b4ada481a89dddd0"/>
-        <w:spacing w:after="120" w:line="288" w:lineRule="auto" pt14:Unid="8dd67de40766443884246d9343fdde23"/>
-        <w:jc w:val="both" pt14:Unid="2891839aedf843a79e660a18490aafd3"/>
+    <w:p pt14:Unid="e1bb82fd06794ff1aacfa7f3da2f7e81">
+      <w:pPr pt14:Unid="e31e95861a9945be9c0608daaa24bb87">
+        <w:pStyle w:val="ListBullet" pt14:Unid="2797da3aebde4c5db4ddf27a91d9c81e"/>
+        <w:spacing w:after="120" w:line="288" w:lineRule="auto" pt14:Unid="b560bea345244b3fa40a60bfb405f0bf"/>
+        <w:jc w:val="both" pt14:Unid="2a8cd1c23d404742ae7d94900a665a02"/>
       </w:pPr>
       <w:r>
         <w:t>Procurações (se assinaturas por mandatários), com poderes específicos e reconhecimento exigido.</w:t>
       </w:r>
     </w:p>
-    <w:p pt14:Unid="f2d761e314d842aa97ee0dc28a1503f8">
-      <w:pPr pt14:Unid="16eaab33b10c4d7e98f713e1152f67ab">
-        <w:pStyle w:val="ListBullet" pt14:Unid="cbf4034f0cb946dd8a93dfa45a09a7be"/>
-        <w:spacing w:after="120" w:line="288" w:lineRule="auto" pt14:Unid="65f6f57b683a4070846169f1ed322d1c"/>
-        <w:jc w:val="both" pt14:Unid="ccbfef6b367e4530899ca899aa074c86"/>
+    <w:p pt14:Unid="512dd52e66de448d9e8bcbbec26ffde9">
+      <w:pPr pt14:Unid="f03708e5ee04423bb3bce69f1534cc53">
+        <w:pStyle w:val="ListBullet" pt14:Unid="b8dadf100436435f8098fc9d846bb93a"/>
+        <w:spacing w:after="120" w:line="288" w:lineRule="auto" pt14:Unid="7a8ba765a4c84a0289381a13d1da6375"/>
+        <w:jc w:val="both" pt14:Unid="3957e0779e864cc1b04125880baaff3f"/>
       </w:pPr>
       <w:r>
         <w:t>Coerência com Acordo de Quotistas (se houver) e eventual arquivamento de extratos, quando aplicável.</w:t>
       </w:r>
     </w:p>
-    <w:p pt14:Unid="af036f1fd8c341e7bce0b40c504bb1ca">
-      <w:pPr pt14:Unid="be0fa65b288640cea5a7b1c860b982ca">
-        <w:pStyle w:val="ListBullet" pt14:Unid="8b89358f618e4c54866995f95b70783c"/>
-        <w:spacing w:after="120" w:line="288" w:lineRule="auto" pt14:Unid="8f95fabdcf08477f9e2d9e87ee75e0db"/>
-        <w:jc w:val="both" pt14:Unid="a7f1f59dcf7247009f415f890dc33a09"/>
+    <w:p pt14:Unid="c83b653e2e5349ff85f0f67c81589851">
+      <w:pPr pt14:Unid="2f431b1724b94d6ca4b7b0ac19be44f7">
+        <w:pStyle w:val="ListBullet" pt14:Unid="1cfb2074fb0c4ac0bf1b5b30baec0a84"/>
+        <w:spacing w:after="120" w:line="288" w:lineRule="auto" pt14:Unid="ba35536d869c4ff0b55441e3c9f69afb"/>
+        <w:jc w:val="both" pt14:Unid="bcc85a56ba1c452b8b09c779f4771175"/>
       </w:pPr>
       <w:r>
         <w:t>Integração com Redesim; obtenção/regularização de NIRE e CNPJ.</w:t>
       </w:r>
     </w:p>
-    <w:p pt14:Unid="2d6aa9dfebb2499991d0d281796b4836">
-      <w:pPr pt14:Unid="202ed0b159c54b30a73d9dc05fe40159">
-        <w:pStyle w:val="ListBullet" pt14:Unid="4b5e2e99a06844cba8177d9852f37e8b"/>
-        <w:spacing w:after="120" w:line="288" w:lineRule="auto" pt14:Unid="9700c36f423e46ddbcb4ed0861ad53d6"/>
-        <w:jc w:val="both" pt14:Unid="cef038e4d359418aaf64c99102847e88"/>
+    <w:p pt14:Unid="aebda928a0e644e29b0778b933a1355c">
+      <w:pPr pt14:Unid="03d9c9fec94b497ea7418a60fd470b69">
+        <w:pStyle w:val="ListBullet" pt14:Unid="f02d494996034675a94a4137f1ccda03"/>
+        <w:spacing w:after="120" w:line="288" w:lineRule="auto" pt14:Unid="4c55017fd5e14679a7237d7018cfd0bb"/>
+        <w:jc w:val="both" pt14:Unid="9551d25b46904a398361ea0668007289"/>
       </w:pPr>
       <w:r>
         <w:t>Reuniões/assembleias digitais admitidas e formato de atas conforme IN DREI 81/2020.</w:t>
       </w:r>
     </w:p>
-    <w:p pt14:Unid="61546e42fc1a4b798a25828988dca12f">
-      <w:pPr pt14:Unid="fa79de5d910d439c8705bd8ac5f3b7b9">
-        <w:spacing w:after="120" w:line="288" w:lineRule="auto" pt14:Unid="6837034fad874d35871d0cf7caddee25"/>
-        <w:jc w:val="both" pt14:Unid="260920438b934efb947f6c676fd502c3"/>
+    <w:p pt14:Unid="4ef050268a444e61ae31b240ba14dc29">
+      <w:pPr pt14:Unid="2d0fe0ece61249f1830fd4bdb1b7f191">
+        <w:spacing w:after="120" w:line="288" w:lineRule="auto" pt14:Unid="93440cbb06e94fb8945470ad006ccdfe"/>
+        <w:jc w:val="both" pt14:Unid="c264a3d998024509be6ad43c5ed9ccce"/>
       </w:pPr>
       <w:r>
         <w:t>NOTAS DE REDAÇÃO (EXPLICATIVAS)</w:t>
       </w:r>
     </w:p>
-    <w:p pt14:Unid="733bbe99d3ea4f7db128e49c031b7bae">
-      <w:pPr pt14:Unid="20640a6a514f41dbba1e329899c60b2f">
-        <w:pStyle w:val="ListBullet" pt14:Unid="992d7e276f7044998150ec5dac96ad0e"/>
-        <w:spacing w:after="120" w:line="288" w:lineRule="auto" pt14:Unid="0d2e85e8e60c4cce8fe81d6924898f62"/>
-        <w:jc w:val="both" pt14:Unid="9a63b5c30c814605a64b4413c65e6fbf"/>
+    <w:p pt14:Unid="c32c33add29546e89a9749140b53ab25">
+      <w:pPr pt14:Unid="8cd8b352504b48a6855aa5cb8ff0f513">
+        <w:pStyle w:val="ListBullet" pt14:Unid="0bd30a70ee714e998f44ed94410d2694"/>
+        <w:spacing w:after="120" w:line="288" w:lineRule="auto" pt14:Unid="2cd07af9b3524ddd9764088ea331d8b0"/>
+        <w:jc w:val="both" pt14:Unid="6bdc7ddbff0d4dfa9a6b7ba31bc40c24"/>
       </w:pPr>
       <w:r>
         <w:t>Elementos essenciais (CC, art. 997): incluídos nome empresarial, objeto, sede, prazo, capital/quotas e modo de realizá-lo, administração e poderes, participação nos resultados, foro, local/data e assinaturas.</w:t>
       </w:r>
     </w:p>
-    <w:p pt14:Unid="62aeac4111ca462db8e181910a3b1a4d">
-      <w:pPr pt14:Unid="d24b9317f1d544bda1cac65e4b94ab64">
-        <w:pStyle w:val="ListBullet" pt14:Unid="c559ede16de646eb9cbf09042b97b24e"/>
-        <w:spacing w:after="120" w:line="288" w:lineRule="auto" pt14:Unid="faa2c47d044d41d2918c068dbdbddee8"/>
-        <w:jc w:val="both" pt14:Unid="5142d5716aa34f0a871ec3ac6e423d2d"/>
+    <w:p pt14:Unid="6c42f102d3de4bdfb1419d4082266598">
+      <w:pPr pt14:Unid="1d07c167ed2a4a7f8faf45a920acf9be">
+        <w:pStyle w:val="ListBullet" pt14:Unid="f05950175b2345e2bd68601dee34902d"/>
+        <w:spacing w:after="120" w:line="288" w:lineRule="auto" pt14:Unid="6e2ab96ce9e1483aa60b9387a04c7202"/>
+        <w:jc w:val="both" pt14:Unid="3f2da657cfa24cb4af2f4d3c2d8e1d0e"/>
       </w:pPr>
       <w:r>
         <w:t>Quóruns (Lei 14.451/2022): Atualizados arts. 1.061 (2/3 antes da integralização do capital e maioria após) e 1.076 (2/3 para alteração do contrato, M&amp;A e dissolução; maioria para demais matérias). Considere reforços contratuais em Matérias Reservadas.</w:t>
       </w:r>
     </w:p>
-    <w:p pt14:Unid="4b72ee1e72c144b0a114d35d4ee02b48">
-      <w:pPr pt14:Unid="0c68e5e80fc34172b3e64b758c928d13">
-        <w:pStyle w:val="ListBullet" pt14:Unid="240c52d57c03464b96a273fbc37d0cdd"/>
-        <w:spacing w:after="120" w:line="288" w:lineRule="auto" pt14:Unid="1be317dd64c6442f8851a96ce393541d"/>
-        <w:jc w:val="both" pt14:Unid="e09e2131d42d4c04ab94987188a5348b"/>
+    <w:p pt14:Unid="175ebdd6fd284a768559658411ad6e3a">
+      <w:pPr pt14:Unid="8b9f346df97145178a8dfcf095d4416c">
+        <w:pStyle w:val="ListBullet" pt14:Unid="27de670106854387a1fcc6b696ae0a4f"/>
+        <w:spacing w:after="120" w:line="288" w:lineRule="auto" pt14:Unid="6d9f6d62984a449b8d952b81bb096b66"/>
+        <w:jc w:val="both" pt14:Unid="242813700e4b402ba6af2172a033f473"/>
       </w:pPr>
       <w:r>
         <w:t>Cessão de quotas (CC, art. 1.057): Preferência dos Sócios e consentimento para terceiros; eficácia perante terceiros depende de arquivamento.</w:t>
       </w:r>
     </w:p>
-    <w:p pt14:Unid="b526d4ff8fa344feb5d9a3fb4f594460">
-      <w:pPr pt14:Unid="5c80804fc95a4a0e905c408b4e4c0b00">
-        <w:pStyle w:val="ListBullet" pt14:Unid="4cdfbd92581e4141a9135a5c78ea2df1"/>
-        <w:spacing w:after="120" w:line="288" w:lineRule="auto" pt14:Unid="deefe537b969419a8bcb0b1927a9256a"/>
-        <w:jc w:val="both" pt14:Unid="fcb286e627804a5bb3cb8fd1746d44d9"/>
+    <w:p pt14:Unid="ae38d9f7bdeb4668bc0ca659180f84b3">
+      <w:pPr pt14:Unid="984c908bd7bf44eaa058a81aa2421504">
+        <w:pStyle w:val="ListBullet" pt14:Unid="c28a0bc4be114c29b28b4454c7ddc783"/>
+        <w:spacing w:after="120" w:line="288" w:lineRule="auto" pt14:Unid="1e454c4047ef4f1fa5a63f08d0eb4c74"/>
+        <w:jc w:val="both" pt14:Unid="c5cc51ac06c54560ab6ccf6524379dd6"/>
       </w:pPr>
       <w:r>
         <w:t>Exclusão extrajudicial (CC, art. 1.085): Requer previsão contratual, falta grave, deliberação de mais da metade do capital, convocação específica e garantia de defesa. A eficácia interna de aditivos entre sócios é reconhecida pela jurisprudência, sem prejuízo do arquivamento para oponibilidade erga omnes.</w:t>
       </w:r>
     </w:p>
-    <w:p pt14:Unid="8d43b1d7859c428099fc0fd91f3e0db4">
-      <w:pPr pt14:Unid="3b74ccfeed4249f2bd978bc9b75a5904">
-        <w:pStyle w:val="ListBullet" pt14:Unid="b66bf183c1bb48cbb0f9393368d34af0"/>
-        <w:spacing w:after="120" w:line="288" w:lineRule="auto" pt14:Unid="71413bd99f124f73800bb1c3d0c8913c"/>
-        <w:jc w:val="both" pt14:Unid="72f52c2df9804f4eabca5254834aa61b"/>
+    <w:p pt14:Unid="79c3072e2c624eb38c78b6c4a95ad7d5">
+      <w:pPr pt14:Unid="3e4f9d2e6cc043718c9246dfe576433f">
+        <w:pStyle w:val="ListBullet" pt14:Unid="0a69dffd7ae144aabee7aa0b55e0cdee"/>
+        <w:spacing w:after="120" w:line="288" w:lineRule="auto" pt14:Unid="b1aab20182c44493bf0b76d92db5e1de"/>
+        <w:jc w:val="both" pt14:Unid="9636ac243d0647e487e64a29117bdd36"/>
       </w:pPr>
       <w:r>
         <w:t>Regência supletiva LSA (CC, art. 1.053, parágrafo único): Útil para coerência de mecanismos como tag/drag e governança; ligar ON/OFF no Term Sheet e refletir efeitos nos quóruns e formalidades de assembleias.</w:t>
       </w:r>
     </w:p>
-    <w:p pt14:Unid="6bb030e30a9849d7a5ae1f34a8999845">
-      <w:pPr pt14:Unid="121cc464b2894438a2d214516f0c3a6a">
-        <w:pStyle w:val="ListBullet" pt14:Unid="5cb4c67c130a4bd09545d0a4ed1ab4f7"/>
-        <w:spacing w:after="120" w:line="288" w:lineRule="auto" pt14:Unid="96e9b7f20e2a438f80f1ea979c442f26"/>
-        <w:jc w:val="both" pt14:Unid="bcacc40b99c0417886e391e7835cb974"/>
+    <w:p pt14:Unid="ceaf63b37c2143208bbfaca04aad6c68">
+      <w:pPr pt14:Unid="06e6858052af4629b359db52a7f9ff5a">
+        <w:pStyle w:val="ListBullet" pt14:Unid="ba0e9e7edeae4300b8766296441e18c7"/>
+        <w:spacing w:after="120" w:line="288" w:lineRule="auto" pt14:Unid="3e12e1d64c644271abfecfc5c2db607a"/>
+        <w:jc w:val="both" pt14:Unid="1849c6ed08964201adfb17ade0145a5b"/>
       </w:pPr>
       <w:r>
         <w:t>Distribuição de lucros: É possível modular regras desde que não exclua Sócio dos lucros e respeite a boa-fé. Recomenda-se cautela e fundamentação contábil. [NOTA: verifique jurisprudência e informativos atualizados à época da assinatura.]</w:t>
       </w:r>
     </w:p>
-    <w:p pt14:Unid="48815d84112248a683ffcb492a9f4102">
-      <w:pPr pt14:Unid="9f6f9e9f8707459a9ccebb1cb8e9ca67">
-        <w:pStyle w:val="ListBullet" pt14:Unid="1ff833a71275444e8fdf02a96ef6aed1"/>
-        <w:spacing w:after="120" w:line="288" w:lineRule="auto" pt14:Unid="92b7f0b352104b0a9e5e6ecd3d4d0634"/>
-        <w:jc w:val="both" pt14:Unid="2a243578407145b7b0fb8aaf5fbb47de"/>
+    <w:p pt14:Unid="407aef89987c4b089a6cb6a407c5dcf7">
+      <w:pPr pt14:Unid="6d471468f7864c009eb4a126826a5cdc">
+        <w:pStyle w:val="ListBullet" pt14:Unid="3e674a0a03454a5a8bb6b6edc1b2e9e4"/>
+        <w:spacing w:after="120" w:line="288" w:lineRule="auto" pt14:Unid="4c01e9d59b3d4a09b4dc055b60cd3eeb"/>
+        <w:jc w:val="both" pt14:Unid="ee1ff2d4338b4ea493ccf3c47ef68109"/>
       </w:pPr>
       <w:r>
         <w:t>Não concorrência: Mantenha limites proporcionais (tempo/território/escopo) e, se possível, compensação financeira para robustez. Evite vedações excessivas ou indeterminadas.</w:t>
       </w:r>
     </w:p>
-    <w:p pt14:Unid="c074bbff00fd43b3899775a10b865f42">
-      <w:pPr pt14:Unid="c1a5864be0e2418baca1cf4f03300825">
-        <w:pStyle w:val="ListBullet" pt14:Unid="948788cf5ab149f18437a225ef1311c4"/>
-        <w:spacing w:after="120" w:line="288" w:lineRule="auto" pt14:Unid="c3f65683524242e4a3a84f0b915d4d7b"/>
-        <w:jc w:val="both" pt14:Unid="33ef0f394c884cfa86f9e484c057ddac"/>
+    <w:p pt14:Unid="a40c029ea9c242068038c5e9b2796c9d">
+      <w:pPr pt14:Unid="5cdf0758a98f46cb829cf28deaa23a8c">
+        <w:pStyle w:val="ListBullet" pt14:Unid="88ac0ca05275419f84cca86846b74e4a"/>
+        <w:spacing w:after="120" w:line="288" w:lineRule="auto" pt14:Unid="071aa41820ed491fbea57cb3bceabe03"/>
+        <w:jc w:val="both" pt14:Unid="c0cd68761fbe465289c4c711a6036b87"/>
       </w:pPr>
       <w:r>
         <w:t>Arbitragem: Cláusula compromissória institucional com sede, idioma e confidencialidade; medidas de urgência não afastam a competência arbitral. Verifique regulamentos da Câmara escolhida (p.ex., CAM-CCBC, CAM-B3, CBMA).</w:t>
       </w:r>
     </w:p>
-    <w:p pt14:Unid="bdcb05916fe042619488684e18f0dd09">
-      <w:pPr pt14:Unid="96ecc6c53dd84d8d928408e315c428b6">
-        <w:pStyle w:val="ListBullet" pt14:Unid="78692c81a7a647839808cd120108b545"/>
-        <w:spacing w:after="120" w:line="288" w:lineRule="auto" pt14:Unid="ab5f7c6195df4c7197b137f533b419d1"/>
-        <w:jc w:val="both" pt14:Unid="77d94c5e893543f29911cf1be9a9df88"/>
+    <w:p pt14:Unid="205e3fd2b8044cf59fbad24ce7b167b8">
+      <w:pPr pt14:Unid="1653865eb95c460cbe863c55fc5b49e3">
+        <w:pStyle w:val="ListBullet" pt14:Unid="c00e29936be74cccb656fa5f7f9456b8"/>
+        <w:spacing w:after="120" w:line="288" w:lineRule="auto" pt14:Unid="142a2e871fc3431e87bcf4399b431349"/>
+        <w:jc w:val="both" pt14:Unid="a6f9c928fae74edba468ea7eadfe2624"/>
       </w:pPr>
       <w:r>
         <w:t>LGPD e compliance: Preveja políticas internas, DPO quando cabível, contratos com operadores e resposta a incidentes. Cláusulas anticorrupção alinhadas ao Decreto 11.129/2022.</w:t>
       </w:r>
     </w:p>
-    <w:p pt14:Unid="87ff2985d1634a1fbe9747e5204600ce">
-      <w:pPr pt14:Unid="af22d6df754443c49d6b7e1400a5dcec">
-        <w:pStyle w:val="ListBullet" pt14:Unid="babf76d93bba4113bf7c5ec52107018f"/>
-        <w:spacing w:after="120" w:line="288" w:lineRule="auto" pt14:Unid="1e15d9af8be44d23b4d368d9505b0a64"/>
-        <w:jc w:val="both" pt14:Unid="7bc34f28fcac489bbf351f2785a17346"/>
+    <w:p pt14:Unid="998b40da671f4b99902b7b4033589b36">
+      <w:pPr pt14:Unid="a00f283b36c743f5a4bc8529fe9407e9">
+        <w:pStyle w:val="ListBullet" pt14:Unid="30452a1375464183b7bc8ab4d56b79e7"/>
+        <w:spacing w:after="120" w:line="288" w:lineRule="auto" pt14:Unid="325c595c254c4ef6aebff283311bcf32"/>
+        <w:jc w:val="both" pt14:Unid="622e8603f6784b6ab7c4d7189d277f9b"/>
       </w:pPr>
       <w:r>
         <w:t>Serviços como capital: Em LTDA empresária, a conferência em serviços é controvertida e usualmente não admitida; prefira dinheiro/bens. Estruture vesting via opções ou aumento condicionado, não como integralização por serviços.</w:t>
       </w:r>
     </w:p>
-    <w:p pt14:Unid="4d94706b7dd94ad78a7e37932957bf50">
-      <w:pPr pt14:Unid="d8101c71042e4552891b000c63afd269">
-        <w:pStyle w:val="ListBullet" pt14:Unid="14d06ae3e0d841f291c39670a3d23d95"/>
-        <w:spacing w:after="120" w:line="288" w:lineRule="auto" pt14:Unid="33f6a62f8dba4ce9997ea53e47f65439"/>
-        <w:jc w:val="both" pt14:Unid="67cf8058cdda444fbd65b7d4cbeb7d1a"/>
+    <w:p pt14:Unid="e9c9de87585f46d49721f1ec615bb265">
+      <w:pPr pt14:Unid="1e92c656d6634e7d8f19be7a2b49ab8d">
+        <w:pStyle w:val="ListBullet" pt14:Unid="6af84f8d7319434eb04b3bab58cb7195"/>
+        <w:spacing w:after="120" w:line="288" w:lineRule="auto" pt14:Unid="55cc1fa731bc4a7d95f57ac2c08bd47d"/>
+        <w:jc w:val="both" pt14:Unid="32201d871a4b451db75557d8aa48b072"/>
       </w:pPr>
       <w:r>
         <w:t>Assinatura eletrônica: Juntas vêm aceitando ICP-Brasil e, conforme normativas e ofícios, autenticação via gov.br com múltiplo fator. Confirme o protocolo local antes do protocolo do ato.</w:t>
       </w:r>
     </w:p>
-    <w:p pt14:Unid="12cc896fdcb248e58d87f7ced983daba">
-      <w:pPr pt14:Unid="a185b600cbd74228871ad6c023d60686">
-        <w:pStyle w:val="ListBullet" pt14:Unid="79883a484e614a598bda8f60048bcb9d"/>
-        <w:spacing w:after="120" w:line="288" w:lineRule="auto" pt14:Unid="ab314a06593c4a46a7825a4768bf0a3b"/>
-        <w:jc w:val="both" pt14:Unid="d07c5e57ba2a4a3287f1f741e9097186"/>
+    <w:p pt14:Unid="e1ebb9c71d8a437e8debe31d20dd14ba">
+      <w:pPr pt14:Unid="427988ec322b4e8da39a4e47015959c2">
+        <w:pStyle w:val="ListBullet" pt14:Unid="e168a5b0857140ce88b5d84fe353b52e"/>
+        <w:spacing w:after="120" w:line="288" w:lineRule="auto" pt14:Unid="35a1def171e74b508336a57744b2101c"/>
+        <w:jc w:val="both" pt14:Unid="a98ec55e86ae4da29ca3735b120ce8b6"/>
       </w:pPr>
       <w:r>
         <w:t>Acordo de Quotistas: Garanta coerência entre este Contrato e o acordo parassocial (direitos de veto, informações, tag/drag). Se houver divergência, alinhar cláusulas ou definir prevalência.</w:t>
       </w:r>
     </w:p>
-    <w:p pt14:Unid="b69d6ea5370b4bc69f72a31c13b80fab">
-      <w:pPr pt14:Unid="98f77d9ea89945cd9af27cf578ae4deb">
-        <w:spacing w:after="120" w:line="288" w:lineRule="auto" pt14:Unid="5545fb0488aa42cd810f953b9fafb935"/>
-        <w:jc w:val="both" pt14:Unid="914cb11482284472a1757456e982c174"/>
+    <w:p pt14:Unid="3f18002d8d4d438bbc734f653c2133ec">
+      <w:pPr pt14:Unid="366584e35adb4164b15fecd50c10ff4c">
+        <w:spacing w:after="120" w:line="288" w:lineRule="auto" pt14:Unid="2b629a6303df4b59b33bb481cf1a1eff"/>
+        <w:jc w:val="both" pt14:Unid="5f0bda5ae18f4dfdad3e633ed77d4f57"/>
       </w:pPr>
       <w:r>
         <w:t>GLOSSÁRIO PT–EN (OPCIONAL)</w:t>
       </w:r>
     </w:p>
-    <w:p pt14:Unid="666e80b510ca4dc793c22b1cb44cf2ee">
-      <w:pPr pt14:Unid="2191b284844149b3b56e61678c36c856">
-        <w:pStyle w:val="ListBullet" pt14:Unid="18907940bcc64b3c866869ae5c61cb50"/>
-        <w:spacing w:after="120" w:line="288" w:lineRule="auto" pt14:Unid="42cb938d0ef74fb58f341cdffe15a470"/>
-        <w:jc w:val="both" pt14:Unid="2d23cd93d40140beb5fe732fec282d12"/>
+    <w:p pt14:Unid="4b1a1b9a5e8e427e9a3ba46435ccc5f1">
+      <w:pPr pt14:Unid="7917f460e0234fd296b3e2299df54446">
+        <w:pStyle w:val="ListBullet" pt14:Unid="025fdbfa329f4dbbafcc2d93f4e21f22"/>
+        <w:spacing w:after="120" w:line="288" w:lineRule="auto" pt14:Unid="3a26a134f9cc46e394f68356382587fd"/>
+        <w:jc w:val="both" pt14:Unid="b369415b1ff34d779069ab9e0cd3a6ce"/>
       </w:pPr>
       <w:r>
         <w:t>Sociedade Limitada (LTDA): Limited Liability Company.</w:t>
       </w:r>
     </w:p>
-    <w:p pt14:Unid="982a7d8a99ee48cab65552186cad88e1">
-      <w:pPr pt14:Unid="4917aa1ed9fe424a803d4da5be312ae2">
-        <w:pStyle w:val="ListBullet" pt14:Unid="1c50ea6b397640638e398d62cff52d1b"/>
-        <w:spacing w:after="120" w:line="288" w:lineRule="auto" pt14:Unid="949cd25610eb4f069d3b20232eba01e0"/>
-        <w:jc w:val="both" pt14:Unid="dea650eced334ce8ab4007a74a14d205"/>
+    <w:p pt14:Unid="c727bc16a72d4b4d94443421c18c6dc3">
+      <w:pPr pt14:Unid="d8e20b221b6d4bf38aed66a85a3373cb">
+        <w:pStyle w:val="ListBullet" pt14:Unid="f2a20b081ae5423ab80ff1110201c689"/>
+        <w:spacing w:after="120" w:line="288" w:lineRule="auto" pt14:Unid="90796279c2d542b1b379638ffd082a45"/>
+        <w:jc w:val="both" pt14:Unid="19225adcc26c4b969cd67632b045ef78"/>
       </w:pPr>
       <w:r>
         <w:t>Quotas: Units/Equity interests.</w:t>
       </w:r>
     </w:p>
-    <w:p pt14:Unid="f72b08d140844389a3baa1db7dff7687">
-      <w:pPr pt14:Unid="25d43ee67bfc4db7906539de716a7304">
-        <w:pStyle w:val="ListBullet" pt14:Unid="54dcdee7ed8d40d6a0cbf35c4fe2d717"/>
-        <w:spacing w:after="120" w:line="288" w:lineRule="auto" pt14:Unid="b97dfb96cd5e4ffa9b22826c9dea6c85"/>
-        <w:jc w:val="both" pt14:Unid="a8d9d59e8aaa4018a965fe415eaa1935"/>
+    <w:p pt14:Unid="83a1d903d2c94aa69458813bb684d386">
+      <w:pPr pt14:Unid="4c8f142515da47fda869c5dc67cdf883">
+        <w:pStyle w:val="ListBullet" pt14:Unid="66489eae0b40469289ba2133dadcb41f"/>
+        <w:spacing w:after="120" w:line="288" w:lineRule="auto" pt14:Unid="d1656eee080d4ae582ea6499c874881a"/>
+        <w:jc w:val="both" pt14:Unid="7b562c29b2e3461983b69732a82e4d53"/>
       </w:pPr>
       <w:r>
         <w:t>Sócio: Quotaholder/Partner.</w:t>
       </w:r>
     </w:p>
-    <w:p pt14:Unid="cfd4febd80bc40d98c472c46a8909e6d">
-      <w:pPr pt14:Unid="b745521db731487db88f6d1c5e63b2d9">
-        <w:pStyle w:val="ListBullet" pt14:Unid="9b2819c1787c44aab172f99f53d39fbf"/>
-        <w:spacing w:after="120" w:line="288" w:lineRule="auto" pt14:Unid="44c8b63bb18b47558bbb86826e064b97"/>
-        <w:jc w:val="both" pt14:Unid="54f8f9396318476297d00968e579b3cf"/>
+    <w:p pt14:Unid="03062a6f86fd4dd1bf4c8c29c64b2956">
+      <w:pPr pt14:Unid="449c2bb82ec84d609ae9047be7314c6d">
+        <w:pStyle w:val="ListBullet" pt14:Unid="2023a0013c0b4bccbb5e3c2c5d176eca"/>
+        <w:spacing w:after="120" w:line="288" w:lineRule="auto" pt14:Unid="b5d441dafbfa41c79118ff7f8ded1858"/>
+        <w:jc w:val="both" pt14:Unid="460d3da6aa51415188695bcf420069da"/>
       </w:pPr>
       <w:r>
         <w:t>Aumento de capital: Capital increase.</w:t>
       </w:r>
     </w:p>
-    <w:p pt14:Unid="465e04eaca484bbeac007b82a243364b">
-      <w:pPr pt14:Unid="0b032d55f1ad484cb92403aae2346bf7">
-        <w:pStyle w:val="ListBullet" pt14:Unid="a6efdaa1b88f45a4a832763bbff2a7fa"/>
-        <w:spacing w:after="120" w:line="288" w:lineRule="auto" pt14:Unid="74beff1857ed4e1a808979e26ff7cf77"/>
-        <w:jc w:val="both" pt14:Unid="f7df20dd0e8e41259bcc3c46f65d59bc"/>
+    <w:p pt14:Unid="9042cf29d6944f7fbf50f000ccb66524">
+      <w:pPr pt14:Unid="25a770241f274f13a77eff5e342b4f35">
+        <w:pStyle w:val="ListBullet" pt14:Unid="4c5a1d3b445544259d1f9686f72c6fcc"/>
+        <w:spacing w:after="120" w:line="288" w:lineRule="auto" pt14:Unid="232dda6e11c54f5e8417eb18716dacb3"/>
+        <w:jc w:val="both" pt14:Unid="b00775f571444ffe8173417defa7117e"/>
       </w:pPr>
       <w:r>
         <w:t>Direito de preferência: Preemptive right.</w:t>
       </w:r>
     </w:p>
-    <w:p pt14:Unid="7336ce8d76564b3db666b288bb855c76">
-      <w:pPr pt14:Unid="41d731e24111434cb9b6485901281319">
-        <w:pStyle w:val="ListBullet" pt14:Unid="4b00c82defca4918acc03ccc92b318dd"/>
-        <w:spacing w:after="120" w:line="288" w:lineRule="auto" pt14:Unid="a75b2b9ad55845cf86df830d8e1612ef"/>
-        <w:jc w:val="both" pt14:Unid="8e3bd6cb6af6452db75f1b5980a892c5"/>
+    <w:p pt14:Unid="2314462bf47041ce9566e03f11420757">
+      <w:pPr pt14:Unid="158a5ed157614f978c8764d45a3b1f85">
+        <w:pStyle w:val="ListBullet" pt14:Unid="878cfac9076f424b89c5bead53859058"/>
+        <w:spacing w:after="120" w:line="288" w:lineRule="auto" pt14:Unid="c94f33f874ed45b99a34184e9646e5da"/>
+        <w:jc w:val="both" pt14:Unid="e6a22844baec42c3944c96568e2a93ec"/>
       </w:pPr>
       <w:r>
         <w:t>Lock-up: Lock-up.</w:t>
       </w:r>
     </w:p>
-    <w:p pt14:Unid="54ca3e73d89b47f6a9d30bb7e92ac29b">
-      <w:pPr pt14:Unid="74890b90248f4c8789e75a9f11c8215d">
-        <w:pStyle w:val="ListBullet" pt14:Unid="1d733fdc5e62400b9ce94b958307b135"/>
-        <w:spacing w:after="120" w:line="288" w:lineRule="auto" pt14:Unid="fbd55c7f850844378d77f4c3cd8e0189"/>
-        <w:jc w:val="both" pt14:Unid="60ae8ca79c7a4725a1bda3c4988e614b"/>
+    <w:p pt14:Unid="693326cf61d7412fa406ae50c2778a52">
+      <w:pPr pt14:Unid="bdd93338852e42c28cb4336087f5d156">
+        <w:pStyle w:val="ListBullet" pt14:Unid="74ec6a67939c475aa4a83cbc4fc577b4"/>
+        <w:spacing w:after="120" w:line="288" w:lineRule="auto" pt14:Unid="52715e0d7e5d4309b103c93605ac888b"/>
+        <w:jc w:val="both" pt14:Unid="fd1c0e79041d4cd09d441b92e8a4108c"/>
       </w:pPr>
       <w:r>
         <w:t>Standstill: Standstill.</w:t>
       </w:r>
     </w:p>
-    <w:p pt14:Unid="c5764bdb13e04806a19e0c0b38bbcc28">
-      <w:pPr pt14:Unid="0a2a9ca4e29643cdaddc40f4f6a3bb50">
-        <w:pStyle w:val="ListBullet" pt14:Unid="75d740804caf42b59230a642542857bd"/>
-        <w:spacing w:after="120" w:line="288" w:lineRule="auto" pt14:Unid="91938f3c415f483b9738be1f0dabb701"/>
-        <w:jc w:val="both" pt14:Unid="35e9fe457dea43b7872f80f1d83f82ac"/>
+    <w:p pt14:Unid="9a1e8d2512114fa0af9db9e032786182">
+      <w:pPr pt14:Unid="ae2ba77e6dce47938d9cd0298f3d657a">
+        <w:pStyle w:val="ListBullet" pt14:Unid="f872e9bc2f674fccb77636086e977618"/>
+        <w:spacing w:after="120" w:line="288" w:lineRule="auto" pt14:Unid="0d76a8722a4d4c57b6ba1c4fbd19cfb8"/>
+        <w:jc w:val="both" pt14:Unid="5c4e9163fbef41f790f7a02b743bb350"/>
       </w:pPr>
       <w:r>
         <w:t>ROFO/ROFR: Right of First Offer/Right of First Refusal.</w:t>
       </w:r>
     </w:p>
-    <w:p pt14:Unid="32da816f98ff4cd79baa876835ac3645">
-      <w:pPr pt14:Unid="2fddae757c1c402d9c8d9f4f64a02a9e">
-        <w:pStyle w:val="ListBullet" pt14:Unid="eb8a19481b9945caafbc42a17eae5f4f"/>
-        <w:spacing w:after="120" w:line="288" w:lineRule="auto" pt14:Unid="afb5a8ac97b44686806eb31dd70b4e25"/>
-        <w:jc w:val="both" pt14:Unid="2c58463c2798484c81b7f1c8be8e7193"/>
+    <w:p pt14:Unid="2552c4a8c6644607899c3ace1e2a11d3">
+      <w:pPr pt14:Unid="9d33f77ed8a44020acd1b347a476d8f4">
+        <w:pStyle w:val="ListBullet" pt14:Unid="7123379525d848b391392b89b1be3b6c"/>
+        <w:spacing w:after="120" w:line="288" w:lineRule="auto" pt14:Unid="786e84ade55445b7b0adb6c6327af8d3"/>
+        <w:jc w:val="both" pt14:Unid="ee940be17e8642049cefe2a80bf772aa"/>
       </w:pPr>
       <w:r>
         <w:t>Tag-along/Drag-along: Tag-along/Drag-along.</w:t>
       </w:r>
     </w:p>
-    <w:p pt14:Unid="abd8bd88f32948d098d8c2f943f56249">
-      <w:pPr pt14:Unid="908f58e1d191484090c344dd9261b645">
-        <w:pStyle w:val="ListBullet" pt14:Unid="b3cce2cefca44dc5b5326c62c434f820"/>
-        <w:spacing w:after="120" w:line="288" w:lineRule="auto" pt14:Unid="8d0c4ae64f114cb4a0b741bc32376c6e"/>
-        <w:jc w:val="both" pt14:Unid="3f41647ffd5f44e2991f26936ce0313f"/>
+    <w:p pt14:Unid="6f27d1903309417093b05e626c14b2eb">
+      <w:pPr pt14:Unid="7771a8f507234de0916747795bbefe3c">
+        <w:pStyle w:val="ListBullet" pt14:Unid="1f63b49362484171b8644a06a9b4f53d"/>
+        <w:spacing w:after="120" w:line="288" w:lineRule="auto" pt14:Unid="fee3f696faa344a2a56b34fc3654c5df"/>
+        <w:jc w:val="both" pt14:Unid="d7aae6e74f9a43249b99f0b0273473ef"/>
       </w:pPr>
       <w:r>
         <w:t>Vesting: Vesting.</w:t>
       </w:r>
     </w:p>
-    <w:p pt14:Unid="6b18fb1f49de4d77af43549e0b209e4e">
-      <w:pPr pt14:Unid="2d5ddd6c004b4df9b6afc9fb06270a3d">
-        <w:pStyle w:val="ListBullet" pt14:Unid="ed791d3de6f647eeb3f99dd0c98f7f22"/>
-        <w:spacing w:after="120" w:line="288" w:lineRule="auto" pt14:Unid="4eecc12d7d8f4bfb959c5190a9ccd7e4"/>
-        <w:jc w:val="both" pt14:Unid="c0f17f9029a24621acf60f4b493fb0ae"/>
+    <w:p pt14:Unid="895c5d3973f64e80bb455a9e5bfcd748">
+      <w:pPr pt14:Unid="2e740b0c073c407cacaa7742cfb5c2f0">
+        <w:pStyle w:val="ListBullet" pt14:Unid="445a7b20b77e4be8871dedcd4721f019"/>
+        <w:spacing w:after="120" w:line="288" w:lineRule="auto" pt14:Unid="1f981a09c6914430a95875f395711ee6"/>
+        <w:jc w:val="both" pt14:Unid="04e0155f09ff46b6948be0146cd39095"/>
       </w:pPr>
       <w:r>
         <w:t>Matérias Reservadas: Reserved matters.</w:t>
       </w:r>
     </w:p>
-    <w:p pt14:Unid="8587ba72d00e441eb116afc65c0eb129">
-      <w:pPr pt14:Unid="4177dd7d914b4589a9f6483ea677af1b">
-        <w:pStyle w:val="ListBullet" pt14:Unid="99ac4e0b80ca4ae0a2b45c3f98576083"/>
-        <w:spacing w:after="120" w:line="288" w:lineRule="auto" pt14:Unid="aa7109a073ef42a290c0371b73e71923"/>
-        <w:jc w:val="both" pt14:Unid="851781d3a4b24f3eae3759192d6bb0f7"/>
+    <w:p pt14:Unid="06b6f338d3d247a4bcc4b2110115c392">
+      <w:pPr pt14:Unid="3aa0a0b1887f4998adcb53292fe6e763">
+        <w:pStyle w:val="ListBullet" pt14:Unid="b07adf13abea4c0886a23e5fe8fabefc"/>
+        <w:spacing w:after="120" w:line="288" w:lineRule="auto" pt14:Unid="31c0a469c1264031ba3798a73a8ad414"/>
+        <w:jc w:val="both" pt14:Unid="3bb9c0d8d2944396821b47faac7aa04c"/>
       </w:pPr>
       <w:r>
         <w:t>Conselho de Administração (se houver): Board of Directors.</w:t>
       </w:r>
     </w:p>
-    <w:p pt14:Unid="62de5a9bb26a4dddb197d1134cdc7120">
-      <w:pPr pt14:Unid="7c16271782d24bac8dfd02f9a2ead4cc">
-        <w:pStyle w:val="ListBullet" pt14:Unid="f976248304434030a3790d602b7a3c33"/>
-        <w:spacing w:after="120" w:line="288" w:lineRule="auto" pt14:Unid="5756f5ac15684086a2e1ea5e2a4b19c7"/>
-        <w:jc w:val="both" pt14:Unid="5e57abaae8d64a808d4674b4d6a3fa97"/>
+    <w:p pt14:Unid="7433c95357ef4375915b000b83e26e2c">
+      <w:pPr pt14:Unid="c1482397ffdc42b4a647091e97ad2959">
+        <w:pStyle w:val="ListBullet" pt14:Unid="4d3119e5f49f4912903337070c1c577c"/>
+        <w:spacing w:after="120" w:line="288" w:lineRule="auto" pt14:Unid="0f65ff92dbc0432b95e5ec0502e3cea8"/>
+        <w:jc w:val="both" pt14:Unid="375f83deb3bc4aa3895487f4b1b445f7"/>
       </w:pPr>
       <w:r>
         <w:t>Antidiluição: Anti-dilution.</w:t>
       </w:r>
     </w:p>
-    <w:p pt14:Unid="976c748f9a6c403a87213e4c85b6b7f3">
-      <w:pPr pt14:Unid="c53dca715f8e405099952842c3296cca">
-        <w:pStyle w:val="ListBullet" pt14:Unid="1dbf02b0879b43c58786b53d4e22f56b"/>
-        <w:spacing w:after="120" w:line="288" w:lineRule="auto" pt14:Unid="2a549cbf5e54482f8397c318e22e480f"/>
-        <w:jc w:val="both" pt14:Unid="d000b7cf349547a4b3c7ee706fc38b96"/>
+    <w:p pt14:Unid="a884edf87bc44528a2c42b0610b5dd46">
+      <w:pPr pt14:Unid="e3c5c4d0aa3c41edb02b600cdc303e18">
+        <w:pStyle w:val="ListBullet" pt14:Unid="15cc31b665544378af97702b6849b691"/>
+        <w:spacing w:after="120" w:line="288" w:lineRule="auto" pt14:Unid="9974e90412214935bb89d856f272a27a"/>
+        <w:jc w:val="both" pt14:Unid="08e54b77e8954996a72e1c985598ea6e"/>
       </w:pPr>
       <w:r>
         <w:t>Due diligence: Due diligence.</w:t>
       </w:r>
     </w:p>
-    <w:p pt14:Unid="ec2257bed1b14ccd967d70b7f9fe76b8">
-      <w:pPr pt14:Unid="8e7c7d50c67f45e58bb01236c92ccb26">
-        <w:pStyle w:val="ListBullet" pt14:Unid="cb8d511fcb5a42749da1583b86a1cdfd"/>
-        <w:spacing w:after="120" w:line="288" w:lineRule="auto" pt14:Unid="21aef06f3be44757b9423c13f45a24a1"/>
-        <w:jc w:val="both" pt14:Unid="56e75ece2af542ecaac40034347b0269"/>
+    <w:p pt14:Unid="880f228fb1214788adda02473739ab55">
+      <w:pPr pt14:Unid="245f8d8a2d2e4b9a96f2cbf254febdf1">
+        <w:pStyle w:val="ListBullet" pt14:Unid="67f5e7b88e1d4c6b9f423b3594e4e3d0"/>
+        <w:spacing w:after="120" w:line="288" w:lineRule="auto" pt14:Unid="6d0b51620b304073a24c32773638217c"/>
+        <w:jc w:val="both" pt14:Unid="9cb2450dc49e493a94fd452cfaf9083a"/>
       </w:pPr>
       <w:r>
         <w:t>Arbitragem: Arbitration.</w:t>
       </w:r>
     </w:p>
-    <w:p pt14:Unid="6fe2cdcd70084b568decbad5336fac40">
-      <w:pPr pt14:Unid="dbee85fa3e8f497e9936455b0d698fa8">
-        <w:pStyle w:val="ListBullet" pt14:Unid="a6b717b5a1df40d7b251d62ff80ac7ce"/>
-        <w:spacing w:after="120" w:line="288" w:lineRule="auto" pt14:Unid="5ec0245368a7420bbdf0eaedec5a7b09"/>
-        <w:jc w:val="both" pt14:Unid="4fcbb3bef75342c3842b5ce2abf73186"/>
+    <w:p pt14:Unid="eb72de7f27b24264b99400553555f39e">
+      <w:pPr pt14:Unid="6218a7a1f374484eb9254a059cd0b431">
+        <w:pStyle w:val="ListBullet" pt14:Unid="156807f350b8449797caec813b22875b"/>
+        <w:spacing w:after="120" w:line="288" w:lineRule="auto" pt14:Unid="7778e720378e46678b32e9e62aa887fb"/>
+        <w:jc w:val="both" pt14:Unid="bc0d884b9ef745c7b1fc27e0eef8d5ce"/>
       </w:pPr>
       <w:r>
         <w:t>Termo de posse: Acceptance/Investiture term.</w:t>
       </w:r>
     </w:p>
-    <w:p pt14:Unid="d3a3fb4b947d4c9c9b646d258d631c7e">
-      <w:pPr pt14:Unid="210deefdd0374c2baf9e6495595ffad0">
-        <w:pStyle w:val="ListBullet" pt14:Unid="f579f8dc4eda4d538098bde4a21d0447"/>
-        <w:spacing w:after="120" w:line="288" w:lineRule="auto" pt14:Unid="fd940a588dcb457da1b7721924b5a9bb"/>
-        <w:jc w:val="both" pt14:Unid="b5762a6e03ac4fc98575a74f92c4f26a"/>
+    <w:p pt14:Unid="d35d0f21c4db44759d3ca2c6c8da25e4">
+      <w:pPr pt14:Unid="07deefeaa6f940ed8b00186267274af0">
+        <w:pStyle w:val="ListBullet" pt14:Unid="55f34d8559874a03b5cebf58ed46fa35"/>
+        <w:spacing w:after="120" w:line="288" w:lineRule="auto" pt14:Unid="750be0d679014db9b023c7e6b9b38923"/>
+        <w:jc w:val="both" pt14:Unid="403334c20ddc4bd59eafd7d2bc7f4747"/>
       </w:pPr>
       <w:r>
         <w:t>Acordo de Quotistas: Shareholders’ agreement (quotaholders’).</w:t>
       </w:r>
     </w:p>
-    <w:p pt14:Unid="eaebfe4d0e2f4cd5aab33efdd9f7bfcd">
-      <w:pPr pt14:Unid="1dbb4aabfc144aba850e1b33f61e9406">
-        <w:spacing w:after="120" w:line="288" w:lineRule="auto" pt14:Unid="89d22f3316444ac682d283690ab2f2ad"/>
-        <w:jc w:val="both" pt14:Unid="41777b98ee20478888e3a283c0df9b65"/>
+    <w:p pt14:Unid="45abf7f407db48a5a61daf92d1a948b5">
+      <w:pPr pt14:Unid="992010d268e54d908689ce556c5a0977">
+        <w:spacing w:after="120" w:line="288" w:lineRule="auto" pt14:Unid="6acef374132d4662b71554992c77ef1e"/>
+        <w:jc w:val="both" pt14:Unid="fb18561249c74f5c8ebb6ef7e6f71e88"/>
       </w:pPr>
       <w:r>
         <w:t>ENTREGÁVEIS E INSTRUÇÕES FINAIS AO CLIENTE (ARTHUR SOUZA RODRIGUES)</w:t>
       </w:r>
     </w:p>
-    <w:p pt14:Unid="01f4ae939d4d4ddab03228b5fe3fbbaa">
-      <w:pPr pt14:Unid="9fe34ecb4b8747babe48202378b8e419">
-        <w:pStyle w:val="ListBullet" pt14:Unid="8c9f0630cf354d7faf19906846fec4b9"/>
-        <w:spacing w:after="120" w:line="288" w:lineRule="auto" pt14:Unid="7dbce99639244fa38725dc8aaa2bdbb5"/>
-        <w:jc w:val="both" pt14:Unid="193dbeeb6d7a4e88b11024c2ef863e9d"/>
+    <w:p pt14:Unid="2b8172ffca9e4c13b4dfdbb596e5973f">
+      <w:pPr pt14:Unid="d3b7193bcb334a9e97af105e9b1870c9">
+        <w:pStyle w:val="ListBullet" pt14:Unid="5a87f612272f4216b7839234a54b6cbd"/>
+        <w:spacing w:after="120" w:line="288" w:lineRule="auto" pt14:Unid="09ef5f515e2445f683dfa2e437ca7e30"/>
+        <w:jc w:val="both" pt14:Unid="76b4fbd641974e5cb8ff608dd2ef78eb"/>
       </w:pPr>
       <w:r>
         <w:t>Arquivos: Entregaremos (i) .docx editável (versão marcada e clean) e (ii) .pdf clean.</w:t>
       </w:r>
     </w:p>
-    <w:p pt14:Unid="8aeff937b70f4300ac58dd963deeb2d6">
-      <w:pPr pt14:Unid="84e10b3f5bbd4aa9a93e6f5782296bac">
-        <w:pStyle w:val="ListBullet" pt14:Unid="dbd6ca563d124c2aad36da023f351689"/>
-        <w:spacing w:after="120" w:line="288" w:lineRule="auto" pt14:Unid="9995ff44aa08468ba492cdaa61ed2cb7"/>
-        <w:jc w:val="both" pt14:Unid="713079b4828240c28962cd9c7203879f"/>
+    <w:p pt14:Unid="d91b23e9162142468e415e95e62797ce">
+      <w:pPr pt14:Unid="706ed4f58a70432fb172f3e1a37e51ce">
+        <w:pStyle w:val="ListBullet" pt14:Unid="12f622d5797841b79376ae15875a7da1"/>
+        <w:spacing w:after="120" w:line="288" w:lineRule="auto" pt14:Unid="9e5f1563e7be4b43a2d713161be89f41"/>
+        <w:jc w:val="both" pt14:Unid="3354254f380545dd81fe34530e9266ea"/>
       </w:pPr>
       <w:r>
         <w:t>Incluídos: (iii) Term Sheet (Anexo A) para coleta de variáveis; (iv) Notas de redação acima; (v) Glossário PT–EN opcional.</w:t>
       </w:r>
     </w:p>
-    <w:p pt14:Unid="c09f761f655e4081bb8320d6b2bf35f2">
-      <w:pPr pt14:Unid="e4969fdd0fcb483e8626ffd477c50c51">
-        <w:pStyle w:val="ListBullet" pt14:Unid="8d5831d5d46f465ab4b7303744eb2404"/>
-        <w:spacing w:after="120" w:line="288" w:lineRule="auto" pt14:Unid="f0537ab5873c4882b97bcaab11754ade"/>
-        <w:jc w:val="both" pt14:Unid="b5760aab2f3742c59742f7bfec20f48d"/>
+    <w:p pt14:Unid="53cf016002544a7f950a794e1a72bfd2">
+      <w:pPr pt14:Unid="c719151a3df146ae8a587482423dfec2">
+        <w:pStyle w:val="ListBullet" pt14:Unid="9fcd2afce972476193824f9ea9e58e32"/>
+        <w:spacing w:after="120" w:line="288" w:lineRule="auto" pt14:Unid="85f5cef335c14c898dd8bc8c735b79dc"/>
+        <w:jc w:val="both" pt14:Unid="2a47c2c188f4402f92cb9796196f0b1e"/>
       </w:pPr>
       <w:r>
         <w:t>Prazo: Primeira versão em até 60 minutos a contar da aprovação destas diretrizes.</w:t>
       </w:r>
     </w:p>
-    <w:p pt14:Unid="555967a759d8472c9e4a0d28ab471538">
-      <w:pPr pt14:Unid="92e49a35d42f4fea9b01f81600e48056">
-        <w:pStyle w:val="ListBullet" pt14:Unid="cdd84d55d292444cab5e2ce9f88b432f"/>
-        <w:spacing w:after="120" w:line="288" w:lineRule="auto" pt14:Unid="a743847d068f4a1988284ccd0530598a"/>
-        <w:jc w:val="both" pt14:Unid="396e4bd36e5c447093d19b34038bc4f7"/>
+    <w:p pt14:Unid="d9ed1be55b2c4b89a055cdae390eea5e">
+      <w:pPr pt14:Unid="d714589ea66248feb7a86861852fd508">
+        <w:pStyle w:val="ListBullet" pt14:Unid="65f73c1de1104826bcc458b90f447505"/>
+        <w:spacing w:after="120" w:line="288" w:lineRule="auto" pt14:Unid="9546da1eee9a4285b39b8a38666f1704"/>
+        <w:jc w:val="both" pt14:Unid="0f78d82cebf544c5912ff59a65e380d7"/>
       </w:pPr>
       <w:r>
         <w:t>Próximos passos: Preencher o Term Sheet; alinhar com assessoria contábil/tributária; validar exigências da Junta local (IN DREI 81/2020 e normativos); preparar submissão via Redesim; coletar assinaturas eletrônicas.</w:t>
       </w:r>
     </w:p>
-    <w:p pt14:Unid="42ec12c6fd9f45eba5c17216684da2be">
-      <w:pPr pt14:Unid="ca4d1c9220904a4e9d5f4232f0a349ea">
-        <w:spacing w:after="120" w:line="288" w:lineRule="auto" pt14:Unid="004e3195ab694bba97db6968f1068a2f"/>
-        <w:jc w:val="both" pt14:Unid="a46728bb17b9423ab556924c16a866f2"/>
+    <w:p pt14:Unid="38d2523e8ab9477f95b719c8a6b0a916">
+      <w:pPr pt14:Unid="58be4aa924444ec0a39946b159e00aee">
+        <w:spacing w:after="120" w:line="288" w:lineRule="auto" pt14:Unid="0ea300548fd34d50bb4a3669d98e7bfa"/>
+        <w:jc w:val="both" pt14:Unid="b38e4e6144b7436a93bda08b80e5a57b"/>
       </w:pPr>
       <w:r>
         <w:t>Observações: Este template foi estruturado conforme o Código Civil (arts. 997, 1.007, 1.008, 1.011, 1.052 e parágrafo único, 1.053, 1.057, 1.061, 1.076, 1.085), IN DREI 81/2020 e boas práticas de governança, com módulos avançados de proteção a investidores e minoritários. Para cláusulas sensíveis (quóruns, arbitragem, não concorrência, exclusão de sócio, reuniões digitais, LGPD e compliance), recomenda-se conferência das normativas e jurisprudência vigentes no momento do arquivamento.</w:t>
       </w:r>
     </w:p>
-    <w:p pt14:Unid="47e6634e861a4c409e828305b1200a44">
-      <w:pPr pt14:Unid="0d498751510e47a181f15a62de4665c2">
-        <w:spacing w:after="120" w:line="288" w:lineRule="auto" pt14:Unid="69c9c8b704d644acba0399be464eacc4"/>
-        <w:jc w:val="both" pt14:Unid="edc3da7bf76c4ca78f30559c15aed809"/>
+    <w:p pt14:Unid="de8448517b1348869d08e5ed8099e79b">
+      <w:pPr pt14:Unid="7b3bdeaa8b8946d5af6bfec16c3814be">
+        <w:spacing w:after="120" w:line="288" w:lineRule="auto" pt14:Unid="90f02a00ecc4418b9a5b39ef8b97cbc8"/>
+        <w:jc w:val="both" pt14:Unid="71a8e1c076e140949a3197f5714ca4a8"/>
       </w:pPr>
       <w:r>
         <w:t>Sources:</w:t>
       </w:r>
     </w:p>
-    <w:p pt14:Unid="fb34c50baee849d8a39f242b0cc54202">
-      <w:pPr pt14:Unid="77c350d75ce3434fbf60e7fe0a348496">
-        <w:spacing w:after="120" w:line="288" w:lineRule="auto" pt14:Unid="1e6d5554a8dd4e0f8d2422ffccc28306"/>
-        <w:jc w:val="both" pt14:Unid="2605398f8e17468c9caaae5f9d252c49"/>
+    <w:p pt14:Unid="6dcb7512227a4468a4e220fc6cbdd835">
+      <w:pPr pt14:Unid="0494b8d3346e4265a706afd563769b3c">
+        <w:spacing w:after="120" w:line="288" w:lineRule="auto" pt14:Unid="94ac941048614538bcefa9cde9a2e2fe"/>
+        <w:jc w:val="both" pt14:Unid="8ba3fd61ed16410a89a84dd29b920721"/>
       </w:pPr>
       <w:r>
         <w:t>[1] As 13 disposições necessárias num contrato social - https://www.jusbrasil.com.br/artigos/as-13-disposicoes-necessarias-num-contrato-social/430316131 [2] Enciclopédia Jurídica da PUCSP - https://enciclopediajuridica.pucsp.br/verbete/247/edicao-1/contrato-social [3] Responsabilidade Limitada - https://modeloinicial.com.br/materia/direito-empresarial-societario-contrato-social-responsabilidade-limitada [4] https://www.gov.br/empresas-e-negocios/pt-br/drei/legislacao/arquivos/legislacoes-federais/IN812020alteradapelaIN112e88de2022.pdf - https://www.gov.br/empresas-e-negocios/pt-br/drei/legislacao/arquivos/legislacoes-federais/IN812020alteradapelaIN112e88de2022.pdf [5] Instrução Normativa DREI Nº 1 DE 24/01/2024 - Federal - https://www.legisweb.com.br/legislacao/?id=455198 [6] Atualizada 13-11-2023.xlsx - https://jucis.df.gov.br/wp-conteudo/uploads/2025/08/Atualizada-13-11-2023.xlsx-1.pdf [7] Elias, Matias Advogados - https://www.eliasmatias.com/publicacao/em-informa-stj-valida-distribuicao-de-lucros-com-base-nos-dias-efetivamente-trabalhados/1047 [8] STJ valida liberdade contratual para distribuição de lucros de sócios com base em dias trabalhados. - https://boletim.prolikadvogados.com.br/2025/06/12/stj-valida-liberdade-contratual-para-distribuicao-de-lucros-de-socios-com-base-em-dias-trabalhados/ [9] [Resumo] Informativo de Jurisprudência do STJ - Edição 842 - https://www.jusbrasil.com.br/artigos/resumo-informativo-de-jurisprudencia-do-stj-edicao-842/3230724397 [10] Microsoft Word - Documento1 - https://lavioletera.com.br/uploads/Termo_Geral__LGPD_Compliance_Confidencialidade_e_Anticorrupo.pdf?srsltid=AfmBOooC4xzBIqrXGRT6vL7ddUPUHEsqhwzzXYsgPQJfGuNqc2IVBVKz [11] Compliance empresarial: estratégias legais para prevenção de riscos - https://jusdocs.com/blog/compliance-empresarial-estrategias-legais-para-prevencao-de-riscos [12] Cláusulas-padrão da ANPD: o que muda a partir de 23 de agosto de 2025 - https://cmalaw.com/conteudos/clausulas-padrao-da-anpd-o-que-muda-a-partir-de-23-de-agosto-de-2025/ [13] A função da cláusula Tag Along | Bernardo Fernandes Advocacia - https://bernardofernandes.adv.br/a-funcao-da-clausula-tag-along [14] Cláusulas de Lock-Up e Drag Along em Acordos De Sócios: Tendências E Jurisprudência – Junqueira de Carvalho e Murgel - https://jcm.adv.br/artigo/clausulas-de-lock-up-e-drag-along-em-acordos-de-socios-tendencias-e-jurisprudencia/ [15] LEGITIMIDADE DA SOCIEDADE NA EXECUÇÃO ESPECÍFICA DE ACORDO DE QUOTISTAS. - https://eliansanchez.adv.br/legitimidade-da-sociedade-na-execucao-especifica-de-acordo-de-quotistas/ [16] JUCESC - Junta Comercial do Estado de Santa Catarina - Assinatura com segurança em dobro - https://www.jucesc.sc.gov.br/index.php/institucional/noticias/695-assinatura-com-seguranca-em-dobro-drei-determinou [17] Verificação em duas etapas será obrigatória ao assinar documentos com conta gov.br no Simplifica-ES - https://jucees.es.gov.br/Not%C3%ADcia/verificacao-em-duas-etapas-sera-obrigatoria-ao-assinar-documentos-com-conta-gov-br-no-simplifica-es [18] Junta Comercial do Paraná on Instagram: "Assinaturas com GOV.BR terão verificação em duas etapas obrigatória! A partir de 04/08/2025 Regra válida em todo o Brasil, conforme o DREI (Ofício Circular SEI nº 183/2025)</w:t>
       </w:r>
     </w:p>
-    <w:p pt14:Unid="aacbed1ef8d042f881ed626289a01bfe">
-      <w:pPr pt14:Unid="efb5904e96f94415a6be88e80fe07a30">
-        <w:spacing w:after="120" w:line="288" w:lineRule="auto" pt14:Unid="a121ac7154fc458b92c4f73621f45396"/>
-        <w:jc w:val="both" pt14:Unid="70de47a8df8849908828ca561c0cfcaa"/>
+    <w:p pt14:Unid="703fa296e7074f52a4731e85b774318b">
+      <w:pPr pt14:Unid="0d09cf106d71402d9205d49ce507daac">
+        <w:spacing w:after="120" w:line="288" w:lineRule="auto" pt14:Unid="50752f85e6044867addfabfea600bedd"/>
+        <w:jc w:val="both" pt14:Unid="151df71ba2364112990ce9cad5a09c98"/>
       </w:pPr>
       <w:r>
         <w:t>📌 O que muda? Quem for assinar documentos com conta gov.br no sistema da Jucepar precisará ter a verificação em duas etapas ativada.</w:t>
       </w:r>
     </w:p>
-    <w:p pt14:Unid="66611584a46a478490e3e5e8ca9181e1">
-      <w:pPr pt14:Unid="c7588a39348c44b9882f3410a2b56d36">
-        <w:spacing w:after="120" w:line="288" w:lineRule="auto" pt14:Unid="0b4d203ecd4649e9bb0f86f8dba66b27"/>
-        <w:jc w:val="both" pt14:Unid="0b9955b0e64d42b58e3b1f904092ab93"/>
+    <w:p pt14:Unid="72bfe8b9756e4e019097a9ae0af0a177">
+      <w:pPr pt14:Unid="167c54a2016843158ac4dedd53b03dd6">
+        <w:spacing w:after="120" w:line="288" w:lineRule="auto" pt14:Unid="355adab325a14d8fbfcbb97926204793"/>
+        <w:jc w:val="both" pt14:Unid="c095bd337df14225ab773f4e04906a23"/>
       </w:pPr>
       <w:r>
         <w:t>Sem ela, a assinatura será bloqueada até que o recurso seja ativado no app gov.br.</w:t>
       </w:r>
     </w:p>
-    <w:p pt14:Unid="62d1da542baf40bba6fa2d856b762f19">
-      <w:pPr pt14:Unid="4a7491b4f92d4e4e8ea214150824bd6d">
-        <w:spacing w:after="120" w:line="288" w:lineRule="auto" pt14:Unid="d9ba009c357b455d81855392a20c2350"/>
-        <w:jc w:val="both" pt14:Unid="aad695e0282f4a8094210f531b2693ba"/>
+    <w:p pt14:Unid="f90fa1a1827d49038c529180f767956f">
+      <w:pPr pt14:Unid="e9dc4f86463e4274900c18e7e7f5eeef">
+        <w:spacing w:after="120" w:line="288" w:lineRule="auto" pt14:Unid="1d1c9b894b9a45aa90041f65921ffad6"/>
+        <w:jc w:val="both" pt14:Unid="201effc0c48a4e87bb18746c24a59e0a"/>
       </w:pPr>
       <w:r>
         <w:t>Como ativar a verificação em duas etapas?</w:t>
       </w:r>
     </w:p>
-    <w:p pt14:Unid="d72e2fbe0d0d418c9ec196240cd02f99">
-      <w:pPr pt14:Unid="dae8bd04259548a4af9486281274db96">
-        <w:pStyle w:val="ListNumber" pt14:Unid="a719507332284a69ac0ac44aa8c8c3c7"/>
-        <w:numPr pt14:Unid="8cfcb5d130f540e48d0cc7375da08502">
-          <w:ilvl w:val="0" pt14:Unid="ba6e2fed68ad4ddebfc6d86b87ed87e9"/>
-          <w:numId w:val="10" pt14:Unid="0d67d41c49ab4581aab3f68dc69d8161"/>
+    <w:p pt14:Unid="20fae6b2e9824f45a7dd580ed6797682">
+      <w:pPr pt14:Unid="5898d516483f4e0ca710af9476524708">
+        <w:pStyle w:val="ListNumber" pt14:Unid="5259fbcc6c83440aadeaedc23f9222af"/>
+        <w:numPr pt14:Unid="009f48d505da43629b12a31affa6be79">
+          <w:ilvl w:val="0" pt14:Unid="a2a04fa9912d4c2fbefc37de8ceb66e1"/>
+          <w:numId w:val="10" pt14:Unid="01cecb4308af46e2b7358535ed69b220"/>
         </w:numPr>
-        <w:spacing w:after="120" w:line="288" w:lineRule="auto" pt14:Unid="97a7469119cb4941913ba346bb29702e"/>
-        <w:jc w:val="both" pt14:Unid="8ba3359c80b040e18b933e3dd1d098c5"/>
+        <w:spacing w:after="120" w:line="288" w:lineRule="auto" pt14:Unid="bd69f63932e3411681ca4b92264aaa3f"/>
+        <w:jc w:val="both" pt14:Unid="5b7d16d13d414481b191fa97e5bd37d0"/>
       </w:pPr>
       <w:r>
         <w:t>Acesse o aplicativo gov.br no celular.</w:t>
       </w:r>
     </w:p>
-    <w:p pt14:Unid="839c479777804c3ead8a665a710ec429">
-      <w:pPr pt14:Unid="ecb246f33d4544939e28c69fd8519464">
-        <w:pStyle w:val="ListNumber" pt14:Unid="21f863b3ebe84616940371d4ff33fbd1"/>
-        <w:numPr pt14:Unid="1743b20e7ec845c5950445d41f783592">
-          <w:ilvl w:val="0" pt14:Unid="228bf1ed96044601a1840cea20a53963"/>
-          <w:numId w:val="10" pt14:Unid="c668322eff944707937afc16ce61894d"/>
+    <w:p pt14:Unid="1cfb270df1d34505b22a1daea0f186d6">
+      <w:pPr pt14:Unid="ff46b6bbae1e4a298b8ec71d1c0d9355">
+        <w:pStyle w:val="ListNumber" pt14:Unid="5b4aebf0016a4165b9a2d4bcb3d872a7"/>
+        <w:numPr pt14:Unid="da849d3e3a5b48eba328524cb07563cd">
+          <w:ilvl w:val="0" pt14:Unid="41c4e63738d346c6b3b4eba890d4a207"/>
+          <w:numId w:val="10" pt14:Unid="beb0d891cb4744c5bd39ca2c2b9b422e"/>
         </w:numPr>
-        <w:spacing w:after="120" w:line="288" w:lineRule="auto" pt14:Unid="66b95552fa4743bfadde53c0de901e71"/>
-        <w:jc w:val="both" pt14:Unid="c0fd5efa7c094935af629c6fe641e453"/>
+        <w:spacing w:after="120" w:line="288" w:lineRule="auto" pt14:Unid="2d8bd2dd7e7345c4944f2c831940d355"/>
+        <w:jc w:val="both" pt14:Unid="213c2e99883a4349b6f294bd636d2aa9"/>
       </w:pPr>
       <w:r>
         <w:t>Vá em “Segurança da conta” &gt; “Verificação em duas etapas”.</w:t>
       </w:r>
     </w:p>
-    <w:p pt14:Unid="62855ec90bae4fa3a663c76b08417a00">
-      <w:pPr pt14:Unid="5031bce5881f41c69ce08a2c8a74dafb">
-        <w:pStyle w:val="ListNumber" pt14:Unid="58b19db07e3a432d90c618a74fb3f3c8"/>
-        <w:numPr pt14:Unid="41a919b3a83241999008a943b0961e28">
-          <w:ilvl w:val="0" pt14:Unid="c4c2cce7c3b14d51b2b58a7a724c812a"/>
-          <w:numId w:val="10" pt14:Unid="97450796d6df4c14ac4188a0f4009a9c"/>
+    <w:p pt14:Unid="08d4788fe7634bae8454dc991282a4c0">
+      <w:pPr pt14:Unid="8e8f601435894d21a8eebacfa10e693a">
+        <w:pStyle w:val="ListNumber" pt14:Unid="ad524a98ffe14dd68ca40fcdc04fb532"/>
+        <w:numPr pt14:Unid="0495ebae757a4824bbd11fcb5c98e3d5">
+          <w:ilvl w:val="0" pt14:Unid="0bed95f19917407ca2ef7c8cc11bc687"/>
+          <w:numId w:val="10" pt14:Unid="3221783ded0c4a9a86e090a0dc920626"/>
         </w:numPr>
-        <w:spacing w:after="120" w:line="288" w:lineRule="auto" pt14:Unid="0855908d55454e67910c1a8fcc672582"/>
-        <w:jc w:val="both" pt14:Unid="5f24fe5219f64d318bab5d9d48abef1a"/>
+        <w:spacing w:after="120" w:line="288" w:lineRule="auto" pt14:Unid="943f6a40612d49ed8098246ced17e583"/>
+        <w:jc w:val="both" pt14:Unid="d9dd2cfb56744a4885a35db627971a7f"/>
       </w:pPr>
       <w:r>
         <w:t>Toque em “Ativar” e siga as instruções.</w:t>
       </w:r>
     </w:p>
-    <w:p pt14:Unid="ec2578782b2b41a08cf0c41e1fc716c3">
-      <w:pPr pt14:Unid="8488a46838df4478b2ad780a6941cb98">
-        <w:spacing w:after="120" w:line="288" w:lineRule="auto" pt14:Unid="ce77fd75281c413eb4816211da15475c"/>
-        <w:jc w:val="both" pt14:Unid="983227abd68f4bf2898b4642de7bd02d"/>
+    <w:p pt14:Unid="64b2e31ff0394cf6817931af96184444">
+      <w:pPr pt14:Unid="f8e6f2d6f5034d7ca0360cd7c282cfd6">
+        <w:spacing w:after="120" w:line="288" w:lineRule="auto" pt14:Unid="6093aefa3e4e45bf9ccb0317292c0cbd"/>
+        <w:jc w:val="both" pt14:Unid="0c5c4aee0cba47a9ad7ce0ec4978e460"/>
       </w:pPr>
       <w:r>
         <w:t>Permanecem inalteradas as seguintes obrigatoriedades: ✔️ Conta gov.br nível Prata ou Ouro ✔️ Ao assinar, permanecerá sendo necessário inserir um código gerado no aplicativo ou recebido por SMS.</w:t>
       </w:r>
     </w:p>
-    <w:p pt14:Unid="56289ccdabb749e5b2c42a78eec3a2d5">
-      <w:pPr pt14:Unid="633f0ac1aea04c859c4abc58dc69c911">
-        <w:spacing w:after="120" w:line="288" w:lineRule="auto" pt14:Unid="4998514bfd0c413da8903d68228fd05c"/>
-        <w:jc w:val="both" pt14:Unid="031a5584fdb74a298fa05b5fd73a26d5"/>
+    <w:p pt14:Unid="2124beea923c45c089750ea295bea2a4">
+      <w:pPr pt14:Unid="c61915c2df6f44f9b1f2f85c38acb044">
+        <w:spacing w:after="120" w:line="288" w:lineRule="auto" pt14:Unid="5749dd670ea54f5c9d93198b8550aac1"/>
+        <w:jc w:val="both" pt14:Unid="8d712e5f4ab842b3bfef51d987a8f5d1"/>
       </w:pPr>
       <w:r>
         <w:t>Essa exigência vale apenas para assinaturas com gov.br, outras formas de assinatura no sistema não mudam.</w:t>
       </w:r>
     </w:p>
-    <w:p pt14:Unid="c8c49b91db9c42e589978cb4af865934">
-      <w:pPr pt14:Unid="029353bc9a7a4db0a36e4a872814408e">
-        <w:spacing w:after="120" w:line="288" w:lineRule="auto" pt14:Unid="2ea8ce5b763d4b58b6ead2d63e5725a4"/>
-        <w:jc w:val="both" pt14:Unid="9753f9103ed9481c8ecf38951b2991c3"/>
+    <w:p pt14:Unid="3cfecb368f384f9586ebe54eb79666ca">
+      <w:pPr pt14:Unid="c9af0d257be04ce2976a9efe20f6dc30">
+        <w:spacing w:after="120" w:line="288" w:lineRule="auto" pt14:Unid="7ae8fd1453d24c02bad79376912575a8"/>
+        <w:jc w:val="both" pt14:Unid="160568d8f6db49a199f0919a6e43a778"/>
       </w:pPr>
       <w:r>
         <w:t>📣 Contadores: orientem seus clientes para evitar atrasos!" - https://www.instagram.com/reel/DMvcnL9Nnh-/ [19] STJ – Judiciário não pode apreciar validade de cláusula compromissória antes da sentença arbitral « CBAr – Comitê Brasileiro de Arbitragem - https://cbar.org.br/site/en/stj-judiciario-nao-pode-apreciar-validade-de-clausula-compromissoria-antes-da-sentenca-arbitral/ [20] https://fcaradv.com.br/en/news-and-articles/stj-reconhece-a-validade-de-clausula-compromissoria-em-discussao-contratual-entre-empresas-em-recuperacao-judicial - https://fcaradv.com.br/en/news-and-articles/stj-reconhece-a-validade-de-clausula-compromissoria-em-discussao-contratual-entre-empresas-em-recuperacao-judicial [21] Just a moment... - https://www.stj.jus.br/sites/portalp/Paginas/Comunicacao/Noticias/2025/14082025-Inclusao-de-clausula-arbitral-em-estatuto-de-associacao-civil-nao-se-submete-as-exigencias-do-contrato-de-adesao.aspx [22] Como estruturar o quadro societário da sua empresa - https://societariodigital.com.br/estruturar-quadro-societario/ [23] Alterações Societárias: O Que Muda em 2025 e Como Registrar (RN e SC) - https://hentzadvocacia.adv.br/blog/alteracoes-societarias-rn-sc/ [24] L14451 - https://www.planalto.gov.br/ccivil_03/_ato2019-2022/2022/lei/l14451.htm [25] Cessão de Quotas Sociais na Sociedade Limitada - https://mmaadvocacia.com.br/cessao-de-quotas/ [26] Just a moment... - https://www.coad.com.br/files/trib/html/pesquisa/lc/em19113.htm? [27] What is the Difference between a ROFO and ROFR? - Rez Legal - https://rezlegal.com/2018/08/what-is-the-difference-between-a-rofo-and-rofr/ [28] Direito de Preferência dos Sócios na Aquisição de Quotas - Jurisprudência | Jusbrasil - https://www.jusbrasil.com.br/jurisprudencia/busca?q=direito+de+preferência+dos+sócios+na+aquisição+de+quotas [29] Cessão de quotas empresariais e contrato social - https://www.galvaoesilva.com/blog/direito-empresarial/cessao-de-quotas-empresariais/ [30] Cessão de Quotas em Sociedades Limitadas: Requisitos e Responsabilidades da cessão de quotas a terceiros, no âmbito do Código Civil | BBMOV – Sociedade de Advogados - https://www.bbmov.adv.br/2023/10/31/cessao-de-quotas-em-sociedades-limitadas-requisitos-e-responsabilidades-da-cessao-de-quotas-a-terceiros-no-ambito-do-codigo-civil/ [31] VK | Welcome! - https://vk.com/video-229983937_456239034 [32] Pre-Emptive Rights Explained: Types, Variants, and How to Structure Them in Your Shareholders’ Agreement - https://www.equitylist.co/blog-post/pre-emptive-rights [33] Cessão de Quotas em Sociedades Limitadas: Quais São os Requisitos e Como Funciona o Direito de Preferência? - https://www.jusbrasil.com.br/artigos/cessao-de-quotas-em-sociedades-limitadas-quais-sao-os-requisitos-e-como-funciona-o-direito-de-preferencia/2811015922 [34] Art. 1057 da Lei nº 10.406, de 10 de janeiro de 2002 - https://www.jusbrasil.com.br/topicos/10667614/artigo-1057-da-lei-n-10406-de-10-de-janeiro-de-2002 [35] Shareholders’ agreement: pre-emptive right to purchase shares and other shareholder protection mechanisms — REVERA - https://cyprus.revera.legal/ru/info-centr/news-and-analytical-materials/187-preimushhestvennoe-pravo-pokupki-akcij-i-drugie-mexanizmy-zashhity-akcionerov/ [36] Right of first refusal - https://en.wikipedia.org/wiki/Right_of_first_refusal [37] Exclusão de Sócio em Sociedade Limitada no Brasil: Entenda Seus Direitos e Alternativas - https://advogadosmgf.com.br/exclusao-de-socio-em-ltda/</w:t>
       </w:r>
     </w:p>
-    <w:sectPr pt14:Unid="b9aee3401b68433390557936cdc6e593">
-      <w:pgSz w:w="12240" w:h="15840" pt14:Unid="367009632cba4d39be40a65d42054e8a"/>
-      <w:pgMar w:top="1440" w:right="1800" w:bottom="1440" w:left="1800" w:header="720" w:footer="720" w:gutter="0" pt14:Unid="bc8161cfd4864739b064faf46bb61222"/>
-      <w:cols w:space="720" pt14:Unid="d7cc675969b042319b918cae3648c3e4"/>
+    <w:sectPr pt14:Unid="552c8d7ced1d4a70ad9bd1280f866ce9">
+      <w:pgSz w:w="12240" w:h="15840" pt14:Unid="73f839c0cd7b49c0b96d8cde37d3b885"/>
+      <w:pgMar w:top="1440" w:right="1800" w:bottom="1440" w:left="1800" w:header="720" w:footer="720" w:gutter="0" pt14:Unid="cbe2ebfbf3bc4a7a9994d54e8ef5185b"/>
+      <w:cols w:space="720" pt14:Unid="52060fe482c64ff09fa177bcce33b7ef"/>
     </w:sectPr>
   </w:body>
 </w:document>

</xml_diff>